<commit_message>
docs: he editado parte del informe desde esta rama por error, no volverá a ocurrir, habrá que solucionar esto posteriormente
</commit_message>
<xml_diff>
--- a/informe.docx
+++ b/informe.docx
@@ -4933,7 +4933,59 @@
         <w:rPr>
           <w:rFonts w:ascii="Daytona" w:hAnsi="Daytona"/>
         </w:rPr>
-        <w:t>Empezamos con el gestor de MYSQL y hay que crear la base de datos, poner el foco en ella y empezar a trabajar. Lo primero es la creación de las tablas, completando los campos de cada una de ellas. Allá vamos.</w:t>
+        <w:t>Empezamos con el gestor de MYSQL</w:t>
+      </w:r>
+      <w:r>
+        <w:rPr>
+          <w:rFonts w:ascii="Daytona" w:hAnsi="Daytona"/>
+        </w:rPr>
+        <w:t xml:space="preserve">. </w:t>
+      </w:r>
+      <w:r>
+        <w:rPr>
+          <w:rFonts w:ascii="Daytona" w:hAnsi="Daytona"/>
+          <w:b/>
+          <w:bCs/>
+        </w:rPr>
+        <w:t>Lo más importante</w:t>
+      </w:r>
+      <w:r>
+        <w:rPr>
+          <w:rFonts w:ascii="Daytona" w:hAnsi="Daytona"/>
+        </w:rPr>
+        <w:t xml:space="preserve"> hacer un </w:t>
+      </w:r>
+      <w:r>
+        <w:rPr>
+          <w:rFonts w:ascii="Daytona" w:hAnsi="Daytona"/>
+          <w:i/>
+          <w:iCs/>
+        </w:rPr>
+        <w:t>git checkout feature/base-de-datos</w:t>
+      </w:r>
+      <w:r>
+        <w:rPr>
+          <w:rFonts w:ascii="Daytona" w:hAnsi="Daytona"/>
+        </w:rPr>
+        <w:t xml:space="preserve"> . Ahora estoy situada en la rama correspondiente al trabajo que voy a hacer.</w:t>
+      </w:r>
+      <w:r>
+        <w:rPr>
+          <w:rFonts w:ascii="Daytona" w:hAnsi="Daytona"/>
+        </w:rPr>
+        <w:t xml:space="preserve"> </w:t>
+      </w:r>
+      <w:r>
+        <w:rPr>
+          <w:rFonts w:ascii="Daytona" w:hAnsi="Daytona"/>
+        </w:rPr>
+        <w:t>Para comenzar hay que</w:t>
+      </w:r>
+      <w:r>
+        <w:rPr>
+          <w:rFonts w:ascii="Daytona" w:hAnsi="Daytona"/>
+        </w:rPr>
+        <w:t xml:space="preserve"> crear la base de datos, poner el foco en ella y empezar a trabajar. Lo primero es la creación de las tablas, completando los campos de cada una de ellas. Allá vamos.</w:t>
       </w:r>
     </w:p>
     <w:p>
@@ -5013,28 +5065,134 @@
         <w:rPr>
           <w:rFonts w:ascii="Daytona" w:hAnsi="Daytona"/>
         </w:rPr>
-        <w:t>tica por si corres el script varias veces que no se cree la base de datos tantas veces como lo ejecutes. Luego</w:t>
-      </w:r>
-      <w:r>
-        <w:rPr>
-          <w:rFonts w:ascii="Daytona" w:hAnsi="Daytona"/>
-        </w:rPr>
-        <w:t xml:space="preserve"> la codificación, las reglas empleadas y por el último. Ponermos el foco en este datebase.</w:t>
-      </w:r>
-    </w:p>
-    <w:p>
-      <w:pPr>
-        <w:jc w:val="both"/>
-        <w:rPr>
-          <w:rFonts w:ascii="Daytona" w:hAnsi="Daytona"/>
-          <w:u w:val="single"/>
-        </w:rPr>
-      </w:pPr>
-      <w:r>
-        <w:rPr>
-          <w:rFonts w:ascii="Daytona" w:hAnsi="Daytona"/>
-          <w:u w:val="single"/>
-        </w:rPr>
+        <w:t>tica por si corres el script varias veces que no se cree la base de datos tantas veces como lo ejecutes</w:t>
+      </w:r>
+      <w:r>
+        <w:rPr>
+          <w:rFonts w:ascii="Daytona" w:hAnsi="Daytona"/>
+        </w:rPr>
+        <w:t>, aplica también a la creación de tablas</w:t>
+      </w:r>
+      <w:r>
+        <w:rPr>
+          <w:rFonts w:ascii="Daytona" w:hAnsi="Daytona"/>
+        </w:rPr>
+        <w:t>. Luego</w:t>
+      </w:r>
+      <w:r>
+        <w:rPr>
+          <w:rFonts w:ascii="Daytona" w:hAnsi="Daytona"/>
+        </w:rPr>
+        <w:t xml:space="preserve"> la codificación</w:t>
+      </w:r>
+      <w:r>
+        <w:rPr>
+          <w:rFonts w:ascii="Daytona" w:hAnsi="Daytona"/>
+        </w:rPr>
+        <w:t xml:space="preserve"> (character set) </w:t>
+      </w:r>
+      <w:r>
+        <w:rPr>
+          <w:rFonts w:ascii="Daytona" w:hAnsi="Daytona"/>
+        </w:rPr>
+        <w:t>, las reglas empleadas</w:t>
+      </w:r>
+      <w:r>
+        <w:rPr>
+          <w:rFonts w:ascii="Daytona" w:hAnsi="Daytona"/>
+        </w:rPr>
+        <w:t xml:space="preserve"> (collate)</w:t>
+      </w:r>
+      <w:r>
+        <w:rPr>
+          <w:rFonts w:ascii="Daytona" w:hAnsi="Daytona"/>
+        </w:rPr>
+        <w:t xml:space="preserve"> y por el último</w:t>
+      </w:r>
+      <w:r>
+        <w:rPr>
+          <w:rFonts w:ascii="Daytona" w:hAnsi="Daytona"/>
+        </w:rPr>
+        <w:t xml:space="preserve"> p</w:t>
+      </w:r>
+      <w:r>
+        <w:rPr>
+          <w:rFonts w:ascii="Daytona" w:hAnsi="Daytona"/>
+        </w:rPr>
+        <w:t>one</w:t>
+      </w:r>
+      <w:r>
+        <w:rPr>
+          <w:rFonts w:ascii="Daytona" w:hAnsi="Daytona"/>
+        </w:rPr>
+        <w:t>m</w:t>
+      </w:r>
+      <w:r>
+        <w:rPr>
+          <w:rFonts w:ascii="Daytona" w:hAnsi="Daytona"/>
+        </w:rPr>
+        <w:t>os el foco en este datebase</w:t>
+      </w:r>
+      <w:r>
+        <w:rPr>
+          <w:rFonts w:ascii="Daytona" w:hAnsi="Daytona"/>
+        </w:rPr>
+        <w:t xml:space="preserve"> (use). El nombre que le he puesto a la base de datps es </w:t>
+      </w:r>
+      <w:r>
+        <w:rPr>
+          <w:rFonts w:ascii="Daytona" w:hAnsi="Daytona"/>
+          <w:b/>
+          <w:bCs/>
+        </w:rPr>
+        <w:t>happinessco</w:t>
+      </w:r>
+      <w:r>
+        <w:rPr>
+          <w:rFonts w:ascii="Daytona" w:hAnsi="Daytona"/>
+          <w:b/>
+          <w:bCs/>
+        </w:rPr>
+        <w:t xml:space="preserve">. </w:t>
+      </w:r>
+      <w:r>
+        <w:rPr>
+          <w:rFonts w:ascii="Daytona" w:hAnsi="Daytona"/>
+        </w:rPr>
+        <w:t>En SQL las sentencia terminan con ;</w:t>
+      </w:r>
+    </w:p>
+    <w:p>
+      <w:pPr>
+        <w:ind w:left="0"/>
+        <w:jc w:val="both"/>
+        <w:rPr>
+          <w:rFonts w:ascii="Daytona" w:hAnsi="Daytona"/>
+        </w:rPr>
+      </w:pPr>
+    </w:p>
+    <w:p>
+      <w:pPr>
+        <w:jc w:val="both"/>
+        <w:rPr>
+          <w:rFonts w:ascii="Daytona" w:hAnsi="Daytona"/>
+        </w:rPr>
+      </w:pPr>
+    </w:p>
+    <w:p>
+      <w:pPr>
+        <w:jc w:val="both"/>
+        <w:rPr>
+          <w:rFonts w:ascii="Daytona" w:hAnsi="Daytona"/>
+          <w:u w:val="single"/>
+        </w:rPr>
+      </w:pPr>
+      <w:r>
+        <w:rPr>
+          <w:rFonts w:ascii="Daytona" w:hAnsi="Daytona"/>
+          <w:u w:val="single"/>
+        </w:rPr>
+        <w:lastRenderedPageBreak/>
         <w:t>CREACIÓN DE TABLAS</w:t>
       </w:r>
     </w:p>
@@ -5049,7 +5207,6 @@
         <w:rPr>
           <w:rFonts w:ascii="Daytona" w:hAnsi="Daytona"/>
         </w:rPr>
-        <w:lastRenderedPageBreak/>
         <w:drawing>
           <wp:inline distT="0" distB="0" distL="0" distR="0" wp14:anchorId="1D9D0F94" wp14:editId="3D445DCA">
             <wp:extent cx="5400040" cy="3644900"/>
@@ -5224,14 +5381,14 @@
         <w:rPr>
           <w:rFonts w:ascii="Daytona" w:hAnsi="Daytona"/>
         </w:rPr>
-        <w:t xml:space="preserve">creados llevan “ON DELETE CASCADE” al final, esto implica que si posteriormente eliminamos alguno, no quedarán rastros </w:t>
+        <w:t xml:space="preserve">creados llevan “ON DELETE CASCADE” </w:t>
       </w:r>
       <w:r>
         <w:rPr>
           <w:rFonts w:ascii="Daytona" w:hAnsi="Daytona"/>
         </w:rPr>
         <w:lastRenderedPageBreak/>
-        <w:t>ni elementos derivados de su creación, sino que lo eliminará con bien dice en cascada.</w:t>
+        <w:t>al final, esto implica que si posteriormente eliminamos alguno, no quedarán rastros ni elementos derivados de su creación, sino que lo eliminará con bien dice en cascada.</w:t>
       </w:r>
     </w:p>
     <w:p>
@@ -6581,22 +6738,1284 @@
     </w:p>
     <w:p>
       <w:pPr>
-        <w:mirrorIndents/>
-        <w:rPr>
-          <w:rFonts w:ascii="Daytona" w:hAnsi="Daytona"/>
-        </w:rPr>
-      </w:pPr>
-    </w:p>
-    <w:p>
-      <w:pPr>
-        <w:mirrorIndents/>
-        <w:rPr>
-          <w:rFonts w:ascii="Daytona" w:hAnsi="Daytona"/>
+        <w:ind w:left="0"/>
+        <w:rPr>
+          <w:rFonts w:ascii="Daytona" w:hAnsi="Daytona"/>
+          <w:u w:val="single"/>
+        </w:rPr>
+      </w:pPr>
+      <w:r>
+        <w:rPr>
+          <w:rFonts w:ascii="Daytona" w:hAnsi="Daytona"/>
+          <w:u w:val="single"/>
+        </w:rPr>
+        <w:t>VISTA 4</w:t>
+      </w:r>
+    </w:p>
+    <w:p>
+      <w:pPr>
+        <w:ind w:left="0"/>
+        <w:rPr>
+          <w:rFonts w:ascii="Daytona" w:hAnsi="Daytona"/>
+          <w:u w:val="single"/>
+        </w:rPr>
+      </w:pPr>
+      <w:r>
+        <w:rPr>
+          <w:rFonts w:ascii="Daytona" w:hAnsi="Daytona"/>
+          <w:u w:val="single"/>
+        </w:rPr>
+        <w:drawing>
+          <wp:inline distT="0" distB="0" distL="0" distR="0" wp14:anchorId="2CBF3FBD" wp14:editId="4C100A4D">
+            <wp:extent cx="5887384" cy="1044000"/>
+            <wp:effectExtent l="0" t="0" r="0" b="3810"/>
+            <wp:docPr id="50" name="Imagen 50"/>
+            <wp:cNvGraphicFramePr>
+              <a:graphicFrameLocks xmlns:a="http://schemas.openxmlformats.org/drawingml/2006/main" noChangeAspect="1"/>
+            </wp:cNvGraphicFramePr>
+            <a:graphic xmlns:a="http://schemas.openxmlformats.org/drawingml/2006/main">
+              <a:graphicData uri="http://schemas.openxmlformats.org/drawingml/2006/picture">
+                <pic:pic xmlns:pic="http://schemas.openxmlformats.org/drawingml/2006/picture">
+                  <pic:nvPicPr>
+                    <pic:cNvPr id="1" name=""/>
+                    <pic:cNvPicPr/>
+                  </pic:nvPicPr>
+                  <pic:blipFill>
+                    <a:blip r:embed="rId44"/>
+                    <a:stretch>
+                      <a:fillRect/>
+                    </a:stretch>
+                  </pic:blipFill>
+                  <pic:spPr>
+                    <a:xfrm>
+                      <a:off x="0" y="0"/>
+                      <a:ext cx="5887384" cy="1044000"/>
+                    </a:xfrm>
+                    <a:prstGeom prst="rect">
+                      <a:avLst/>
+                    </a:prstGeom>
+                  </pic:spPr>
+                </pic:pic>
+              </a:graphicData>
+            </a:graphic>
+          </wp:inline>
+        </w:drawing>
+      </w:r>
+    </w:p>
+    <w:p>
+      <w:pPr>
+        <w:ind w:left="0"/>
+        <w:rPr>
+          <w:rFonts w:ascii="Daytona" w:hAnsi="Daytona"/>
+        </w:rPr>
+      </w:pPr>
+      <w:r>
+        <w:rPr>
+          <w:rFonts w:ascii="Daytona" w:hAnsi="Daytona"/>
+        </w:rPr>
+        <w:lastRenderedPageBreak/>
+        <w:t>Esta vista tiene que devolver los eventos favoritos del usuario 2 que es Delio cuya fecha sea posterior al 20-02-2026. Creamos la vista, asignamos nombre, en el SELECT debe aparecer la tabla de eventos completa y nuevamente las tablas que necesitaremos para las 2 condiciones son la de favoritos para indicar el id_usuario y la de eventos para indicar el intervalo de la fecha. En el WHERE escribimos estas dos premisas  y la integridad referencial. Y e</w:t>
+      </w:r>
+    </w:p>
+    <w:p>
+      <w:pPr>
+        <w:ind w:left="0"/>
+        <w:rPr>
+          <w:rFonts w:ascii="Daytona" w:hAnsi="Daytona"/>
+          <w:u w:val="single"/>
+        </w:rPr>
+      </w:pPr>
+      <w:r>
+        <w:rPr>
+          <w:rFonts w:ascii="Daytona" w:hAnsi="Daytona"/>
+          <w:u w:val="single"/>
+        </w:rPr>
+        <w:t>OUTPUT</w:t>
+      </w:r>
+      <w:r>
+        <w:rPr>
+          <w:rFonts w:ascii="Daytona" w:hAnsi="Daytona"/>
+          <w:u w:val="single"/>
+        </w:rPr>
+        <w:t xml:space="preserve">: </w:t>
+      </w:r>
+      <w:r>
+        <w:rPr>
+          <w:rFonts w:ascii="Daytona" w:hAnsi="Daytona"/>
+          <w:noProof/>
+        </w:rPr>
+        <w:drawing>
+          <wp:inline distT="0" distB="0" distL="0" distR="0" wp14:anchorId="3C0F3A67" wp14:editId="2F40472D">
+            <wp:extent cx="180000" cy="180000"/>
+            <wp:effectExtent l="0" t="0" r="0" b="0"/>
+            <wp:docPr id="51" name="Imagen 51" descr="Icono&#10;&#10;El contenido generado por IA puede ser incorrecto."/>
+            <wp:cNvGraphicFramePr>
+              <a:graphicFrameLocks xmlns:a="http://schemas.openxmlformats.org/drawingml/2006/main" noChangeAspect="1"/>
+            </wp:cNvGraphicFramePr>
+            <a:graphic xmlns:a="http://schemas.openxmlformats.org/drawingml/2006/main">
+              <a:graphicData uri="http://schemas.openxmlformats.org/drawingml/2006/picture">
+                <pic:pic xmlns:pic="http://schemas.openxmlformats.org/drawingml/2006/picture">
+                  <pic:nvPicPr>
+                    <pic:cNvPr id="47" name="Imagen 47" descr="Icono&#10;&#10;El contenido generado por IA puede ser incorrecto."/>
+                    <pic:cNvPicPr/>
+                  </pic:nvPicPr>
+                  <pic:blipFill>
+                    <a:blip r:embed="rId38" cstate="print">
+                      <a:extLst>
+                        <a:ext uri="{28A0092B-C50C-407E-A947-70E740481C1C}">
+                          <a14:useLocalDpi xmlns:a14="http://schemas.microsoft.com/office/drawing/2010/main" val="0"/>
+                        </a:ext>
+                      </a:extLst>
+                    </a:blip>
+                    <a:stretch>
+                      <a:fillRect/>
+                    </a:stretch>
+                  </pic:blipFill>
+                  <pic:spPr>
+                    <a:xfrm>
+                      <a:off x="0" y="0"/>
+                      <a:ext cx="180000" cy="180000"/>
+                    </a:xfrm>
+                    <a:prstGeom prst="rect">
+                      <a:avLst/>
+                    </a:prstGeom>
+                  </pic:spPr>
+                </pic:pic>
+              </a:graphicData>
+            </a:graphic>
+          </wp:inline>
+        </w:drawing>
+      </w:r>
+    </w:p>
+    <w:p>
+      <w:pPr>
+        <w:ind w:left="0"/>
+        <w:rPr>
+          <w:rFonts w:ascii="Daytona" w:hAnsi="Daytona"/>
+          <w:u w:val="single"/>
+        </w:rPr>
+      </w:pPr>
+      <w:r>
+        <w:rPr>
+          <w:rFonts w:ascii="Daytona" w:hAnsi="Daytona"/>
+          <w:u w:val="single"/>
+        </w:rPr>
+        <w:drawing>
+          <wp:inline distT="0" distB="0" distL="0" distR="0" wp14:anchorId="30C27507" wp14:editId="2D7BE652">
+            <wp:extent cx="5400040" cy="909320"/>
+            <wp:effectExtent l="0" t="0" r="0" b="5080"/>
+            <wp:docPr id="52" name="Imagen 52"/>
+            <wp:cNvGraphicFramePr>
+              <a:graphicFrameLocks xmlns:a="http://schemas.openxmlformats.org/drawingml/2006/main" noChangeAspect="1"/>
+            </wp:cNvGraphicFramePr>
+            <a:graphic xmlns:a="http://schemas.openxmlformats.org/drawingml/2006/main">
+              <a:graphicData uri="http://schemas.openxmlformats.org/drawingml/2006/picture">
+                <pic:pic xmlns:pic="http://schemas.openxmlformats.org/drawingml/2006/picture">
+                  <pic:nvPicPr>
+                    <pic:cNvPr id="1" name=""/>
+                    <pic:cNvPicPr/>
+                  </pic:nvPicPr>
+                  <pic:blipFill>
+                    <a:blip r:embed="rId45"/>
+                    <a:stretch>
+                      <a:fillRect/>
+                    </a:stretch>
+                  </pic:blipFill>
+                  <pic:spPr>
+                    <a:xfrm>
+                      <a:off x="0" y="0"/>
+                      <a:ext cx="5400040" cy="909320"/>
+                    </a:xfrm>
+                    <a:prstGeom prst="rect">
+                      <a:avLst/>
+                    </a:prstGeom>
+                  </pic:spPr>
+                </pic:pic>
+              </a:graphicData>
+            </a:graphic>
+          </wp:inline>
+        </w:drawing>
+      </w:r>
+    </w:p>
+    <w:p>
+      <w:pPr>
+        <w:mirrorIndents/>
+        <w:rPr>
+          <w:rFonts w:ascii="Daytona" w:hAnsi="Daytona"/>
+        </w:rPr>
+      </w:pPr>
+      <w:r>
+        <w:rPr>
+          <w:rFonts w:ascii="Daytona" w:hAnsi="Daytona"/>
+        </w:rPr>
+        <w:t xml:space="preserve">Y con esto, estaría el script. Todo el archivo </w:t>
+      </w:r>
+      <w:r>
+        <w:rPr>
+          <w:rFonts w:ascii="Daytona" w:hAnsi="Daytona"/>
+        </w:rPr>
+        <w:t>SQL</w:t>
+      </w:r>
+      <w:r>
+        <w:rPr>
+          <w:rFonts w:ascii="Daytona" w:hAnsi="Daytona"/>
+        </w:rPr>
+        <w:t xml:space="preserve"> está comentado para facilitar su comprensión. </w:t>
+      </w:r>
+      <w:r>
+        <w:rPr>
+          <w:rFonts w:ascii="Daytona" w:hAnsi="Daytona"/>
+        </w:rPr>
+        <w:t>La estructura de la carpeta base de datos queda</w:t>
+      </w:r>
+    </w:p>
+    <w:p>
+      <w:pPr>
+        <w:mirrorIndents/>
+        <w:rPr>
+          <w:rFonts w:ascii="Daytona" w:hAnsi="Daytona"/>
+        </w:rPr>
+      </w:pPr>
+      <w:r>
+        <w:rPr>
+          <w:rFonts w:ascii="Daytona" w:hAnsi="Daytona"/>
+        </w:rPr>
+        <w:t>base-de-datos</w:t>
+      </w:r>
+    </w:p>
+    <w:p>
+      <w:pPr>
+        <w:ind w:left="368" w:firstLine="1048"/>
+        <w:mirrorIndents/>
+        <w:rPr>
+          <w:rFonts w:ascii="Daytona" w:hAnsi="Daytona" w:cs="Arial"/>
+        </w:rPr>
+      </w:pPr>
+      <w:r>
+        <w:rPr>
+          <w:rFonts w:ascii="Arial" w:hAnsi="Arial" w:cs="Arial"/>
+        </w:rPr>
+        <w:t>├──</w:t>
+      </w:r>
+      <w:r>
+        <w:rPr>
+          <w:rFonts w:ascii="Daytona" w:hAnsi="Daytona" w:cs="Arial"/>
+        </w:rPr>
+        <w:t>happinessco.sql</w:t>
+      </w:r>
+    </w:p>
+    <w:p>
+      <w:pPr>
+        <w:ind w:left="0"/>
+        <w:mirrorIndents/>
+        <w:rPr>
+          <w:rFonts w:ascii="Daytona" w:hAnsi="Daytona" w:cs="Arial"/>
+        </w:rPr>
+      </w:pPr>
+      <w:r>
+        <w:rPr>
+          <w:rFonts w:ascii="Daytona" w:hAnsi="Daytona" w:cs="Arial"/>
+        </w:rPr>
+        <w:t>Paso todos los cambios a staging, hago committ y git push</w:t>
+      </w:r>
+    </w:p>
+    <w:p>
+      <w:pPr>
+        <w:ind w:left="0"/>
+        <w:mirrorIndents/>
+        <w:rPr>
+          <w:rFonts w:ascii="Daytona" w:hAnsi="Daytona" w:cs="Arial"/>
+        </w:rPr>
+      </w:pPr>
+      <w:r>
+        <w:rPr>
+          <w:rFonts w:ascii="Daytona" w:hAnsi="Daytona" w:cs="Arial"/>
+        </w:rPr>
+        <w:t>Resumen de commits</w:t>
+      </w:r>
+    </w:p>
+    <w:p>
+      <w:pPr>
+        <w:ind w:left="0"/>
+        <w:mirrorIndents/>
+        <w:rPr>
+          <w:rFonts w:ascii="Arial" w:hAnsi="Arial" w:cs="Arial"/>
+        </w:rPr>
+      </w:pPr>
+      <w:r>
+        <w:rPr>
+          <w:rFonts w:ascii="Arial" w:hAnsi="Arial" w:cs="Arial"/>
+        </w:rPr>
+        <w:drawing>
+          <wp:inline distT="0" distB="0" distL="0" distR="0" wp14:anchorId="339095CE" wp14:editId="40B9F4F0">
+            <wp:extent cx="5400040" cy="4239260"/>
+            <wp:effectExtent l="0" t="0" r="0" b="8890"/>
+            <wp:docPr id="53" name="Imagen 53"/>
+            <wp:cNvGraphicFramePr>
+              <a:graphicFrameLocks xmlns:a="http://schemas.openxmlformats.org/drawingml/2006/main" noChangeAspect="1"/>
+            </wp:cNvGraphicFramePr>
+            <a:graphic xmlns:a="http://schemas.openxmlformats.org/drawingml/2006/main">
+              <a:graphicData uri="http://schemas.openxmlformats.org/drawingml/2006/picture">
+                <pic:pic xmlns:pic="http://schemas.openxmlformats.org/drawingml/2006/picture">
+                  <pic:nvPicPr>
+                    <pic:cNvPr id="1" name=""/>
+                    <pic:cNvPicPr/>
+                  </pic:nvPicPr>
+                  <pic:blipFill>
+                    <a:blip r:embed="rId46"/>
+                    <a:stretch>
+                      <a:fillRect/>
+                    </a:stretch>
+                  </pic:blipFill>
+                  <pic:spPr>
+                    <a:xfrm>
+                      <a:off x="0" y="0"/>
+                      <a:ext cx="5400040" cy="4239260"/>
+                    </a:xfrm>
+                    <a:prstGeom prst="rect">
+                      <a:avLst/>
+                    </a:prstGeom>
+                  </pic:spPr>
+                </pic:pic>
+              </a:graphicData>
+            </a:graphic>
+          </wp:inline>
+        </w:drawing>
+      </w:r>
+    </w:p>
+    <w:p>
+      <w:pPr>
+        <w:ind w:left="0"/>
+        <w:mirrorIndents/>
+        <w:rPr>
+          <w:rFonts w:ascii="Daytona" w:hAnsi="Daytona"/>
+        </w:rPr>
+      </w:pPr>
+      <w:r>
+        <w:rPr>
+          <w:rFonts w:ascii="Daytona" w:hAnsi="Daytona"/>
+        </w:rPr>
+        <w:lastRenderedPageBreak/>
+        <w:t>Con respecto al diagrama, MYSQL autogenera un diagrama asociado a la base de datos para ello hay que seguir estos pasos</w:t>
+      </w:r>
+    </w:p>
+    <w:p>
+      <w:pPr>
+        <w:ind w:left="0"/>
+        <w:mirrorIndents/>
+        <w:rPr>
+          <w:rFonts w:ascii="Daytona" w:hAnsi="Daytona"/>
+        </w:rPr>
+      </w:pPr>
+      <w:r>
+        <w:rPr>
+          <w:rFonts w:ascii="Daytona" w:hAnsi="Daytona"/>
+        </w:rPr>
+        <w:drawing>
+          <wp:inline distT="0" distB="0" distL="0" distR="0" wp14:anchorId="6E9FFE73" wp14:editId="1B77B1C5">
+            <wp:extent cx="2730000" cy="1872000"/>
+            <wp:effectExtent l="0" t="0" r="0" b="0"/>
+            <wp:docPr id="54" name="Imagen 54"/>
+            <wp:cNvGraphicFramePr>
+              <a:graphicFrameLocks xmlns:a="http://schemas.openxmlformats.org/drawingml/2006/main" noChangeAspect="1"/>
+            </wp:cNvGraphicFramePr>
+            <a:graphic xmlns:a="http://schemas.openxmlformats.org/drawingml/2006/main">
+              <a:graphicData uri="http://schemas.openxmlformats.org/drawingml/2006/picture">
+                <pic:pic xmlns:pic="http://schemas.openxmlformats.org/drawingml/2006/picture">
+                  <pic:nvPicPr>
+                    <pic:cNvPr id="1" name=""/>
+                    <pic:cNvPicPr/>
+                  </pic:nvPicPr>
+                  <pic:blipFill>
+                    <a:blip r:embed="rId47"/>
+                    <a:stretch>
+                      <a:fillRect/>
+                    </a:stretch>
+                  </pic:blipFill>
+                  <pic:spPr>
+                    <a:xfrm>
+                      <a:off x="0" y="0"/>
+                      <a:ext cx="2730000" cy="1872000"/>
+                    </a:xfrm>
+                    <a:prstGeom prst="rect">
+                      <a:avLst/>
+                    </a:prstGeom>
+                  </pic:spPr>
+                </pic:pic>
+              </a:graphicData>
+            </a:graphic>
+          </wp:inline>
+        </w:drawing>
+      </w:r>
+    </w:p>
+    <w:p>
+      <w:pPr>
+        <w:ind w:left="0"/>
+        <w:mirrorIndents/>
+        <w:rPr>
+          <w:rFonts w:ascii="Daytona" w:hAnsi="Daytona"/>
+        </w:rPr>
+      </w:pPr>
+      <w:r>
+        <w:rPr>
+          <w:rFonts w:ascii="Daytona" w:hAnsi="Daytona"/>
+          <w:noProof/>
+        </w:rPr>
+        <mc:AlternateContent>
+          <mc:Choice Requires="wps">
+            <w:drawing>
+              <wp:anchor distT="0" distB="0" distL="114300" distR="114300" simplePos="0" relativeHeight="251659264" behindDoc="0" locked="0" layoutInCell="1" allowOverlap="1" wp14:anchorId="02C476A9" wp14:editId="6CCF7C98">
+                <wp:simplePos x="0" y="0"/>
+                <wp:positionH relativeFrom="column">
+                  <wp:posOffset>3088005</wp:posOffset>
+                </wp:positionH>
+                <wp:positionV relativeFrom="paragraph">
+                  <wp:posOffset>2675890</wp:posOffset>
+                </wp:positionV>
+                <wp:extent cx="236220" cy="198120"/>
+                <wp:effectExtent l="0" t="0" r="68580" b="49530"/>
+                <wp:wrapNone/>
+                <wp:docPr id="56" name="Conector recto de flecha 56"/>
+                <wp:cNvGraphicFramePr/>
+                <a:graphic xmlns:a="http://schemas.openxmlformats.org/drawingml/2006/main">
+                  <a:graphicData uri="http://schemas.microsoft.com/office/word/2010/wordprocessingShape">
+                    <wps:wsp>
+                      <wps:cNvCnPr/>
+                      <wps:spPr>
+                        <a:xfrm>
+                          <a:off x="0" y="0"/>
+                          <a:ext cx="236220" cy="198120"/>
+                        </a:xfrm>
+                        <a:prstGeom prst="straightConnector1">
+                          <a:avLst/>
+                        </a:prstGeom>
+                        <a:ln>
+                          <a:tailEnd type="triangle"/>
+                        </a:ln>
+                      </wps:spPr>
+                      <wps:style>
+                        <a:lnRef idx="1">
+                          <a:schemeClr val="accent1"/>
+                        </a:lnRef>
+                        <a:fillRef idx="0">
+                          <a:schemeClr val="accent1"/>
+                        </a:fillRef>
+                        <a:effectRef idx="0">
+                          <a:schemeClr val="accent1"/>
+                        </a:effectRef>
+                        <a:fontRef idx="minor">
+                          <a:schemeClr val="tx1"/>
+                        </a:fontRef>
+                      </wps:style>
+                      <wps:bodyPr/>
+                    </wps:wsp>
+                  </a:graphicData>
+                </a:graphic>
+              </wp:anchor>
+            </w:drawing>
+          </mc:Choice>
+          <mc:Fallback>
+            <w:pict>
+              <v:shapetype w14:anchorId="2D20CD64" id="_x0000_t32" coordsize="21600,21600" o:spt="32" o:oned="t" path="m,l21600,21600e" filled="f">
+                <v:path arrowok="t" fillok="f" o:connecttype="none"/>
+                <o:lock v:ext="edit" shapetype="t"/>
+              </v:shapetype>
+              <v:shape id="Conector recto de flecha 56" o:spid="_x0000_s1026" type="#_x0000_t32" style="position:absolute;margin-left:243.15pt;margin-top:210.7pt;width:18.6pt;height:15.6pt;z-index:251659264;visibility:visible;mso-wrap-style:square;mso-wrap-distance-left:9pt;mso-wrap-distance-top:0;mso-wrap-distance-right:9pt;mso-wrap-distance-bottom:0;mso-position-horizontal:absolute;mso-position-horizontal-relative:text;mso-position-vertical:absolute;mso-position-vertical-relative:text" o:gfxdata="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" strokecolor="#4472c4 [3204]" strokeweight=".5pt">
+                <v:stroke endarrow="block" joinstyle="miter"/>
+              </v:shape>
+            </w:pict>
+          </mc:Fallback>
+        </mc:AlternateContent>
+      </w:r>
+      <w:r>
+        <w:rPr>
+          <w:rFonts w:ascii="Daytona" w:hAnsi="Daytona"/>
+        </w:rPr>
+        <w:drawing>
+          <wp:inline distT="0" distB="0" distL="0" distR="0" wp14:anchorId="2788B01F" wp14:editId="6CC0E48B">
+            <wp:extent cx="3913698" cy="3060000"/>
+            <wp:effectExtent l="0" t="0" r="0" b="7620"/>
+            <wp:docPr id="55" name="Imagen 55"/>
+            <wp:cNvGraphicFramePr>
+              <a:graphicFrameLocks xmlns:a="http://schemas.openxmlformats.org/drawingml/2006/main" noChangeAspect="1"/>
+            </wp:cNvGraphicFramePr>
+            <a:graphic xmlns:a="http://schemas.openxmlformats.org/drawingml/2006/main">
+              <a:graphicData uri="http://schemas.openxmlformats.org/drawingml/2006/picture">
+                <pic:pic xmlns:pic="http://schemas.openxmlformats.org/drawingml/2006/picture">
+                  <pic:nvPicPr>
+                    <pic:cNvPr id="1" name=""/>
+                    <pic:cNvPicPr/>
+                  </pic:nvPicPr>
+                  <pic:blipFill>
+                    <a:blip r:embed="rId48"/>
+                    <a:stretch>
+                      <a:fillRect/>
+                    </a:stretch>
+                  </pic:blipFill>
+                  <pic:spPr>
+                    <a:xfrm>
+                      <a:off x="0" y="0"/>
+                      <a:ext cx="3913698" cy="3060000"/>
+                    </a:xfrm>
+                    <a:prstGeom prst="rect">
+                      <a:avLst/>
+                    </a:prstGeom>
+                  </pic:spPr>
+                </pic:pic>
+              </a:graphicData>
+            </a:graphic>
+          </wp:inline>
+        </w:drawing>
+      </w:r>
+    </w:p>
+    <w:p>
+      <w:pPr>
+        <w:ind w:left="0"/>
+        <w:mirrorIndents/>
+        <w:rPr>
+          <w:rFonts w:ascii="Daytona" w:hAnsi="Daytona"/>
+        </w:rPr>
+      </w:pPr>
+      <w:r>
+        <w:rPr>
+          <w:rFonts w:ascii="Daytona" w:hAnsi="Daytona"/>
+          <w:noProof/>
+        </w:rPr>
+        <mc:AlternateContent>
+          <mc:Choice Requires="wps">
+            <w:drawing>
+              <wp:anchor distT="0" distB="0" distL="114300" distR="114300" simplePos="0" relativeHeight="251660288" behindDoc="0" locked="0" layoutInCell="1" allowOverlap="1" wp14:anchorId="49120D40" wp14:editId="109D4D34">
+                <wp:simplePos x="0" y="0"/>
+                <wp:positionH relativeFrom="column">
+                  <wp:posOffset>3133725</wp:posOffset>
+                </wp:positionH>
+                <wp:positionV relativeFrom="paragraph">
+                  <wp:posOffset>2578100</wp:posOffset>
+                </wp:positionV>
+                <wp:extent cx="243840" cy="312420"/>
+                <wp:effectExtent l="0" t="0" r="80010" b="49530"/>
+                <wp:wrapNone/>
+                <wp:docPr id="58" name="Conector recto de flecha 58"/>
+                <wp:cNvGraphicFramePr/>
+                <a:graphic xmlns:a="http://schemas.openxmlformats.org/drawingml/2006/main">
+                  <a:graphicData uri="http://schemas.microsoft.com/office/word/2010/wordprocessingShape">
+                    <wps:wsp>
+                      <wps:cNvCnPr/>
+                      <wps:spPr>
+                        <a:xfrm>
+                          <a:off x="0" y="0"/>
+                          <a:ext cx="243840" cy="312420"/>
+                        </a:xfrm>
+                        <a:prstGeom prst="straightConnector1">
+                          <a:avLst/>
+                        </a:prstGeom>
+                        <a:ln>
+                          <a:tailEnd type="triangle"/>
+                        </a:ln>
+                      </wps:spPr>
+                      <wps:style>
+                        <a:lnRef idx="1">
+                          <a:schemeClr val="accent1"/>
+                        </a:lnRef>
+                        <a:fillRef idx="0">
+                          <a:schemeClr val="accent1"/>
+                        </a:fillRef>
+                        <a:effectRef idx="0">
+                          <a:schemeClr val="accent1"/>
+                        </a:effectRef>
+                        <a:fontRef idx="minor">
+                          <a:schemeClr val="tx1"/>
+                        </a:fontRef>
+                      </wps:style>
+                      <wps:bodyPr/>
+                    </wps:wsp>
+                  </a:graphicData>
+                </a:graphic>
+              </wp:anchor>
+            </w:drawing>
+          </mc:Choice>
+          <mc:Fallback>
+            <w:pict>
+              <v:shape w14:anchorId="1CBA545A" id="Conector recto de flecha 58" o:spid="_x0000_s1026" type="#_x0000_t32" style="position:absolute;margin-left:246.75pt;margin-top:203pt;width:19.2pt;height:24.6pt;z-index:251660288;visibility:visible;mso-wrap-style:square;mso-wrap-distance-left:9pt;mso-wrap-distance-top:0;mso-wrap-distance-right:9pt;mso-wrap-distance-bottom:0;mso-position-horizontal:absolute;mso-position-horizontal-relative:text;mso-position-vertical:absolute;mso-position-vertical-relative:text" o:gfxdata="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" strokecolor="#4472c4 [3204]" strokeweight=".5pt">
+                <v:stroke endarrow="block" joinstyle="miter"/>
+              </v:shape>
+            </w:pict>
+          </mc:Fallback>
+        </mc:AlternateContent>
+      </w:r>
+      <w:r>
+        <w:rPr>
+          <w:rFonts w:ascii="Daytona" w:hAnsi="Daytona"/>
+        </w:rPr>
+        <w:drawing>
+          <wp:inline distT="0" distB="0" distL="0" distR="0" wp14:anchorId="41E44E99" wp14:editId="3602EBC8">
+            <wp:extent cx="3911352" cy="3060000"/>
+            <wp:effectExtent l="0" t="0" r="0" b="7620"/>
+            <wp:docPr id="57" name="Imagen 57"/>
+            <wp:cNvGraphicFramePr>
+              <a:graphicFrameLocks xmlns:a="http://schemas.openxmlformats.org/drawingml/2006/main" noChangeAspect="1"/>
+            </wp:cNvGraphicFramePr>
+            <a:graphic xmlns:a="http://schemas.openxmlformats.org/drawingml/2006/main">
+              <a:graphicData uri="http://schemas.openxmlformats.org/drawingml/2006/picture">
+                <pic:pic xmlns:pic="http://schemas.openxmlformats.org/drawingml/2006/picture">
+                  <pic:nvPicPr>
+                    <pic:cNvPr id="1" name=""/>
+                    <pic:cNvPicPr/>
+                  </pic:nvPicPr>
+                  <pic:blipFill>
+                    <a:blip r:embed="rId49"/>
+                    <a:stretch>
+                      <a:fillRect/>
+                    </a:stretch>
+                  </pic:blipFill>
+                  <pic:spPr>
+                    <a:xfrm>
+                      <a:off x="0" y="0"/>
+                      <a:ext cx="3911352" cy="3060000"/>
+                    </a:xfrm>
+                    <a:prstGeom prst="rect">
+                      <a:avLst/>
+                    </a:prstGeom>
+                  </pic:spPr>
+                </pic:pic>
+              </a:graphicData>
+            </a:graphic>
+          </wp:inline>
+        </w:drawing>
+      </w:r>
+    </w:p>
+    <w:p>
+      <w:pPr>
+        <w:ind w:left="0"/>
+        <w:mirrorIndents/>
+        <w:rPr>
+          <w:rFonts w:ascii="Daytona" w:hAnsi="Daytona"/>
+        </w:rPr>
+      </w:pPr>
+      <w:r>
+        <w:rPr>
+          <w:rFonts w:ascii="Daytona" w:hAnsi="Daytona"/>
+          <w:noProof/>
+        </w:rPr>
+        <w:lastRenderedPageBreak/>
+        <mc:AlternateContent>
+          <mc:Choice Requires="wps">
+            <w:drawing>
+              <wp:anchor distT="0" distB="0" distL="114300" distR="114300" simplePos="0" relativeHeight="251661312" behindDoc="0" locked="0" layoutInCell="1" allowOverlap="1" wp14:anchorId="09B24D47" wp14:editId="1ADF5C6D">
+                <wp:simplePos x="0" y="0"/>
+                <wp:positionH relativeFrom="column">
+                  <wp:posOffset>2988945</wp:posOffset>
+                </wp:positionH>
+                <wp:positionV relativeFrom="paragraph">
+                  <wp:posOffset>2430145</wp:posOffset>
+                </wp:positionV>
+                <wp:extent cx="198120" cy="342900"/>
+                <wp:effectExtent l="0" t="0" r="49530" b="57150"/>
+                <wp:wrapNone/>
+                <wp:docPr id="60" name="Conector recto de flecha 60"/>
+                <wp:cNvGraphicFramePr/>
+                <a:graphic xmlns:a="http://schemas.openxmlformats.org/drawingml/2006/main">
+                  <a:graphicData uri="http://schemas.microsoft.com/office/word/2010/wordprocessingShape">
+                    <wps:wsp>
+                      <wps:cNvCnPr/>
+                      <wps:spPr>
+                        <a:xfrm>
+                          <a:off x="0" y="0"/>
+                          <a:ext cx="198120" cy="342900"/>
+                        </a:xfrm>
+                        <a:prstGeom prst="straightConnector1">
+                          <a:avLst/>
+                        </a:prstGeom>
+                        <a:ln>
+                          <a:tailEnd type="triangle"/>
+                        </a:ln>
+                      </wps:spPr>
+                      <wps:style>
+                        <a:lnRef idx="1">
+                          <a:schemeClr val="accent1"/>
+                        </a:lnRef>
+                        <a:fillRef idx="0">
+                          <a:schemeClr val="accent1"/>
+                        </a:fillRef>
+                        <a:effectRef idx="0">
+                          <a:schemeClr val="accent1"/>
+                        </a:effectRef>
+                        <a:fontRef idx="minor">
+                          <a:schemeClr val="tx1"/>
+                        </a:fontRef>
+                      </wps:style>
+                      <wps:bodyPr/>
+                    </wps:wsp>
+                  </a:graphicData>
+                </a:graphic>
+              </wp:anchor>
+            </w:drawing>
+          </mc:Choice>
+          <mc:Fallback>
+            <w:pict>
+              <v:shape w14:anchorId="3F4B201E" id="Conector recto de flecha 60" o:spid="_x0000_s1026" type="#_x0000_t32" style="position:absolute;margin-left:235.35pt;margin-top:191.35pt;width:15.6pt;height:27pt;z-index:251661312;visibility:visible;mso-wrap-style:square;mso-wrap-distance-left:9pt;mso-wrap-distance-top:0;mso-wrap-distance-right:9pt;mso-wrap-distance-bottom:0;mso-position-horizontal:absolute;mso-position-horizontal-relative:text;mso-position-vertical:absolute;mso-position-vertical-relative:text" o:gfxdata="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" strokecolor="#4472c4 [3204]" strokeweight=".5pt">
+                <v:stroke endarrow="block" joinstyle="miter"/>
+              </v:shape>
+            </w:pict>
+          </mc:Fallback>
+        </mc:AlternateContent>
+      </w:r>
+      <w:r>
+        <w:rPr>
+          <w:rFonts w:ascii="Daytona" w:hAnsi="Daytona"/>
+        </w:rPr>
+        <w:drawing>
+          <wp:inline distT="0" distB="0" distL="0" distR="0" wp14:anchorId="286A5BD5" wp14:editId="46F15718">
+            <wp:extent cx="3736271" cy="2916000"/>
+            <wp:effectExtent l="0" t="0" r="0" b="0"/>
+            <wp:docPr id="59" name="Imagen 59"/>
+            <wp:cNvGraphicFramePr>
+              <a:graphicFrameLocks xmlns:a="http://schemas.openxmlformats.org/drawingml/2006/main" noChangeAspect="1"/>
+            </wp:cNvGraphicFramePr>
+            <a:graphic xmlns:a="http://schemas.openxmlformats.org/drawingml/2006/main">
+              <a:graphicData uri="http://schemas.openxmlformats.org/drawingml/2006/picture">
+                <pic:pic xmlns:pic="http://schemas.openxmlformats.org/drawingml/2006/picture">
+                  <pic:nvPicPr>
+                    <pic:cNvPr id="1" name=""/>
+                    <pic:cNvPicPr/>
+                  </pic:nvPicPr>
+                  <pic:blipFill>
+                    <a:blip r:embed="rId50"/>
+                    <a:stretch>
+                      <a:fillRect/>
+                    </a:stretch>
+                  </pic:blipFill>
+                  <pic:spPr>
+                    <a:xfrm>
+                      <a:off x="0" y="0"/>
+                      <a:ext cx="3736271" cy="2916000"/>
+                    </a:xfrm>
+                    <a:prstGeom prst="rect">
+                      <a:avLst/>
+                    </a:prstGeom>
+                  </pic:spPr>
+                </pic:pic>
+              </a:graphicData>
+            </a:graphic>
+          </wp:inline>
+        </w:drawing>
+      </w:r>
+    </w:p>
+    <w:p>
+      <w:pPr>
+        <w:ind w:left="0"/>
+        <w:mirrorIndents/>
+        <w:rPr>
+          <w:rFonts w:ascii="Daytona" w:hAnsi="Daytona"/>
+        </w:rPr>
+      </w:pPr>
+      <w:r>
+        <w:rPr>
+          <w:rFonts w:ascii="Daytona" w:hAnsi="Daytona"/>
+          <w:noProof/>
+        </w:rPr>
+        <mc:AlternateContent>
+          <mc:Choice Requires="wps">
+            <w:drawing>
+              <wp:anchor distT="0" distB="0" distL="114300" distR="114300" simplePos="0" relativeHeight="251662336" behindDoc="0" locked="0" layoutInCell="1" allowOverlap="1" wp14:anchorId="7695DE69" wp14:editId="13EFB2A7">
+                <wp:simplePos x="0" y="0"/>
+                <wp:positionH relativeFrom="column">
+                  <wp:posOffset>2905125</wp:posOffset>
+                </wp:positionH>
+                <wp:positionV relativeFrom="paragraph">
+                  <wp:posOffset>2431415</wp:posOffset>
+                </wp:positionV>
+                <wp:extent cx="182880" cy="312420"/>
+                <wp:effectExtent l="0" t="0" r="64770" b="49530"/>
+                <wp:wrapNone/>
+                <wp:docPr id="62" name="Conector recto de flecha 62"/>
+                <wp:cNvGraphicFramePr/>
+                <a:graphic xmlns:a="http://schemas.openxmlformats.org/drawingml/2006/main">
+                  <a:graphicData uri="http://schemas.microsoft.com/office/word/2010/wordprocessingShape">
+                    <wps:wsp>
+                      <wps:cNvCnPr/>
+                      <wps:spPr>
+                        <a:xfrm>
+                          <a:off x="0" y="0"/>
+                          <a:ext cx="182880" cy="312420"/>
+                        </a:xfrm>
+                        <a:prstGeom prst="straightConnector1">
+                          <a:avLst/>
+                        </a:prstGeom>
+                        <a:ln>
+                          <a:tailEnd type="triangle"/>
+                        </a:ln>
+                      </wps:spPr>
+                      <wps:style>
+                        <a:lnRef idx="1">
+                          <a:schemeClr val="accent1"/>
+                        </a:lnRef>
+                        <a:fillRef idx="0">
+                          <a:schemeClr val="accent1"/>
+                        </a:fillRef>
+                        <a:effectRef idx="0">
+                          <a:schemeClr val="accent1"/>
+                        </a:effectRef>
+                        <a:fontRef idx="minor">
+                          <a:schemeClr val="tx1"/>
+                        </a:fontRef>
+                      </wps:style>
+                      <wps:bodyPr/>
+                    </wps:wsp>
+                  </a:graphicData>
+                </a:graphic>
+              </wp:anchor>
+            </w:drawing>
+          </mc:Choice>
+          <mc:Fallback>
+            <w:pict>
+              <v:shape w14:anchorId="048E0C13" id="Conector recto de flecha 62" o:spid="_x0000_s1026" type="#_x0000_t32" style="position:absolute;margin-left:228.75pt;margin-top:191.45pt;width:14.4pt;height:24.6pt;z-index:251662336;visibility:visible;mso-wrap-style:square;mso-wrap-distance-left:9pt;mso-wrap-distance-top:0;mso-wrap-distance-right:9pt;mso-wrap-distance-bottom:0;mso-position-horizontal:absolute;mso-position-horizontal-relative:text;mso-position-vertical:absolute;mso-position-vertical-relative:text" o:gfxdata="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" strokecolor="#4472c4 [3204]" strokeweight=".5pt">
+                <v:stroke endarrow="block" joinstyle="miter"/>
+              </v:shape>
+            </w:pict>
+          </mc:Fallback>
+        </mc:AlternateContent>
+      </w:r>
+      <w:r>
+        <w:rPr>
+          <w:rFonts w:ascii="Daytona" w:hAnsi="Daytona"/>
+        </w:rPr>
+        <w:drawing>
+          <wp:inline distT="0" distB="0" distL="0" distR="0" wp14:anchorId="43C45D33" wp14:editId="65E6A9FE">
+            <wp:extent cx="3678527" cy="2880000"/>
+            <wp:effectExtent l="0" t="0" r="0" b="0"/>
+            <wp:docPr id="61" name="Imagen 61"/>
+            <wp:cNvGraphicFramePr>
+              <a:graphicFrameLocks xmlns:a="http://schemas.openxmlformats.org/drawingml/2006/main" noChangeAspect="1"/>
+            </wp:cNvGraphicFramePr>
+            <a:graphic xmlns:a="http://schemas.openxmlformats.org/drawingml/2006/main">
+              <a:graphicData uri="http://schemas.openxmlformats.org/drawingml/2006/picture">
+                <pic:pic xmlns:pic="http://schemas.openxmlformats.org/drawingml/2006/picture">
+                  <pic:nvPicPr>
+                    <pic:cNvPr id="1" name=""/>
+                    <pic:cNvPicPr/>
+                  </pic:nvPicPr>
+                  <pic:blipFill>
+                    <a:blip r:embed="rId51"/>
+                    <a:stretch>
+                      <a:fillRect/>
+                    </a:stretch>
+                  </pic:blipFill>
+                  <pic:spPr>
+                    <a:xfrm>
+                      <a:off x="0" y="0"/>
+                      <a:ext cx="3678527" cy="2880000"/>
+                    </a:xfrm>
+                    <a:prstGeom prst="rect">
+                      <a:avLst/>
+                    </a:prstGeom>
+                  </pic:spPr>
+                </pic:pic>
+              </a:graphicData>
+            </a:graphic>
+          </wp:inline>
+        </w:drawing>
+      </w:r>
+    </w:p>
+    <w:p>
+      <w:pPr>
+        <w:ind w:left="0"/>
+        <w:mirrorIndents/>
+        <w:rPr>
+          <w:rFonts w:ascii="Daytona" w:hAnsi="Daytona"/>
+        </w:rPr>
+      </w:pPr>
+      <w:r>
+        <w:rPr>
+          <w:rFonts w:ascii="Daytona" w:hAnsi="Daytona"/>
+          <w:noProof/>
+        </w:rPr>
+        <mc:AlternateContent>
+          <mc:Choice Requires="wps">
+            <w:drawing>
+              <wp:anchor distT="0" distB="0" distL="114300" distR="114300" simplePos="0" relativeHeight="251663360" behindDoc="0" locked="0" layoutInCell="1" allowOverlap="1" wp14:anchorId="12831CD7" wp14:editId="333FD77A">
+                <wp:simplePos x="0" y="0"/>
+                <wp:positionH relativeFrom="column">
+                  <wp:posOffset>2760345</wp:posOffset>
+                </wp:positionH>
+                <wp:positionV relativeFrom="paragraph">
+                  <wp:posOffset>2308225</wp:posOffset>
+                </wp:positionV>
+                <wp:extent cx="266700" cy="381000"/>
+                <wp:effectExtent l="0" t="0" r="57150" b="57150"/>
+                <wp:wrapNone/>
+                <wp:docPr id="64" name="Conector recto de flecha 64"/>
+                <wp:cNvGraphicFramePr/>
+                <a:graphic xmlns:a="http://schemas.openxmlformats.org/drawingml/2006/main">
+                  <a:graphicData uri="http://schemas.microsoft.com/office/word/2010/wordprocessingShape">
+                    <wps:wsp>
+                      <wps:cNvCnPr/>
+                      <wps:spPr>
+                        <a:xfrm>
+                          <a:off x="0" y="0"/>
+                          <a:ext cx="266700" cy="381000"/>
+                        </a:xfrm>
+                        <a:prstGeom prst="straightConnector1">
+                          <a:avLst/>
+                        </a:prstGeom>
+                        <a:ln>
+                          <a:tailEnd type="triangle"/>
+                        </a:ln>
+                      </wps:spPr>
+                      <wps:style>
+                        <a:lnRef idx="1">
+                          <a:schemeClr val="accent1"/>
+                        </a:lnRef>
+                        <a:fillRef idx="0">
+                          <a:schemeClr val="accent1"/>
+                        </a:fillRef>
+                        <a:effectRef idx="0">
+                          <a:schemeClr val="accent1"/>
+                        </a:effectRef>
+                        <a:fontRef idx="minor">
+                          <a:schemeClr val="tx1"/>
+                        </a:fontRef>
+                      </wps:style>
+                      <wps:bodyPr/>
+                    </wps:wsp>
+                  </a:graphicData>
+                </a:graphic>
+              </wp:anchor>
+            </w:drawing>
+          </mc:Choice>
+          <mc:Fallback>
+            <w:pict>
+              <v:shape w14:anchorId="6F817E65" id="Conector recto de flecha 64" o:spid="_x0000_s1026" type="#_x0000_t32" style="position:absolute;margin-left:217.35pt;margin-top:181.75pt;width:21pt;height:30pt;z-index:251663360;visibility:visible;mso-wrap-style:square;mso-wrap-distance-left:9pt;mso-wrap-distance-top:0;mso-wrap-distance-right:9pt;mso-wrap-distance-bottom:0;mso-position-horizontal:absolute;mso-position-horizontal-relative:text;mso-position-vertical:absolute;mso-position-vertical-relative:text" o:gfxdata="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" strokecolor="#4472c4 [3204]" strokeweight=".5pt">
+                <v:stroke endarrow="block" joinstyle="miter"/>
+              </v:shape>
+            </w:pict>
+          </mc:Fallback>
+        </mc:AlternateContent>
+      </w:r>
+      <w:r>
+        <w:rPr>
+          <w:rFonts w:ascii="Daytona" w:hAnsi="Daytona"/>
+        </w:rPr>
+        <w:drawing>
+          <wp:inline distT="0" distB="0" distL="0" distR="0" wp14:anchorId="22751FF7" wp14:editId="3F5BE4D2">
+            <wp:extent cx="3607068" cy="2844000"/>
+            <wp:effectExtent l="0" t="0" r="0" b="0"/>
+            <wp:docPr id="63" name="Imagen 63"/>
+            <wp:cNvGraphicFramePr>
+              <a:graphicFrameLocks xmlns:a="http://schemas.openxmlformats.org/drawingml/2006/main" noChangeAspect="1"/>
+            </wp:cNvGraphicFramePr>
+            <a:graphic xmlns:a="http://schemas.openxmlformats.org/drawingml/2006/main">
+              <a:graphicData uri="http://schemas.openxmlformats.org/drawingml/2006/picture">
+                <pic:pic xmlns:pic="http://schemas.openxmlformats.org/drawingml/2006/picture">
+                  <pic:nvPicPr>
+                    <pic:cNvPr id="1" name=""/>
+                    <pic:cNvPicPr/>
+                  </pic:nvPicPr>
+                  <pic:blipFill>
+                    <a:blip r:embed="rId52"/>
+                    <a:stretch>
+                      <a:fillRect/>
+                    </a:stretch>
+                  </pic:blipFill>
+                  <pic:spPr>
+                    <a:xfrm>
+                      <a:off x="0" y="0"/>
+                      <a:ext cx="3607068" cy="2844000"/>
+                    </a:xfrm>
+                    <a:prstGeom prst="rect">
+                      <a:avLst/>
+                    </a:prstGeom>
+                  </pic:spPr>
+                </pic:pic>
+              </a:graphicData>
+            </a:graphic>
+          </wp:inline>
+        </w:drawing>
+      </w:r>
+    </w:p>
+    <w:p>
+      <w:pPr>
+        <w:ind w:left="0"/>
+        <w:mirrorIndents/>
+        <w:rPr>
+          <w:rFonts w:ascii="Daytona" w:hAnsi="Daytona"/>
+        </w:rPr>
+      </w:pPr>
+      <w:r>
+        <w:rPr>
+          <w:rFonts w:ascii="Daytona" w:hAnsi="Daytona"/>
+          <w:noProof/>
+        </w:rPr>
+        <w:lastRenderedPageBreak/>
+        <mc:AlternateContent>
+          <mc:Choice Requires="wps">
+            <w:drawing>
+              <wp:anchor distT="0" distB="0" distL="114300" distR="114300" simplePos="0" relativeHeight="251664384" behindDoc="0" locked="0" layoutInCell="1" allowOverlap="1" wp14:anchorId="03B35F37" wp14:editId="4F04F67F">
+                <wp:simplePos x="0" y="0"/>
+                <wp:positionH relativeFrom="column">
+                  <wp:posOffset>3430905</wp:posOffset>
+                </wp:positionH>
+                <wp:positionV relativeFrom="paragraph">
+                  <wp:posOffset>2978785</wp:posOffset>
+                </wp:positionV>
+                <wp:extent cx="297180" cy="327660"/>
+                <wp:effectExtent l="0" t="0" r="64770" b="53340"/>
+                <wp:wrapNone/>
+                <wp:docPr id="66" name="Conector recto de flecha 66"/>
+                <wp:cNvGraphicFramePr/>
+                <a:graphic xmlns:a="http://schemas.openxmlformats.org/drawingml/2006/main">
+                  <a:graphicData uri="http://schemas.microsoft.com/office/word/2010/wordprocessingShape">
+                    <wps:wsp>
+                      <wps:cNvCnPr/>
+                      <wps:spPr>
+                        <a:xfrm>
+                          <a:off x="0" y="0"/>
+                          <a:ext cx="297180" cy="327660"/>
+                        </a:xfrm>
+                        <a:prstGeom prst="straightConnector1">
+                          <a:avLst/>
+                        </a:prstGeom>
+                        <a:ln>
+                          <a:tailEnd type="triangle"/>
+                        </a:ln>
+                      </wps:spPr>
+                      <wps:style>
+                        <a:lnRef idx="1">
+                          <a:schemeClr val="accent1"/>
+                        </a:lnRef>
+                        <a:fillRef idx="0">
+                          <a:schemeClr val="accent1"/>
+                        </a:fillRef>
+                        <a:effectRef idx="0">
+                          <a:schemeClr val="accent1"/>
+                        </a:effectRef>
+                        <a:fontRef idx="minor">
+                          <a:schemeClr val="tx1"/>
+                        </a:fontRef>
+                      </wps:style>
+                      <wps:bodyPr/>
+                    </wps:wsp>
+                  </a:graphicData>
+                </a:graphic>
+              </wp:anchor>
+            </w:drawing>
+          </mc:Choice>
+          <mc:Fallback>
+            <w:pict>
+              <v:shape w14:anchorId="33CB974F" id="Conector recto de flecha 66" o:spid="_x0000_s1026" type="#_x0000_t32" style="position:absolute;margin-left:270.15pt;margin-top:234.55pt;width:23.4pt;height:25.8pt;z-index:251664384;visibility:visible;mso-wrap-style:square;mso-wrap-distance-left:9pt;mso-wrap-distance-top:0;mso-wrap-distance-right:9pt;mso-wrap-distance-bottom:0;mso-position-horizontal:absolute;mso-position-horizontal-relative:text;mso-position-vertical:absolute;mso-position-vertical-relative:text" o:gfxdata="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" strokecolor="#4472c4 [3204]" strokeweight=".5pt">
+                <v:stroke endarrow="block" joinstyle="miter"/>
+              </v:shape>
+            </w:pict>
+          </mc:Fallback>
+        </mc:AlternateContent>
+      </w:r>
+      <w:r>
+        <w:rPr>
+          <w:rFonts w:ascii="Daytona" w:hAnsi="Daytona"/>
+        </w:rPr>
+        <w:drawing>
+          <wp:inline distT="0" distB="0" distL="0" distR="0" wp14:anchorId="4808258C" wp14:editId="760E9DD7">
+            <wp:extent cx="4406928" cy="3456000"/>
+            <wp:effectExtent l="0" t="0" r="0" b="0"/>
+            <wp:docPr id="65" name="Imagen 65"/>
+            <wp:cNvGraphicFramePr>
+              <a:graphicFrameLocks xmlns:a="http://schemas.openxmlformats.org/drawingml/2006/main" noChangeAspect="1"/>
+            </wp:cNvGraphicFramePr>
+            <a:graphic xmlns:a="http://schemas.openxmlformats.org/drawingml/2006/main">
+              <a:graphicData uri="http://schemas.openxmlformats.org/drawingml/2006/picture">
+                <pic:pic xmlns:pic="http://schemas.openxmlformats.org/drawingml/2006/picture">
+                  <pic:nvPicPr>
+                    <pic:cNvPr id="1" name=""/>
+                    <pic:cNvPicPr/>
+                  </pic:nvPicPr>
+                  <pic:blipFill>
+                    <a:blip r:embed="rId53"/>
+                    <a:stretch>
+                      <a:fillRect/>
+                    </a:stretch>
+                  </pic:blipFill>
+                  <pic:spPr>
+                    <a:xfrm>
+                      <a:off x="0" y="0"/>
+                      <a:ext cx="4406928" cy="3456000"/>
+                    </a:xfrm>
+                    <a:prstGeom prst="rect">
+                      <a:avLst/>
+                    </a:prstGeom>
+                  </pic:spPr>
+                </pic:pic>
+              </a:graphicData>
+            </a:graphic>
+          </wp:inline>
+        </w:drawing>
+      </w:r>
+    </w:p>
+    <w:p>
+      <w:pPr>
+        <w:ind w:left="0"/>
+        <w:mirrorIndents/>
+        <w:rPr>
+          <w:rFonts w:ascii="Daytona" w:hAnsi="Daytona"/>
+        </w:rPr>
+      </w:pPr>
+    </w:p>
+    <w:p>
+      <w:pPr>
+        <w:ind w:left="0"/>
+        <w:mirrorIndents/>
+        <w:rPr>
+          <w:rFonts w:ascii="Daytona" w:hAnsi="Daytona"/>
+          <w:u w:val="single"/>
+          <w:lang w:val="pt-PT"/>
+        </w:rPr>
+      </w:pPr>
+      <w:r>
+        <w:rPr>
+          <w:rFonts w:ascii="Daytona" w:hAnsi="Daytona"/>
+          <w:u w:val="single"/>
+          <w:lang w:val="pt-PT"/>
+        </w:rPr>
+        <w:t>DIAGRAMA E-R</w:t>
+      </w:r>
+    </w:p>
+    <w:p>
+      <w:pPr>
+        <w:ind w:left="0"/>
+        <w:mirrorIndents/>
+        <w:rPr>
+          <w:rFonts w:ascii="Daytona" w:hAnsi="Daytona"/>
+          <w:lang w:val="pt-PT"/>
+        </w:rPr>
+      </w:pPr>
+      <w:r>
+        <w:rPr>
+          <w:rFonts w:ascii="Daytona" w:hAnsi="Daytona"/>
+        </w:rPr>
+        <w:drawing>
+          <wp:inline distT="0" distB="0" distL="0" distR="0" wp14:anchorId="15862863" wp14:editId="692BC83E">
+            <wp:extent cx="5400040" cy="3248025"/>
+            <wp:effectExtent l="0" t="0" r="0" b="9525"/>
+            <wp:docPr id="67" name="Imagen 67"/>
+            <wp:cNvGraphicFramePr>
+              <a:graphicFrameLocks xmlns:a="http://schemas.openxmlformats.org/drawingml/2006/main" noChangeAspect="1"/>
+            </wp:cNvGraphicFramePr>
+            <a:graphic xmlns:a="http://schemas.openxmlformats.org/drawingml/2006/main">
+              <a:graphicData uri="http://schemas.openxmlformats.org/drawingml/2006/picture">
+                <pic:pic xmlns:pic="http://schemas.openxmlformats.org/drawingml/2006/picture">
+                  <pic:nvPicPr>
+                    <pic:cNvPr id="1" name=""/>
+                    <pic:cNvPicPr/>
+                  </pic:nvPicPr>
+                  <pic:blipFill>
+                    <a:blip r:embed="rId54"/>
+                    <a:stretch>
+                      <a:fillRect/>
+                    </a:stretch>
+                  </pic:blipFill>
+                  <pic:spPr>
+                    <a:xfrm>
+                      <a:off x="0" y="0"/>
+                      <a:ext cx="5400040" cy="3248025"/>
+                    </a:xfrm>
+                    <a:prstGeom prst="rect">
+                      <a:avLst/>
+                    </a:prstGeom>
+                  </pic:spPr>
+                </pic:pic>
+              </a:graphicData>
+            </a:graphic>
+          </wp:inline>
+        </w:drawing>
+      </w:r>
+      <w:r>
+        <w:rPr>
+          <w:rFonts w:ascii="Daytona" w:hAnsi="Daytona"/>
+          <w:lang w:val="pt-PT"/>
+        </w:rPr>
+        <w:t xml:space="preserve"> </w:t>
+      </w:r>
+    </w:p>
+    <w:p>
+      <w:pPr>
+        <w:ind w:left="0"/>
+        <w:mirrorIndents/>
+        <w:rPr>
+          <w:rFonts w:ascii="Daytona" w:hAnsi="Daytona"/>
+          <w:u w:val="single"/>
+          <w:lang w:val="pt-PT"/>
+        </w:rPr>
+      </w:pPr>
+      <w:r>
+        <w:rPr>
+          <w:rFonts w:ascii="Daytona" w:hAnsi="Daytona"/>
+          <w:u w:val="single"/>
+          <w:lang w:val="pt-PT"/>
+        </w:rPr>
+        <w:t>DIAGRAMA E-R (a mano)</w:t>
+      </w:r>
+    </w:p>
+    <w:p>
+      <w:pPr>
+        <w:ind w:left="0"/>
+        <w:mirrorIndents/>
+        <w:rPr>
+          <w:rFonts w:ascii="Daytona" w:hAnsi="Daytona"/>
+          <w:u w:val="single"/>
+          <w:lang w:val="pt-PT"/>
+        </w:rPr>
+      </w:pPr>
+    </w:p>
+    <w:p>
+      <w:pPr>
+        <w:ind w:left="0"/>
+        <w:mirrorIndents/>
+        <w:rPr>
+          <w:rFonts w:ascii="Daytona" w:hAnsi="Daytona"/>
+          <w:u w:val="single"/>
+          <w:lang w:val="pt-PT"/>
+        </w:rPr>
+      </w:pPr>
+    </w:p>
+    <w:p>
+      <w:pPr>
+        <w:ind w:left="0"/>
+        <w:mirrorIndents/>
+        <w:rPr>
+          <w:rFonts w:ascii="Daytona" w:hAnsi="Daytona"/>
+          <w:u w:val="single"/>
+          <w:lang w:val="pt-PT"/>
+        </w:rPr>
+      </w:pPr>
+    </w:p>
+    <w:p>
+      <w:pPr>
+        <w:ind w:left="0"/>
+        <w:mirrorIndents/>
+        <w:rPr>
+          <w:rFonts w:ascii="Daytona" w:hAnsi="Daytona"/>
+          <w:lang w:val="pt-PT"/>
+        </w:rPr>
+      </w:pPr>
+      <w:r>
+        <w:rPr>
+          <w:rFonts w:ascii="Daytona" w:hAnsi="Daytona"/>
+          <w:lang w:val="pt-PT"/>
+        </w:rPr>
+        <w:lastRenderedPageBreak/>
+        <w:t>C</w:t>
+      </w:r>
+    </w:p>
+    <w:p>
+      <w:pPr>
+        <w:mirrorIndents/>
+        <w:rPr>
+          <w:rFonts w:ascii="Daytona" w:hAnsi="Daytona"/>
+          <w:lang w:val="pt-PT"/>
         </w:rPr>
       </w:pPr>
     </w:p>
     <w:sectPr>
-      <w:footerReference w:type="default" r:id="rId44"/>
+      <w:footerReference w:type="default" r:id="rId55"/>
       <w:pgSz w:w="11906" w:h="16838"/>
       <w:pgMar w:top="1417" w:right="1701" w:bottom="1417" w:left="1701" w:header="737" w:footer="170" w:gutter="0"/>
       <w:cols w:space="708"/>

</xml_diff>

<commit_message>
docs: parte de base de datos del informe terminada
</commit_message>
<xml_diff>
--- a/informe.docx
+++ b/informe.docx
@@ -62,6 +62,26 @@
         <w:jc w:val="both"/>
         <w:rPr>
           <w:rFonts w:ascii="Daytona" w:hAnsi="Daytona"/>
+          <w:b/>
+          <w:bCs/>
+          <w:u w:val="single"/>
+        </w:rPr>
+      </w:pPr>
+      <w:r>
+        <w:rPr>
+          <w:rFonts w:ascii="Daytona" w:hAnsi="Daytona"/>
+          <w:b/>
+          <w:bCs/>
+          <w:u w:val="single"/>
+        </w:rPr>
+        <w:t>PROCESAMIENTO Y ESTRUCTURACIÓN</w:t>
+      </w:r>
+    </w:p>
+    <w:p>
+      <w:pPr>
+        <w:jc w:val="both"/>
+        <w:rPr>
+          <w:rFonts w:ascii="Daytona" w:hAnsi="Daytona"/>
         </w:rPr>
       </w:pPr>
       <w:r>
@@ -673,18 +693,16 @@
         </w:rPr>
         <w:t>)</w:t>
       </w:r>
-    </w:p>
-    <w:p>
-      <w:pPr>
-        <w:mirrorIndents/>
-        <w:jc w:val="center"/>
-        <w:rPr>
-          <w:rFonts w:ascii="Daytona" w:hAnsi="Daytona"/>
-        </w:rPr>
-      </w:pPr>
-      <w:r>
-        <w:rPr>
-          <w:rFonts w:ascii="Daytona" w:hAnsi="Daytona"/>
+      <w:r>
+        <w:rPr>
+          <w:rFonts w:ascii="Daytona" w:hAnsi="Daytona"/>
+        </w:rPr>
+        <w:t>.</w:t>
+      </w:r>
+      <w:r>
+        <w:rPr>
+          <w:rFonts w:ascii="Daytona" w:hAnsi="Daytona"/>
+          <w:noProof/>
         </w:rPr>
         <w:drawing>
           <wp:inline distT="0" distB="0" distL="0" distR="0" wp14:anchorId="2BD80897" wp14:editId="5230E44D">
@@ -1055,6 +1073,7 @@
       <w:r>
         <w:rPr>
           <w:rFonts w:ascii="Daytona" w:hAnsi="Daytona"/>
+          <w:noProof/>
         </w:rPr>
         <w:drawing>
           <wp:inline distT="0" distB="0" distL="0" distR="0" wp14:anchorId="1F423B82" wp14:editId="32EBB5BC">
@@ -1101,6 +1120,7 @@
       <w:r>
         <w:rPr>
           <w:rFonts w:ascii="Daytona" w:hAnsi="Daytona"/>
+          <w:noProof/>
         </w:rPr>
         <w:drawing>
           <wp:inline distT="0" distB="0" distL="0" distR="0" wp14:anchorId="7FD3A349" wp14:editId="0CF46C98">
@@ -1151,7 +1171,21 @@
         <w:rPr>
           <w:rFonts w:ascii="Daytona" w:hAnsi="Daytona"/>
         </w:rPr>
-        <w:t>Bien, para el .</w:t>
+        <w:t xml:space="preserve">Bien, para </w:t>
+      </w:r>
+      <w:proofErr w:type="spellStart"/>
+      <w:r>
+        <w:rPr>
+          <w:rFonts w:ascii="Daytona" w:hAnsi="Daytona"/>
+        </w:rPr>
+        <w:t>el</w:t>
+      </w:r>
+      <w:proofErr w:type="spellEnd"/>
+      <w:r>
+        <w:rPr>
+          <w:rFonts w:ascii="Daytona" w:hAnsi="Daytona"/>
+        </w:rPr>
+        <w:t xml:space="preserve"> .</w:t>
       </w:r>
       <w:proofErr w:type="spellStart"/>
       <w:r>
@@ -1193,6 +1227,7 @@
       <w:r>
         <w:rPr>
           <w:rFonts w:ascii="Daytona" w:hAnsi="Daytona"/>
+          <w:noProof/>
         </w:rPr>
         <w:drawing>
           <wp:inline distT="0" distB="0" distL="0" distR="0" wp14:anchorId="35E9191E" wp14:editId="4262B5FC">
@@ -1330,6 +1365,7 @@
       <w:r>
         <w:rPr>
           <w:rFonts w:ascii="Daytona" w:hAnsi="Daytona"/>
+          <w:noProof/>
         </w:rPr>
         <w:drawing>
           <wp:inline distT="0" distB="0" distL="0" distR="0" wp14:anchorId="0E446075" wp14:editId="39B10C68">
@@ -1379,6 +1415,7 @@
       <w:r>
         <w:rPr>
           <w:rFonts w:ascii="Daytona" w:hAnsi="Daytona"/>
+          <w:noProof/>
         </w:rPr>
         <w:drawing>
           <wp:inline distT="0" distB="0" distL="0" distR="0" wp14:anchorId="0A952D3B" wp14:editId="55062561">
@@ -1636,6 +1673,7 @@
       <w:r>
         <w:rPr>
           <w:rFonts w:ascii="Daytona" w:hAnsi="Daytona"/>
+          <w:noProof/>
         </w:rPr>
         <w:lastRenderedPageBreak/>
         <w:drawing>
@@ -1855,6 +1893,7 @@
       <w:r>
         <w:rPr>
           <w:rFonts w:ascii="Daytona" w:hAnsi="Daytona"/>
+          <w:noProof/>
         </w:rPr>
         <w:drawing>
           <wp:inline distT="0" distB="0" distL="0" distR="0" wp14:anchorId="75CA19A9" wp14:editId="15E5E13A">
@@ -1901,6 +1940,7 @@
       <w:r>
         <w:rPr>
           <w:rFonts w:ascii="Daytona" w:hAnsi="Daytona"/>
+          <w:noProof/>
         </w:rPr>
         <w:drawing>
           <wp:inline distT="0" distB="0" distL="0" distR="0" wp14:anchorId="6030DA91" wp14:editId="19FE5EEF">
@@ -2722,12 +2762,16 @@
         <w:jc w:val="both"/>
         <w:rPr>
           <w:rFonts w:ascii="Daytona" w:hAnsi="Daytona"/>
+          <w:b/>
+          <w:bCs/>
           <w:u w:val="single"/>
         </w:rPr>
       </w:pPr>
       <w:r>
         <w:rPr>
           <w:rFonts w:ascii="Daytona" w:hAnsi="Daytona"/>
+          <w:b/>
+          <w:bCs/>
           <w:u w:val="single"/>
         </w:rPr>
         <w:t>BASE DE DATOS</w:t>
@@ -3109,6 +3153,7 @@
       <w:r>
         <w:rPr>
           <w:rFonts w:ascii="Daytona" w:hAnsi="Daytona"/>
+          <w:noProof/>
         </w:rPr>
         <w:drawing>
           <wp:inline distT="0" distB="0" distL="0" distR="0" wp14:anchorId="270D0763" wp14:editId="10C5DA7E">
@@ -3789,13 +3834,7 @@
         <w:rPr>
           <w:rFonts w:ascii="Daytona" w:hAnsi="Daytona"/>
         </w:rPr>
-        <w:t>iertamente</w:t>
-      </w:r>
-      <w:r>
-        <w:rPr>
-          <w:rFonts w:ascii="Daytona" w:hAnsi="Daytona"/>
-        </w:rPr>
-        <w:t xml:space="preserve"> </w:t>
+        <w:t xml:space="preserve">iertamente </w:t>
       </w:r>
       <w:proofErr w:type="spellStart"/>
       <w:r>
@@ -4056,11 +4095,15 @@
         <w:jc w:val="both"/>
         <w:rPr>
           <w:rFonts w:ascii="Daytona" w:hAnsi="Daytona"/>
-        </w:rPr>
-      </w:pPr>
-      <w:r>
-        <w:rPr>
-          <w:rFonts w:ascii="Daytona" w:hAnsi="Daytona"/>
+          <w:b/>
+          <w:bCs/>
+        </w:rPr>
+      </w:pPr>
+      <w:r>
+        <w:rPr>
+          <w:rFonts w:ascii="Daytona" w:hAnsi="Daytona"/>
+          <w:b/>
+          <w:bCs/>
         </w:rPr>
         <w:t>Johnny Ramírez</w:t>
       </w:r>
@@ -4076,11 +4119,15 @@
         <w:jc w:val="both"/>
         <w:rPr>
           <w:rFonts w:ascii="Daytona" w:hAnsi="Daytona"/>
-        </w:rPr>
-      </w:pPr>
-      <w:r>
-        <w:rPr>
-          <w:rFonts w:ascii="Daytona" w:hAnsi="Daytona"/>
+          <w:b/>
+          <w:bCs/>
+        </w:rPr>
+      </w:pPr>
+      <w:r>
+        <w:rPr>
+          <w:rFonts w:ascii="Daytona" w:hAnsi="Daytona"/>
+          <w:b/>
+          <w:bCs/>
         </w:rPr>
         <w:t xml:space="preserve">Delio </w:t>
       </w:r>
@@ -4088,6 +4135,8 @@
       <w:r>
         <w:rPr>
           <w:rFonts w:ascii="Daytona" w:hAnsi="Daytona"/>
+          <w:b/>
+          <w:bCs/>
         </w:rPr>
         <w:t>Tolivia</w:t>
       </w:r>
@@ -4104,11 +4153,15 @@
         <w:jc w:val="both"/>
         <w:rPr>
           <w:rFonts w:ascii="Daytona" w:hAnsi="Daytona"/>
-        </w:rPr>
-      </w:pPr>
-      <w:r>
-        <w:rPr>
-          <w:rFonts w:ascii="Daytona" w:hAnsi="Daytona"/>
+          <w:b/>
+          <w:bCs/>
+        </w:rPr>
+      </w:pPr>
+      <w:r>
+        <w:rPr>
+          <w:rFonts w:ascii="Daytona" w:hAnsi="Daytona"/>
+          <w:b/>
+          <w:bCs/>
         </w:rPr>
         <w:t>Mario Álvarez</w:t>
       </w:r>
@@ -4327,15 +4380,7 @@
           <w:color w:val="44546A" w:themeColor="text2"/>
           <w:lang w:val="en-US"/>
         </w:rPr>
-        <w:t>Final</w:t>
-      </w:r>
-      <w:r>
-        <w:rPr>
-          <w:rFonts w:ascii="Daytona" w:hAnsi="Daytona"/>
-          <w:color w:val="44546A" w:themeColor="text2"/>
-          <w:lang w:val="en-US"/>
-        </w:rPr>
-        <w:t xml:space="preserve"> Four</w:t>
+        <w:t>Final Four</w:t>
       </w:r>
     </w:p>
     <w:p>
@@ -4395,13 +4440,7 @@
         <w:rPr>
           <w:rFonts w:ascii="Daytona" w:hAnsi="Daytona"/>
         </w:rPr>
-        <w:t xml:space="preserve"> y</w:t>
-      </w:r>
-      <w:r>
-        <w:rPr>
-          <w:rFonts w:ascii="Daytona" w:hAnsi="Daytona"/>
-        </w:rPr>
-        <w:t xml:space="preserve"> </w:t>
+        <w:t xml:space="preserve"> y </w:t>
       </w:r>
       <w:r>
         <w:rPr>
@@ -5286,120 +5325,107 @@
           <w:rFonts w:ascii="Arial" w:hAnsi="Arial" w:cs="Arial"/>
           <w:u w:val="single"/>
         </w:rPr>
-        <w:t>├──</w:t>
-      </w:r>
-      <w:r>
+        <w:t>├──tile.gif</w:t>
+      </w:r>
+    </w:p>
+    <w:p>
+      <w:pPr>
+        <w:mirrorIndents/>
+        <w:jc w:val="both"/>
         <w:rPr>
           <w:rFonts w:ascii="Arial" w:hAnsi="Arial" w:cs="Arial"/>
           <w:u w:val="single"/>
         </w:rPr>
-        <w:t>tile.gif</w:t>
-      </w:r>
-    </w:p>
-    <w:p>
-      <w:pPr>
-        <w:mirrorIndents/>
-        <w:jc w:val="both"/>
+      </w:pPr>
+      <w:r>
         <w:rPr>
           <w:rFonts w:ascii="Arial" w:hAnsi="Arial" w:cs="Arial"/>
           <w:u w:val="single"/>
         </w:rPr>
-      </w:pPr>
+        <w:t>├──ye-lo-que-</w:t>
+      </w:r>
+      <w:proofErr w:type="spellStart"/>
       <w:r>
         <w:rPr>
           <w:rFonts w:ascii="Arial" w:hAnsi="Arial" w:cs="Arial"/>
           <w:u w:val="single"/>
         </w:rPr>
-        <w:t>├──</w:t>
+        <w:t>hay.w</w:t>
       </w:r>
       <w:r>
         <w:rPr>
           <w:rFonts w:ascii="Arial" w:hAnsi="Arial" w:cs="Arial"/>
           <w:u w:val="single"/>
         </w:rPr>
-        <w:t>ye-lo-que-</w:t>
-      </w:r>
-      <w:proofErr w:type="spellStart"/>
+        <w:t>ebp</w:t>
+      </w:r>
+      <w:proofErr w:type="spellEnd"/>
+    </w:p>
+    <w:p>
+      <w:pPr>
+        <w:mirrorIndents/>
+        <w:jc w:val="both"/>
+        <w:rPr>
+          <w:rFonts w:ascii="Daytona" w:hAnsi="Daytona"/>
+        </w:rPr>
+      </w:pPr>
       <w:r>
         <w:rPr>
           <w:rFonts w:ascii="Arial" w:hAnsi="Arial" w:cs="Arial"/>
+        </w:rPr>
+        <w:t xml:space="preserve">El gif es igual que </w:t>
+      </w:r>
+      <w:proofErr w:type="spellStart"/>
+      <w:r>
+        <w:rPr>
+          <w:rFonts w:ascii="Arial" w:hAnsi="Arial" w:cs="Arial"/>
+        </w:rPr>
+        <w:t>magicalonso</w:t>
+      </w:r>
+      <w:proofErr w:type="spellEnd"/>
+      <w:r>
+        <w:rPr>
+          <w:rFonts w:ascii="Arial" w:hAnsi="Arial" w:cs="Arial"/>
+        </w:rPr>
+        <w:t xml:space="preserve">, lo añado por si finalmente decidió </w:t>
+      </w:r>
+      <w:proofErr w:type="spellStart"/>
+      <w:r>
+        <w:rPr>
+          <w:rFonts w:ascii="Arial" w:hAnsi="Arial" w:cs="Arial"/>
+        </w:rPr>
+        <w:t>incorparlo</w:t>
+      </w:r>
+      <w:proofErr w:type="spellEnd"/>
+      <w:r>
+        <w:rPr>
+          <w:rFonts w:ascii="Arial" w:hAnsi="Arial" w:cs="Arial"/>
+        </w:rPr>
+        <w:t xml:space="preserve"> a la web</w:t>
+      </w:r>
+    </w:p>
+    <w:p>
+      <w:pPr>
+        <w:mirrorIndents/>
+        <w:jc w:val="both"/>
+        <w:rPr>
+          <w:rFonts w:ascii="Daytona" w:hAnsi="Daytona"/>
+        </w:rPr>
+      </w:pPr>
+    </w:p>
+    <w:p>
+      <w:pPr>
+        <w:mirrorIndents/>
+        <w:jc w:val="both"/>
+        <w:rPr>
+          <w:rFonts w:ascii="Daytona" w:hAnsi="Daytona"/>
           <w:u w:val="single"/>
         </w:rPr>
-        <w:t>hay.w</w:t>
-      </w:r>
-      <w:r>
-        <w:rPr>
-          <w:rFonts w:ascii="Arial" w:hAnsi="Arial" w:cs="Arial"/>
-          <w:u w:val="single"/>
-        </w:rPr>
-        <w:t>ebp</w:t>
-      </w:r>
-      <w:proofErr w:type="spellEnd"/>
-    </w:p>
-    <w:p>
-      <w:pPr>
-        <w:mirrorIndents/>
-        <w:jc w:val="both"/>
-        <w:rPr>
-          <w:rFonts w:ascii="Daytona" w:hAnsi="Daytona"/>
-        </w:rPr>
-      </w:pPr>
-      <w:r>
-        <w:rPr>
-          <w:rFonts w:ascii="Arial" w:hAnsi="Arial" w:cs="Arial"/>
-        </w:rPr>
-        <w:t xml:space="preserve">El gif es igual que </w:t>
-      </w:r>
-      <w:proofErr w:type="spellStart"/>
-      <w:r>
-        <w:rPr>
-          <w:rFonts w:ascii="Arial" w:hAnsi="Arial" w:cs="Arial"/>
-        </w:rPr>
-        <w:t>magicalonso</w:t>
-      </w:r>
-      <w:proofErr w:type="spellEnd"/>
-      <w:r>
-        <w:rPr>
-          <w:rFonts w:ascii="Arial" w:hAnsi="Arial" w:cs="Arial"/>
-        </w:rPr>
-        <w:t xml:space="preserve">, lo añado por si finalmente decidió </w:t>
-      </w:r>
-      <w:proofErr w:type="spellStart"/>
-      <w:r>
-        <w:rPr>
-          <w:rFonts w:ascii="Arial" w:hAnsi="Arial" w:cs="Arial"/>
-        </w:rPr>
-        <w:t>incorparlo</w:t>
-      </w:r>
-      <w:proofErr w:type="spellEnd"/>
-      <w:r>
-        <w:rPr>
-          <w:rFonts w:ascii="Arial" w:hAnsi="Arial" w:cs="Arial"/>
-        </w:rPr>
-        <w:t xml:space="preserve"> a la web</w:t>
-      </w:r>
-    </w:p>
-    <w:p>
-      <w:pPr>
-        <w:mirrorIndents/>
-        <w:jc w:val="both"/>
-        <w:rPr>
-          <w:rFonts w:ascii="Daytona" w:hAnsi="Daytona"/>
-        </w:rPr>
-      </w:pPr>
-    </w:p>
-    <w:p>
-      <w:pPr>
-        <w:mirrorIndents/>
-        <w:jc w:val="both"/>
-        <w:rPr>
-          <w:rFonts w:ascii="Daytona" w:hAnsi="Daytona"/>
-          <w:u w:val="single"/>
-        </w:rPr>
-      </w:pPr>
-      <w:r>
-        <w:rPr>
-          <w:rFonts w:ascii="Daytona" w:hAnsi="Daytona"/>
+      </w:pPr>
+      <w:r>
+        <w:rPr>
+          <w:rFonts w:ascii="Daytona" w:hAnsi="Daytona"/>
+          <w:noProof/>
           <w:u w:val="single"/>
         </w:rPr>
         <w:drawing>
@@ -5607,6 +5633,7 @@
       <w:r>
         <w:rPr>
           <w:rFonts w:ascii="Daytona" w:hAnsi="Daytona"/>
+          <w:noProof/>
         </w:rPr>
         <w:drawing>
           <wp:inline distT="0" distB="0" distL="0" distR="0" wp14:anchorId="41A183F0" wp14:editId="7B9DF24C">
@@ -5656,6 +5683,24 @@
     </w:p>
     <w:p>
       <w:pPr>
+        <w:mirrorIndents/>
+        <w:jc w:val="both"/>
+        <w:rPr>
+          <w:rFonts w:ascii="Daytona" w:hAnsi="Daytona"/>
+        </w:rPr>
+      </w:pPr>
+    </w:p>
+    <w:p>
+      <w:pPr>
+        <w:mirrorIndents/>
+        <w:jc w:val="both"/>
+        <w:rPr>
+          <w:rFonts w:ascii="Daytona" w:hAnsi="Daytona"/>
+        </w:rPr>
+      </w:pPr>
+    </w:p>
+    <w:p>
+      <w:pPr>
         <w:jc w:val="both"/>
         <w:rPr>
           <w:rFonts w:ascii="Daytona" w:hAnsi="Daytona"/>
@@ -5667,6 +5712,7 @@
           <w:rFonts w:ascii="Daytona" w:hAnsi="Daytona"/>
           <w:u w:val="single"/>
         </w:rPr>
+        <w:lastRenderedPageBreak/>
         <w:t>GALERIA-KAROLG</w:t>
       </w:r>
     </w:p>
@@ -5703,7 +5749,6 @@
         <w:rPr>
           <w:rFonts w:ascii="Arial" w:hAnsi="Arial" w:cs="Arial"/>
         </w:rPr>
-        <w:lastRenderedPageBreak/>
         <w:t>├──</w:t>
       </w:r>
       <w:proofErr w:type="spellStart"/>
@@ -5789,6 +5834,7 @@
       <w:r>
         <w:rPr>
           <w:rFonts w:ascii="Daytona" w:hAnsi="Daytona"/>
+          <w:noProof/>
         </w:rPr>
         <w:drawing>
           <wp:inline distT="0" distB="0" distL="0" distR="0" wp14:anchorId="359B41F0" wp14:editId="493907D6">
@@ -5963,6 +6009,7 @@
       <w:r>
         <w:rPr>
           <w:rFonts w:ascii="Daytona" w:hAnsi="Daytona"/>
+          <w:noProof/>
         </w:rPr>
         <w:drawing>
           <wp:inline distT="0" distB="0" distL="0" distR="0" wp14:anchorId="3B62437F" wp14:editId="154D3086">
@@ -6039,6 +6086,7 @@
       <w:r>
         <w:rPr>
           <w:rFonts w:ascii="Daytona" w:hAnsi="Daytona"/>
+          <w:noProof/>
         </w:rPr>
         <w:lastRenderedPageBreak/>
         <w:drawing>
@@ -6086,6 +6134,7 @@
       <w:r>
         <w:rPr>
           <w:rFonts w:ascii="Daytona" w:hAnsi="Daytona"/>
+          <w:noProof/>
         </w:rPr>
         <w:drawing>
           <wp:inline distT="0" distB="0" distL="0" distR="0" wp14:anchorId="6E819ED1" wp14:editId="78CBF326">
@@ -6336,6 +6385,7 @@
       <w:r>
         <w:rPr>
           <w:rFonts w:ascii="Daytona" w:hAnsi="Daytona"/>
+          <w:noProof/>
         </w:rPr>
         <w:drawing>
           <wp:inline distT="0" distB="0" distL="0" distR="0" wp14:anchorId="60551D8B" wp14:editId="04B898AA">
@@ -6638,6 +6688,7 @@
       <w:r>
         <w:rPr>
           <w:rFonts w:ascii="Daytona" w:hAnsi="Daytona"/>
+          <w:noProof/>
         </w:rPr>
         <w:drawing>
           <wp:inline distT="0" distB="0" distL="0" distR="0" wp14:anchorId="1D9D0F94" wp14:editId="3D445DCA">
@@ -6686,6 +6737,7 @@
       <w:r>
         <w:rPr>
           <w:rFonts w:ascii="Daytona" w:hAnsi="Daytona"/>
+          <w:noProof/>
         </w:rPr>
         <w:drawing>
           <wp:inline distT="0" distB="0" distL="0" distR="0" wp14:anchorId="7CAE0B14" wp14:editId="5B32307D">
@@ -6755,6 +6807,12 @@
         </w:rPr>
         <w:t>, a excepción de la tabla favoritos que tiene su propia clave compuesta por dos campos que son clave en otras tablas.</w:t>
       </w:r>
+      <w:r>
+        <w:rPr>
+          <w:rFonts w:ascii="Daytona" w:hAnsi="Daytona"/>
+        </w:rPr>
+        <w:t xml:space="preserve"> EL email en la tabla de Usuarios es UNIQUE porque en la parte de programación se empleará como el id del usuario.</w:t>
+      </w:r>
     </w:p>
     <w:p>
       <w:pPr>
@@ -6849,7 +6907,66 @@
         <w:rPr>
           <w:rFonts w:ascii="Daytona" w:hAnsi="Daytona"/>
         </w:rPr>
-        <w:t xml:space="preserve">(). Así que había dos opciones, cambiar el nombre del campo o ponerlo de entre apostrofes de forma que el gestor la interpreta como un literal, me decanté por esta opción. El tamaños de los VARCHAR es aproximado a su contenido siempre dejando de más para evitar futuros problemas. Todos los </w:t>
+        <w:t xml:space="preserve">(). Así que había dos opciones, cambiar el nombre del campo o ponerlo de entre </w:t>
+      </w:r>
+      <w:proofErr w:type="spellStart"/>
+      <w:r>
+        <w:rPr>
+          <w:rFonts w:ascii="Daytona" w:hAnsi="Daytona"/>
+        </w:rPr>
+        <w:t>backticks</w:t>
+      </w:r>
+      <w:proofErr w:type="spellEnd"/>
+      <w:r>
+        <w:rPr>
+          <w:rFonts w:ascii="Daytona" w:hAnsi="Daytona"/>
+        </w:rPr>
+        <w:t xml:space="preserve"> de forma que el gestor la interpreta como un literal, me decanté por esta opción.</w:t>
+      </w:r>
+      <w:r>
+        <w:rPr>
+          <w:rFonts w:ascii="Daytona" w:hAnsi="Daytona"/>
+        </w:rPr>
+        <w:t xml:space="preserve"> Además este campo tiene esa longitud tan desmesurada a simple vista porque si </w:t>
+      </w:r>
+      <w:r>
+        <w:rPr>
+          <w:rFonts w:ascii="Daytona" w:hAnsi="Daytona"/>
+        </w:rPr>
+        <w:lastRenderedPageBreak/>
+        <w:t xml:space="preserve">deseamos introducir contraseñas </w:t>
+      </w:r>
+      <w:proofErr w:type="spellStart"/>
+      <w:r>
+        <w:rPr>
+          <w:rFonts w:ascii="Daytona" w:hAnsi="Daytona"/>
+        </w:rPr>
+        <w:t>hasheadas</w:t>
+      </w:r>
+      <w:proofErr w:type="spellEnd"/>
+      <w:r>
+        <w:rPr>
+          <w:rFonts w:ascii="Daytona" w:hAnsi="Daytona"/>
+        </w:rPr>
+        <w:t xml:space="preserve"> lo necesitaríamos.</w:t>
+      </w:r>
+      <w:r>
+        <w:rPr>
+          <w:rFonts w:ascii="Daytona" w:hAnsi="Daytona"/>
+        </w:rPr>
+        <w:t xml:space="preserve"> El tamaños de los VARCHAR es aproximado a su contenido siempre dejando de más para evitar futuros problemas. </w:t>
+      </w:r>
+      <w:r>
+        <w:rPr>
+          <w:rFonts w:ascii="Daytona" w:hAnsi="Daytona"/>
+        </w:rPr>
+        <w:t xml:space="preserve">En eventos, fecha es de tipo DATE (día/mes/año) y descripción de tipo TEXT (sin límite de caracteres). </w:t>
+      </w:r>
+      <w:r>
+        <w:rPr>
+          <w:rFonts w:ascii="Daytona" w:hAnsi="Daytona"/>
+        </w:rPr>
+        <w:t xml:space="preserve">Todos los </w:t>
       </w:r>
       <w:r>
         <w:rPr>
@@ -6869,26 +6986,20 @@
         <w:rPr>
           <w:rFonts w:ascii="Daytona" w:hAnsi="Daytona"/>
         </w:rPr>
-        <w:t xml:space="preserve">creados llevan “ON DELETE CASCADE” </w:t>
-      </w:r>
-      <w:r>
-        <w:rPr>
-          <w:rFonts w:ascii="Daytona" w:hAnsi="Daytona"/>
-        </w:rPr>
-        <w:lastRenderedPageBreak/>
-        <w:t>al final, esto implica que si posteriormente eliminamos alguno, no quedarán rastros ni elementos derivados de su creación, sino que lo eliminará con bien dice en cascada.</w:t>
-      </w:r>
-    </w:p>
-    <w:p>
-      <w:pPr>
-        <w:jc w:val="both"/>
-        <w:rPr>
-          <w:rFonts w:ascii="Daytona" w:hAnsi="Daytona"/>
-        </w:rPr>
-      </w:pPr>
-      <w:r>
-        <w:rPr>
-          <w:rFonts w:ascii="Daytona" w:hAnsi="Daytona"/>
+        <w:t>creados llevan “ON DELETE CASCADE” al final, esto implica que si posteriormente eliminamos alguno, no quedarán rastros ni elementos derivados de su creación, sino que lo eliminará con bien dice en cascada.</w:t>
+      </w:r>
+    </w:p>
+    <w:p>
+      <w:pPr>
+        <w:jc w:val="both"/>
+        <w:rPr>
+          <w:rFonts w:ascii="Daytona" w:hAnsi="Daytona"/>
+        </w:rPr>
+      </w:pPr>
+      <w:r>
+        <w:rPr>
+          <w:rFonts w:ascii="Daytona" w:hAnsi="Daytona"/>
+          <w:noProof/>
         </w:rPr>
         <w:drawing>
           <wp:inline distT="0" distB="0" distL="0" distR="0" wp14:anchorId="310C82E8" wp14:editId="4806D439">
@@ -6934,46 +7045,32 @@
           <w:rFonts w:ascii="Daytona" w:hAnsi="Daytona"/>
         </w:rPr>
       </w:pPr>
-    </w:p>
-    <w:p>
-      <w:pPr>
-        <w:rPr>
-          <w:rFonts w:ascii="Daytona" w:hAnsi="Daytona"/>
-          <w:u w:val="single"/>
-        </w:rPr>
-      </w:pPr>
-      <w:r>
-        <w:rPr>
-          <w:rFonts w:ascii="Daytona" w:hAnsi="Daytona"/>
-          <w:u w:val="single"/>
-        </w:rPr>
-        <w:t>INSERCIÓN DE DATOS</w:t>
-      </w:r>
-    </w:p>
-    <w:p>
-      <w:pPr>
-        <w:pStyle w:val="Prrafodelista"/>
-        <w:numPr>
-          <w:ilvl w:val="0"/>
-          <w:numId w:val="3"/>
-        </w:numPr>
-        <w:rPr>
-          <w:rFonts w:ascii="Daytona" w:hAnsi="Daytona"/>
-          <w:u w:val="single"/>
-        </w:rPr>
-      </w:pPr>
-      <w:r>
-        <w:rPr>
-          <w:rFonts w:ascii="Daytona" w:hAnsi="Daytona"/>
-          <w:u w:val="single"/>
-        </w:rPr>
-        <w:t>USUARIOS</w:t>
-      </w:r>
-    </w:p>
-    <w:p>
-      <w:pPr>
-        <w:rPr>
-          <w:u w:val="single"/>
+      <w:r>
+        <w:rPr>
+          <w:rFonts w:ascii="Daytona" w:hAnsi="Daytona"/>
+        </w:rPr>
+        <w:t xml:space="preserve">(Captura de </w:t>
+      </w:r>
+      <w:proofErr w:type="spellStart"/>
+      <w:r>
+        <w:rPr>
+          <w:rFonts w:ascii="Daytona" w:hAnsi="Daytona"/>
+        </w:rPr>
+        <w:t>Notion</w:t>
+      </w:r>
+      <w:proofErr w:type="spellEnd"/>
+      <w:r>
+        <w:rPr>
+          <w:rFonts w:ascii="Daytona" w:hAnsi="Daytona"/>
+        </w:rPr>
+        <w:t>)</w:t>
+      </w:r>
+    </w:p>
+    <w:p>
+      <w:pPr>
+        <w:jc w:val="both"/>
+        <w:rPr>
+          <w:rFonts w:ascii="Daytona" w:hAnsi="Daytona"/>
         </w:rPr>
       </w:pPr>
       <w:r>
@@ -6981,10 +7078,10 @@
           <w:rFonts w:ascii="Daytona" w:hAnsi="Daytona"/>
         </w:rPr>
         <w:drawing>
-          <wp:inline distT="0" distB="0" distL="0" distR="0" wp14:anchorId="0A236B76" wp14:editId="0BDE543A">
-            <wp:extent cx="4263843" cy="900000"/>
-            <wp:effectExtent l="0" t="0" r="3810" b="0"/>
-            <wp:docPr id="32" name="Imagen 32"/>
+          <wp:inline distT="0" distB="0" distL="0" distR="0" wp14:anchorId="34EF2A11" wp14:editId="48A0C4B9">
+            <wp:extent cx="3734668" cy="2700000"/>
+            <wp:effectExtent l="0" t="0" r="0" b="5715"/>
+            <wp:docPr id="9" name="Imagen 9"/>
             <wp:cNvGraphicFramePr>
               <a:graphicFrameLocks xmlns:a="http://schemas.openxmlformats.org/drawingml/2006/main" noChangeAspect="1"/>
             </wp:cNvGraphicFramePr>
@@ -7004,7 +7101,7 @@
                   <pic:spPr>
                     <a:xfrm>
                       <a:off x="0" y="0"/>
-                      <a:ext cx="4263843" cy="900000"/>
+                      <a:ext cx="3734668" cy="2700000"/>
                     </a:xfrm>
                     <a:prstGeom prst="rect">
                       <a:avLst/>
@@ -7019,15 +7116,18 @@
     </w:p>
     <w:p>
       <w:pPr>
-        <w:rPr>
-          <w:rFonts w:ascii="Daytona" w:hAnsi="Daytona"/>
-        </w:rPr>
-      </w:pPr>
-      <w:r>
-        <w:rPr>
-          <w:rFonts w:ascii="Daytona" w:hAnsi="Daytona"/>
-        </w:rPr>
-        <w:t>Primero inserto los datos, de la tabla usuarios. Como había dicho anteriormente los usuarios, serán los profesores. El email y contraseñas son inventados.</w:t>
+        <w:jc w:val="both"/>
+        <w:rPr>
+          <w:rFonts w:ascii="Daytona" w:hAnsi="Daytona"/>
+          <w:u w:val="single"/>
+        </w:rPr>
+      </w:pPr>
+      <w:r>
+        <w:rPr>
+          <w:rFonts w:ascii="Daytona" w:hAnsi="Daytona"/>
+          <w:u w:val="single"/>
+        </w:rPr>
+        <w:t>INSERCIÓN DE DATOS</w:t>
       </w:r>
     </w:p>
     <w:p>
@@ -7037,6 +7137,7 @@
           <w:ilvl w:val="0"/>
           <w:numId w:val="3"/>
         </w:numPr>
+        <w:jc w:val="both"/>
         <w:rPr>
           <w:rFonts w:ascii="Daytona" w:hAnsi="Daytona"/>
           <w:u w:val="single"/>
@@ -7047,24 +7148,26 @@
           <w:rFonts w:ascii="Daytona" w:hAnsi="Daytona"/>
           <w:u w:val="single"/>
         </w:rPr>
-        <w:t>EVENTOS</w:t>
-      </w:r>
-    </w:p>
-    <w:p>
-      <w:pPr>
-        <w:rPr>
-          <w:rFonts w:ascii="Daytona" w:hAnsi="Daytona"/>
-        </w:rPr>
-      </w:pPr>
-      <w:r>
-        <w:rPr>
-          <w:rFonts w:ascii="Daytona" w:hAnsi="Daytona"/>
+        <w:t>USUARIOS</w:t>
+      </w:r>
+    </w:p>
+    <w:p>
+      <w:pPr>
+        <w:jc w:val="both"/>
+        <w:rPr>
+          <w:u w:val="single"/>
+        </w:rPr>
+      </w:pPr>
+      <w:r>
+        <w:rPr>
+          <w:rFonts w:ascii="Daytona" w:hAnsi="Daytona"/>
+          <w:noProof/>
         </w:rPr>
         <w:drawing>
-          <wp:inline distT="0" distB="0" distL="0" distR="0" wp14:anchorId="5A7D054D" wp14:editId="43E9FD26">
-            <wp:extent cx="3693420" cy="2592000"/>
-            <wp:effectExtent l="0" t="0" r="2540" b="0"/>
-            <wp:docPr id="34" name="Imagen 34"/>
+          <wp:inline distT="0" distB="0" distL="0" distR="0" wp14:anchorId="0A236B76" wp14:editId="0BDE543A">
+            <wp:extent cx="4263843" cy="900000"/>
+            <wp:effectExtent l="0" t="0" r="3810" b="0"/>
+            <wp:docPr id="32" name="Imagen 32"/>
             <wp:cNvGraphicFramePr>
               <a:graphicFrameLocks xmlns:a="http://schemas.openxmlformats.org/drawingml/2006/main" noChangeAspect="1"/>
             </wp:cNvGraphicFramePr>
@@ -7084,7 +7187,7 @@
                   <pic:spPr>
                     <a:xfrm>
                       <a:off x="0" y="0"/>
-                      <a:ext cx="3693420" cy="2592000"/>
+                      <a:ext cx="4263843" cy="900000"/>
                     </a:xfrm>
                     <a:prstGeom prst="rect">
                       <a:avLst/>
@@ -7099,47 +7202,65 @@
     </w:p>
     <w:p>
       <w:pPr>
-        <w:rPr>
-          <w:rFonts w:ascii="Daytona" w:hAnsi="Daytona"/>
-        </w:rPr>
-      </w:pPr>
-      <w:r>
-        <w:rPr>
-          <w:rFonts w:ascii="Daytona" w:hAnsi="Daytona"/>
-        </w:rPr>
-        <w:t xml:space="preserve">Los eventos del historial cuyos datos son los de la tabla hecha con </w:t>
-      </w:r>
-      <w:proofErr w:type="spellStart"/>
-      <w:r>
-        <w:rPr>
-          <w:rFonts w:ascii="Daytona" w:hAnsi="Daytona"/>
-        </w:rPr>
-        <w:t>Notion</w:t>
-      </w:r>
-      <w:proofErr w:type="spellEnd"/>
-      <w:r>
-        <w:rPr>
-          <w:rFonts w:ascii="Daytona" w:hAnsi="Daytona"/>
-        </w:rPr>
-        <w:t>. Las fechas vienen dadas, a excepto de los eventos musicales que son las reales.</w:t>
-      </w:r>
-    </w:p>
-    <w:p>
-      <w:pPr>
-        <w:rPr>
-          <w:rFonts w:ascii="Daytona" w:hAnsi="Daytona"/>
-        </w:rPr>
-      </w:pPr>
-      <w:r>
-        <w:rPr>
-          <w:rFonts w:ascii="Daytona" w:hAnsi="Daytona"/>
+        <w:jc w:val="both"/>
+        <w:rPr>
+          <w:rFonts w:ascii="Daytona" w:hAnsi="Daytona"/>
+        </w:rPr>
+      </w:pPr>
+      <w:r>
+        <w:rPr>
+          <w:rFonts w:ascii="Daytona" w:hAnsi="Daytona"/>
+        </w:rPr>
+        <w:t>Primero inserto los datos, de la tabla usuarios. Como había dicho anteriormente los usuarios, serán los profesores. El email y contraseñas son inventados.</w:t>
+      </w:r>
+    </w:p>
+    <w:p>
+      <w:pPr>
+        <w:jc w:val="both"/>
+        <w:rPr>
+          <w:rFonts w:ascii="Daytona" w:hAnsi="Daytona"/>
+        </w:rPr>
+      </w:pPr>
+    </w:p>
+    <w:p>
+      <w:pPr>
+        <w:pStyle w:val="Prrafodelista"/>
+        <w:numPr>
+          <w:ilvl w:val="0"/>
+          <w:numId w:val="3"/>
+        </w:numPr>
+        <w:jc w:val="both"/>
+        <w:rPr>
+          <w:rFonts w:ascii="Daytona" w:hAnsi="Daytona"/>
+          <w:u w:val="single"/>
+        </w:rPr>
+      </w:pPr>
+      <w:r>
+        <w:rPr>
+          <w:rFonts w:ascii="Daytona" w:hAnsi="Daytona"/>
+          <w:u w:val="single"/>
         </w:rPr>
         <w:lastRenderedPageBreak/>
+        <w:t>EVENTOS</w:t>
+      </w:r>
+    </w:p>
+    <w:p>
+      <w:pPr>
+        <w:jc w:val="both"/>
+        <w:rPr>
+          <w:rFonts w:ascii="Daytona" w:hAnsi="Daytona"/>
+        </w:rPr>
+      </w:pPr>
+      <w:r>
+        <w:rPr>
+          <w:rFonts w:ascii="Daytona" w:hAnsi="Daytona"/>
+          <w:noProof/>
+        </w:rPr>
         <w:drawing>
-          <wp:inline distT="0" distB="0" distL="0" distR="0" wp14:anchorId="55EC19A1" wp14:editId="24AC5134">
-            <wp:extent cx="5549202" cy="2556000"/>
-            <wp:effectExtent l="0" t="0" r="0" b="0"/>
-            <wp:docPr id="35" name="Imagen 35"/>
+          <wp:inline distT="0" distB="0" distL="0" distR="0" wp14:anchorId="5A7D054D" wp14:editId="43E9FD26">
+            <wp:extent cx="3693420" cy="2592000"/>
+            <wp:effectExtent l="0" t="0" r="2540" b="0"/>
+            <wp:docPr id="34" name="Imagen 34"/>
             <wp:cNvGraphicFramePr>
               <a:graphicFrameLocks xmlns:a="http://schemas.openxmlformats.org/drawingml/2006/main" noChangeAspect="1"/>
             </wp:cNvGraphicFramePr>
@@ -7159,7 +7280,7 @@
                   <pic:spPr>
                     <a:xfrm>
                       <a:off x="0" y="0"/>
-                      <a:ext cx="5549202" cy="2556000"/>
+                      <a:ext cx="3693420" cy="2592000"/>
                     </a:xfrm>
                     <a:prstGeom prst="rect">
                       <a:avLst/>
@@ -7174,52 +7295,49 @@
     </w:p>
     <w:p>
       <w:pPr>
-        <w:rPr>
-          <w:rFonts w:ascii="Daytona" w:hAnsi="Daytona"/>
-        </w:rPr>
-      </w:pPr>
-      <w:r>
-        <w:rPr>
-          <w:rFonts w:ascii="Daytona" w:hAnsi="Daytona"/>
-        </w:rPr>
-        <w:t>Lo mismo con los eventos futuros, la inserción acaba con un “;”</w:t>
-      </w:r>
-    </w:p>
-    <w:p>
-      <w:pPr>
-        <w:pStyle w:val="Prrafodelista"/>
-        <w:numPr>
-          <w:ilvl w:val="0"/>
-          <w:numId w:val="3"/>
-        </w:numPr>
-        <w:rPr>
-          <w:rFonts w:ascii="Daytona" w:hAnsi="Daytona"/>
-          <w:u w:val="single"/>
-        </w:rPr>
-      </w:pPr>
-      <w:r>
-        <w:rPr>
-          <w:rFonts w:ascii="Daytona" w:hAnsi="Daytona"/>
-          <w:u w:val="single"/>
-        </w:rPr>
-        <w:t>GALERIAS</w:t>
-      </w:r>
-    </w:p>
-    <w:p>
-      <w:pPr>
-        <w:rPr>
-          <w:rFonts w:ascii="Daytona" w:hAnsi="Daytona"/>
-        </w:rPr>
-      </w:pPr>
-      <w:r>
-        <w:rPr>
-          <w:rFonts w:ascii="Daytona" w:hAnsi="Daytona"/>
+        <w:jc w:val="both"/>
+        <w:rPr>
+          <w:rFonts w:ascii="Daytona" w:hAnsi="Daytona"/>
+        </w:rPr>
+      </w:pPr>
+      <w:r>
+        <w:rPr>
+          <w:rFonts w:ascii="Daytona" w:hAnsi="Daytona"/>
+        </w:rPr>
+        <w:t xml:space="preserve">Los eventos del historial cuyos datos son los de la tabla hecha con </w:t>
+      </w:r>
+      <w:proofErr w:type="spellStart"/>
+      <w:r>
+        <w:rPr>
+          <w:rFonts w:ascii="Daytona" w:hAnsi="Daytona"/>
+        </w:rPr>
+        <w:t>Notion</w:t>
+      </w:r>
+      <w:proofErr w:type="spellEnd"/>
+      <w:r>
+        <w:rPr>
+          <w:rFonts w:ascii="Daytona" w:hAnsi="Daytona"/>
+        </w:rPr>
+        <w:t>. Las fechas vienen dadas, a excepto de los eventos musicales que son las reales.</w:t>
+      </w:r>
+    </w:p>
+    <w:p>
+      <w:pPr>
+        <w:jc w:val="both"/>
+        <w:rPr>
+          <w:rFonts w:ascii="Daytona" w:hAnsi="Daytona"/>
+        </w:rPr>
+      </w:pPr>
+      <w:r>
+        <w:rPr>
+          <w:rFonts w:ascii="Daytona" w:hAnsi="Daytona"/>
+          <w:noProof/>
         </w:rPr>
         <w:drawing>
-          <wp:inline distT="0" distB="0" distL="0" distR="0" wp14:anchorId="46126DEE" wp14:editId="4D8F33F9">
-            <wp:extent cx="3209517" cy="1008000"/>
-            <wp:effectExtent l="0" t="0" r="0" b="1905"/>
-            <wp:docPr id="36" name="Imagen 36"/>
+          <wp:inline distT="0" distB="0" distL="0" distR="0" wp14:anchorId="55EC19A1" wp14:editId="24AC5134">
+            <wp:extent cx="5549202" cy="2556000"/>
+            <wp:effectExtent l="0" t="0" r="0" b="0"/>
+            <wp:docPr id="35" name="Imagen 35"/>
             <wp:cNvGraphicFramePr>
               <a:graphicFrameLocks xmlns:a="http://schemas.openxmlformats.org/drawingml/2006/main" noChangeAspect="1"/>
             </wp:cNvGraphicFramePr>
@@ -7239,7 +7357,7 @@
                   <pic:spPr>
                     <a:xfrm>
                       <a:off x="0" y="0"/>
-                      <a:ext cx="3209517" cy="1008000"/>
+                      <a:ext cx="5549202" cy="2556000"/>
                     </a:xfrm>
                     <a:prstGeom prst="rect">
                       <a:avLst/>
@@ -7254,29 +7372,16 @@
     </w:p>
     <w:p>
       <w:pPr>
-        <w:rPr>
-          <w:rFonts w:ascii="Daytona" w:hAnsi="Daytona"/>
-        </w:rPr>
-      </w:pPr>
-      <w:r>
-        <w:rPr>
-          <w:rFonts w:ascii="Daytona" w:hAnsi="Daytona"/>
-        </w:rPr>
-        <w:t xml:space="preserve">El </w:t>
-      </w:r>
-      <w:proofErr w:type="spellStart"/>
-      <w:r>
-        <w:rPr>
-          <w:rFonts w:ascii="Daytona" w:hAnsi="Daytona"/>
-        </w:rPr>
-        <w:t>identifcador</w:t>
-      </w:r>
-      <w:proofErr w:type="spellEnd"/>
-      <w:r>
-        <w:rPr>
-          <w:rFonts w:ascii="Daytona" w:hAnsi="Daytona"/>
-        </w:rPr>
-        <w:t xml:space="preserve"> del evento, al ser autonumérico va en orden de inserción de datos en la tabla eventos. Así que como hemos introducido primeros los eventos del historial, han recibido los id 1,2,3 y 4. Distribuidos de la manera que se ve en la imagen.</w:t>
+        <w:jc w:val="both"/>
+        <w:rPr>
+          <w:rFonts w:ascii="Daytona" w:hAnsi="Daytona"/>
+        </w:rPr>
+      </w:pPr>
+      <w:r>
+        <w:rPr>
+          <w:rFonts w:ascii="Daytona" w:hAnsi="Daytona"/>
+        </w:rPr>
+        <w:t>Lo mismo con los eventos futuros, la inserción acaba con un “;”</w:t>
       </w:r>
     </w:p>
     <w:p>
@@ -7286,6 +7391,7 @@
           <w:ilvl w:val="0"/>
           <w:numId w:val="3"/>
         </w:numPr>
+        <w:jc w:val="both"/>
         <w:rPr>
           <w:rFonts w:ascii="Daytona" w:hAnsi="Daytona"/>
           <w:u w:val="single"/>
@@ -7296,38 +7402,26 @@
           <w:rFonts w:ascii="Daytona" w:hAnsi="Daytona"/>
           <w:u w:val="single"/>
         </w:rPr>
-        <w:t>IM</w:t>
-      </w:r>
-      <w:r>
-        <w:rPr>
-          <w:rFonts w:ascii="Daytona" w:hAnsi="Daytona"/>
-          <w:u w:val="single"/>
-        </w:rPr>
-        <w:t>A</w:t>
-      </w:r>
-      <w:r>
-        <w:rPr>
-          <w:rFonts w:ascii="Daytona" w:hAnsi="Daytona"/>
-          <w:u w:val="single"/>
-        </w:rPr>
-        <w:t>GENES GALERIA</w:t>
-      </w:r>
-    </w:p>
-    <w:p>
-      <w:pPr>
-        <w:rPr>
-          <w:rFonts w:ascii="Daytona" w:hAnsi="Daytona"/>
-        </w:rPr>
-      </w:pPr>
-      <w:r>
-        <w:rPr>
-          <w:rFonts w:ascii="Daytona" w:hAnsi="Daytona"/>
+        <w:t>GALERIAS</w:t>
+      </w:r>
+    </w:p>
+    <w:p>
+      <w:pPr>
+        <w:jc w:val="both"/>
+        <w:rPr>
+          <w:rFonts w:ascii="Daytona" w:hAnsi="Daytona"/>
+        </w:rPr>
+      </w:pPr>
+      <w:r>
+        <w:rPr>
+          <w:rFonts w:ascii="Daytona" w:hAnsi="Daytona"/>
+          <w:noProof/>
         </w:rPr>
         <w:drawing>
-          <wp:inline distT="0" distB="0" distL="0" distR="0" wp14:anchorId="041E8DB3" wp14:editId="6DC6514D">
-            <wp:extent cx="5400040" cy="2278380"/>
-            <wp:effectExtent l="0" t="0" r="0" b="7620"/>
-            <wp:docPr id="37" name="Imagen 37"/>
+          <wp:inline distT="0" distB="0" distL="0" distR="0" wp14:anchorId="46126DEE" wp14:editId="4D8F33F9">
+            <wp:extent cx="3209517" cy="1008000"/>
+            <wp:effectExtent l="0" t="0" r="0" b="1905"/>
+            <wp:docPr id="36" name="Imagen 36"/>
             <wp:cNvGraphicFramePr>
               <a:graphicFrameLocks xmlns:a="http://schemas.openxmlformats.org/drawingml/2006/main" noChangeAspect="1"/>
             </wp:cNvGraphicFramePr>
@@ -7347,7 +7441,7 @@
                   <pic:spPr>
                     <a:xfrm>
                       <a:off x="0" y="0"/>
-                      <a:ext cx="5400040" cy="2278380"/>
+                      <a:ext cx="3209517" cy="1008000"/>
                     </a:xfrm>
                     <a:prstGeom prst="rect">
                       <a:avLst/>
@@ -7362,20 +7456,83 @@
     </w:p>
     <w:p>
       <w:pPr>
-        <w:rPr>
-          <w:rFonts w:ascii="Daytona" w:hAnsi="Daytona"/>
-        </w:rPr>
-      </w:pPr>
-      <w:r>
-        <w:rPr>
-          <w:rFonts w:ascii="Daytona" w:hAnsi="Daytona"/>
+        <w:jc w:val="both"/>
+        <w:rPr>
+          <w:rFonts w:ascii="Daytona" w:hAnsi="Daytona"/>
+        </w:rPr>
+      </w:pPr>
+      <w:r>
+        <w:rPr>
+          <w:rFonts w:ascii="Daytona" w:hAnsi="Daytona"/>
+        </w:rPr>
+        <w:t>El identif</w:t>
+      </w:r>
+      <w:r>
+        <w:rPr>
+          <w:rFonts w:ascii="Daytona" w:hAnsi="Daytona"/>
+        </w:rPr>
+        <w:t>i</w:t>
+      </w:r>
+      <w:r>
+        <w:rPr>
+          <w:rFonts w:ascii="Daytona" w:hAnsi="Daytona"/>
+        </w:rPr>
+        <w:t>cador del evento, al ser autonumérico va en orden de inserción de datos en la tabla eventos. Así que como hemos introducido primeros los eventos del historial, han recibido los id 1,2,3 y 4. Distribuidos de la manera que se ve en la imagen.</w:t>
+      </w:r>
+    </w:p>
+    <w:p>
+      <w:pPr>
+        <w:pStyle w:val="Prrafodelista"/>
+        <w:numPr>
+          <w:ilvl w:val="0"/>
+          <w:numId w:val="3"/>
+        </w:numPr>
+        <w:jc w:val="both"/>
+        <w:rPr>
+          <w:rFonts w:ascii="Daytona" w:hAnsi="Daytona"/>
+          <w:u w:val="single"/>
+        </w:rPr>
+      </w:pPr>
+      <w:r>
+        <w:rPr>
+          <w:rFonts w:ascii="Daytona" w:hAnsi="Daytona"/>
+          <w:u w:val="single"/>
         </w:rPr>
         <w:lastRenderedPageBreak/>
+        <w:t>IM</w:t>
+      </w:r>
+      <w:r>
+        <w:rPr>
+          <w:rFonts w:ascii="Daytona" w:hAnsi="Daytona"/>
+          <w:u w:val="single"/>
+        </w:rPr>
+        <w:t>A</w:t>
+      </w:r>
+      <w:r>
+        <w:rPr>
+          <w:rFonts w:ascii="Daytona" w:hAnsi="Daytona"/>
+          <w:u w:val="single"/>
+        </w:rPr>
+        <w:t>GENES GALERIA</w:t>
+      </w:r>
+    </w:p>
+    <w:p>
+      <w:pPr>
+        <w:jc w:val="both"/>
+        <w:rPr>
+          <w:rFonts w:ascii="Daytona" w:hAnsi="Daytona"/>
+        </w:rPr>
+      </w:pPr>
+      <w:r>
+        <w:rPr>
+          <w:rFonts w:ascii="Daytona" w:hAnsi="Daytona"/>
+          <w:noProof/>
+        </w:rPr>
         <w:drawing>
-          <wp:inline distT="0" distB="0" distL="0" distR="0" wp14:anchorId="78EFC3C5" wp14:editId="49109426">
-            <wp:extent cx="5400040" cy="2328545"/>
-            <wp:effectExtent l="0" t="0" r="0" b="0"/>
-            <wp:docPr id="38" name="Imagen 38"/>
+          <wp:inline distT="0" distB="0" distL="0" distR="0" wp14:anchorId="041E8DB3" wp14:editId="6DC6514D">
+            <wp:extent cx="5400040" cy="2278380"/>
+            <wp:effectExtent l="0" t="0" r="0" b="7620"/>
+            <wp:docPr id="37" name="Imagen 37"/>
             <wp:cNvGraphicFramePr>
               <a:graphicFrameLocks xmlns:a="http://schemas.openxmlformats.org/drawingml/2006/main" noChangeAspect="1"/>
             </wp:cNvGraphicFramePr>
@@ -7395,7 +7552,7 @@
                   <pic:spPr>
                     <a:xfrm>
                       <a:off x="0" y="0"/>
-                      <a:ext cx="5400040" cy="2328545"/>
+                      <a:ext cx="5400040" cy="2278380"/>
                     </a:xfrm>
                     <a:prstGeom prst="rect">
                       <a:avLst/>
@@ -7410,126 +7567,21 @@
     </w:p>
     <w:p>
       <w:pPr>
-        <w:rPr>
-          <w:rFonts w:ascii="Daytona" w:hAnsi="Daytona"/>
-        </w:rPr>
-      </w:pPr>
-      <w:r>
-        <w:rPr>
-          <w:rFonts w:ascii="Daytona" w:hAnsi="Daytona"/>
-        </w:rPr>
-        <w:t xml:space="preserve">Hay que introducir una descripción/nombre de la imagen, el </w:t>
-      </w:r>
-      <w:proofErr w:type="spellStart"/>
-      <w:r>
-        <w:rPr>
-          <w:rFonts w:ascii="Daytona" w:hAnsi="Daytona"/>
-        </w:rPr>
-        <w:t>path</w:t>
-      </w:r>
-      <w:proofErr w:type="spellEnd"/>
-      <w:r>
-        <w:rPr>
-          <w:rFonts w:ascii="Daytona" w:hAnsi="Daytona"/>
-        </w:rPr>
-        <w:t xml:space="preserve"> de la imagen y el id de la galería a la que corresponde esa imagen. Nuevamente, el id de cada galería se rige por el orden de inserción de las galerías en la tabla galerías. Por lo que coincide con el id de la tabla eventos. El </w:t>
-      </w:r>
-      <w:proofErr w:type="spellStart"/>
-      <w:r>
-        <w:rPr>
-          <w:rFonts w:ascii="Daytona" w:hAnsi="Daytona"/>
-        </w:rPr>
-        <w:t>path</w:t>
-      </w:r>
-      <w:proofErr w:type="spellEnd"/>
-      <w:r>
-        <w:rPr>
-          <w:rFonts w:ascii="Daytona" w:hAnsi="Daytona"/>
-        </w:rPr>
-        <w:t xml:space="preserve"> empieza en </w:t>
-      </w:r>
-      <w:proofErr w:type="spellStart"/>
-      <w:r>
-        <w:rPr>
-          <w:rFonts w:ascii="Daytona" w:hAnsi="Daytona"/>
-        </w:rPr>
-        <w:t>assets</w:t>
-      </w:r>
-      <w:proofErr w:type="spellEnd"/>
-      <w:r>
-        <w:rPr>
-          <w:rFonts w:ascii="Daytona" w:hAnsi="Daytona"/>
-        </w:rPr>
-        <w:t>/</w:t>
-      </w:r>
-      <w:r>
-        <w:rPr>
-          <w:rFonts w:ascii="Daytona" w:hAnsi="Daytona"/>
-        </w:rPr>
-        <w:t xml:space="preserve"> porque </w:t>
-      </w:r>
-      <w:r>
-        <w:rPr>
-          <w:rFonts w:ascii="Daytona" w:hAnsi="Daytona"/>
-        </w:rPr>
-        <w:t xml:space="preserve">es la ruta que usará HTML para buscar las imágenes y los </w:t>
-      </w:r>
-      <w:proofErr w:type="spellStart"/>
-      <w:r>
-        <w:rPr>
-          <w:rFonts w:ascii="Daytona" w:hAnsi="Daytona"/>
-        </w:rPr>
-        <w:t>html</w:t>
-      </w:r>
-      <w:proofErr w:type="spellEnd"/>
-      <w:r>
-        <w:rPr>
-          <w:rFonts w:ascii="Daytona" w:hAnsi="Daytona"/>
-        </w:rPr>
-        <w:t xml:space="preserve"> están situados dentro de la carpeta lenguaje-de-marcas. Por eso la ruta comienza ahí</w:t>
-      </w:r>
-      <w:r>
-        <w:rPr>
-          <w:rFonts w:ascii="Daytona" w:hAnsi="Daytona"/>
-        </w:rPr>
-        <w:t>.</w:t>
-      </w:r>
-    </w:p>
-    <w:p>
-      <w:pPr>
-        <w:pStyle w:val="Prrafodelista"/>
-        <w:numPr>
-          <w:ilvl w:val="0"/>
-          <w:numId w:val="3"/>
-        </w:numPr>
-        <w:rPr>
-          <w:rFonts w:ascii="Daytona" w:hAnsi="Daytona"/>
-          <w:u w:val="single"/>
-        </w:rPr>
-      </w:pPr>
-      <w:r>
-        <w:rPr>
-          <w:rFonts w:ascii="Daytona" w:hAnsi="Daytona"/>
-          <w:u w:val="single"/>
-        </w:rPr>
-        <w:t>FAVORITOS</w:t>
-      </w:r>
-    </w:p>
-    <w:p>
-      <w:pPr>
-        <w:rPr>
-          <w:rFonts w:ascii="Daytona" w:hAnsi="Daytona"/>
-        </w:rPr>
-      </w:pPr>
-      <w:r>
-        <w:rPr>
-          <w:rFonts w:ascii="Daytona" w:hAnsi="Daytona"/>
+        <w:jc w:val="both"/>
+        <w:rPr>
+          <w:rFonts w:ascii="Daytona" w:hAnsi="Daytona"/>
+        </w:rPr>
+      </w:pPr>
+      <w:r>
+        <w:rPr>
+          <w:rFonts w:ascii="Daytona" w:hAnsi="Daytona"/>
+          <w:noProof/>
         </w:rPr>
         <w:drawing>
-          <wp:inline distT="0" distB="0" distL="0" distR="0" wp14:anchorId="31CC6ADE" wp14:editId="171CDB47">
-            <wp:extent cx="3855576" cy="2592000"/>
+          <wp:inline distT="0" distB="0" distL="0" distR="0" wp14:anchorId="78EFC3C5" wp14:editId="49109426">
+            <wp:extent cx="5400040" cy="2328545"/>
             <wp:effectExtent l="0" t="0" r="0" b="0"/>
-            <wp:docPr id="39" name="Imagen 39"/>
+            <wp:docPr id="38" name="Imagen 38"/>
             <wp:cNvGraphicFramePr>
               <a:graphicFrameLocks xmlns:a="http://schemas.openxmlformats.org/drawingml/2006/main" noChangeAspect="1"/>
             </wp:cNvGraphicFramePr>
@@ -7549,7 +7601,7 @@
                   <pic:spPr>
                     <a:xfrm>
                       <a:off x="0" y="0"/>
-                      <a:ext cx="3855576" cy="2592000"/>
+                      <a:ext cx="5400040" cy="2328545"/>
                     </a:xfrm>
                     <a:prstGeom prst="rect">
                       <a:avLst/>
@@ -7564,24 +7616,85 @@
     </w:p>
     <w:p>
       <w:pPr>
-        <w:rPr>
-          <w:rFonts w:ascii="Daytona" w:hAnsi="Daytona"/>
-        </w:rPr>
-      </w:pPr>
-      <w:r>
-        <w:rPr>
-          <w:rFonts w:ascii="Daytona" w:hAnsi="Daytona"/>
-        </w:rPr>
-        <w:t xml:space="preserve">Los id de usuario una vez más se asignan en el orden de inserción de los usuarios por lo que Johnny tiene el 1, Delio el 2 y el Mario el 3. Y simplemente en esta tabla los relacionamos con sus eventos favoritos, que ya estaban escogidos y esos eventos los referenciamos con </w:t>
-      </w:r>
-      <w:proofErr w:type="spellStart"/>
-      <w:r>
-        <w:rPr>
-          <w:rFonts w:ascii="Daytona" w:hAnsi="Daytona"/>
-        </w:rPr>
-        <w:t>id_evento</w:t>
-      </w:r>
-      <w:proofErr w:type="spellEnd"/>
+        <w:jc w:val="both"/>
+        <w:rPr>
+          <w:rFonts w:ascii="Daytona" w:hAnsi="Daytona"/>
+        </w:rPr>
+      </w:pPr>
+      <w:r>
+        <w:rPr>
+          <w:rFonts w:ascii="Daytona" w:hAnsi="Daytona"/>
+        </w:rPr>
+        <w:t xml:space="preserve">Hay que introducir una descripción/nombre de la imagen, el </w:t>
+      </w:r>
+      <w:proofErr w:type="spellStart"/>
+      <w:r>
+        <w:rPr>
+          <w:rFonts w:ascii="Daytona" w:hAnsi="Daytona"/>
+        </w:rPr>
+        <w:t>path</w:t>
+      </w:r>
+      <w:proofErr w:type="spellEnd"/>
+      <w:r>
+        <w:rPr>
+          <w:rFonts w:ascii="Daytona" w:hAnsi="Daytona"/>
+        </w:rPr>
+        <w:t xml:space="preserve"> de la imagen y el id de la galería a la que corresponde esa imagen. Nuevamente, el id de cada galería se rige por el orden de inserción de las galerías en la tabla galerías. Por lo que coincide con el id de la tabla eventos. El </w:t>
+      </w:r>
+      <w:proofErr w:type="spellStart"/>
+      <w:r>
+        <w:rPr>
+          <w:rFonts w:ascii="Daytona" w:hAnsi="Daytona"/>
+        </w:rPr>
+        <w:t>path</w:t>
+      </w:r>
+      <w:proofErr w:type="spellEnd"/>
+      <w:r>
+        <w:rPr>
+          <w:rFonts w:ascii="Daytona" w:hAnsi="Daytona"/>
+        </w:rPr>
+        <w:t xml:space="preserve"> empieza en </w:t>
+      </w:r>
+      <w:proofErr w:type="spellStart"/>
+      <w:r>
+        <w:rPr>
+          <w:rFonts w:ascii="Daytona" w:hAnsi="Daytona"/>
+        </w:rPr>
+        <w:t>assets</w:t>
+      </w:r>
+      <w:proofErr w:type="spellEnd"/>
+      <w:r>
+        <w:rPr>
+          <w:rFonts w:ascii="Daytona" w:hAnsi="Daytona"/>
+        </w:rPr>
+        <w:t>/</w:t>
+      </w:r>
+      <w:r>
+        <w:rPr>
+          <w:rFonts w:ascii="Daytona" w:hAnsi="Daytona"/>
+        </w:rPr>
+        <w:t xml:space="preserve"> porque </w:t>
+      </w:r>
+      <w:r>
+        <w:rPr>
+          <w:rFonts w:ascii="Daytona" w:hAnsi="Daytona"/>
+        </w:rPr>
+        <w:t xml:space="preserve">es la ruta que usará HTML para buscar las imágenes y los </w:t>
+      </w:r>
+      <w:proofErr w:type="spellStart"/>
+      <w:r>
+        <w:rPr>
+          <w:rFonts w:ascii="Daytona" w:hAnsi="Daytona"/>
+        </w:rPr>
+        <w:t>html</w:t>
+      </w:r>
+      <w:proofErr w:type="spellEnd"/>
+      <w:r>
+        <w:rPr>
+          <w:rFonts w:ascii="Daytona" w:hAnsi="Daytona"/>
+        </w:rPr>
+        <w:t xml:space="preserve"> están situados dentro de la carpeta lenguaje-de-marcas. Por eso la ruta comienza ahí</w:t>
+      </w:r>
       <w:r>
         <w:rPr>
           <w:rFonts w:ascii="Daytona" w:hAnsi="Daytona"/>
@@ -7591,33 +7704,12 @@
     </w:p>
     <w:p>
       <w:pPr>
-        <w:rPr>
-          <w:rFonts w:ascii="Daytona" w:hAnsi="Daytona"/>
-        </w:rPr>
-      </w:pPr>
-      <w:r>
-        <w:rPr>
-          <w:rFonts w:ascii="Daytona" w:hAnsi="Daytona"/>
-        </w:rPr>
-        <w:t>Por último hacemos las vistas.</w:t>
-      </w:r>
-    </w:p>
-    <w:p>
-      <w:pPr>
-        <w:rPr>
-          <w:rFonts w:ascii="Daytona" w:hAnsi="Daytona"/>
-        </w:rPr>
-      </w:pPr>
-    </w:p>
-    <w:p>
-      <w:pPr>
-        <w:rPr>
-          <w:rFonts w:ascii="Daytona" w:hAnsi="Daytona"/>
-        </w:rPr>
-      </w:pPr>
-    </w:p>
-    <w:p>
-      <w:pPr>
+        <w:pStyle w:val="Prrafodelista"/>
+        <w:numPr>
+          <w:ilvl w:val="0"/>
+          <w:numId w:val="3"/>
+        </w:numPr>
+        <w:jc w:val="both"/>
         <w:rPr>
           <w:rFonts w:ascii="Daytona" w:hAnsi="Daytona"/>
           <w:u w:val="single"/>
@@ -7628,27 +7720,26 @@
           <w:rFonts w:ascii="Daytona" w:hAnsi="Daytona"/>
           <w:u w:val="single"/>
         </w:rPr>
-        <w:lastRenderedPageBreak/>
-        <w:t>VISTA 1</w:t>
-      </w:r>
-    </w:p>
-    <w:p>
-      <w:pPr>
-        <w:rPr>
-          <w:rFonts w:ascii="Daytona" w:hAnsi="Daytona"/>
-          <w:u w:val="single"/>
-        </w:rPr>
-      </w:pPr>
-      <w:r>
-        <w:rPr>
-          <w:rFonts w:ascii="Daytona" w:hAnsi="Daytona"/>
-          <w:u w:val="single"/>
+        <w:t>FAVORITOS</w:t>
+      </w:r>
+    </w:p>
+    <w:p>
+      <w:pPr>
+        <w:jc w:val="both"/>
+        <w:rPr>
+          <w:rFonts w:ascii="Daytona" w:hAnsi="Daytona"/>
+        </w:rPr>
+      </w:pPr>
+      <w:r>
+        <w:rPr>
+          <w:rFonts w:ascii="Daytona" w:hAnsi="Daytona"/>
+          <w:noProof/>
         </w:rPr>
         <w:drawing>
-          <wp:inline distT="0" distB="0" distL="0" distR="0" wp14:anchorId="04A1E838" wp14:editId="41A67BA9">
-            <wp:extent cx="5400040" cy="1783080"/>
-            <wp:effectExtent l="0" t="0" r="0" b="7620"/>
-            <wp:docPr id="40" name="Imagen 40"/>
+          <wp:inline distT="0" distB="0" distL="0" distR="0" wp14:anchorId="31CC6ADE" wp14:editId="780A91AF">
+            <wp:extent cx="2998776" cy="2016000"/>
+            <wp:effectExtent l="0" t="0" r="0" b="3810"/>
+            <wp:docPr id="39" name="Imagen 39"/>
             <wp:cNvGraphicFramePr>
               <a:graphicFrameLocks xmlns:a="http://schemas.openxmlformats.org/drawingml/2006/main" noChangeAspect="1"/>
             </wp:cNvGraphicFramePr>
@@ -7668,7 +7759,7 @@
                   <pic:spPr>
                     <a:xfrm>
                       <a:off x="0" y="0"/>
-                      <a:ext cx="5400040" cy="1783080"/>
+                      <a:ext cx="2998776" cy="2016000"/>
                     </a:xfrm>
                     <a:prstGeom prst="rect">
                       <a:avLst/>
@@ -7683,6 +7774,117 @@
     </w:p>
     <w:p>
       <w:pPr>
+        <w:jc w:val="both"/>
+        <w:rPr>
+          <w:rFonts w:ascii="Daytona" w:hAnsi="Daytona"/>
+        </w:rPr>
+      </w:pPr>
+      <w:r>
+        <w:rPr>
+          <w:rFonts w:ascii="Daytona" w:hAnsi="Daytona"/>
+        </w:rPr>
+        <w:lastRenderedPageBreak/>
+        <w:t xml:space="preserve">Los id de usuario una vez más se asignan en el orden de inserción de los usuarios por lo que Johnny tiene el 1, Delio el 2 y el Mario el 3. Y simplemente en esta tabla los relacionamos con sus eventos favoritos, que ya estaban escogidos y esos eventos los referenciamos con </w:t>
+      </w:r>
+      <w:proofErr w:type="spellStart"/>
+      <w:r>
+        <w:rPr>
+          <w:rFonts w:ascii="Daytona" w:hAnsi="Daytona"/>
+        </w:rPr>
+        <w:t>id_evento</w:t>
+      </w:r>
+      <w:proofErr w:type="spellEnd"/>
+      <w:r>
+        <w:rPr>
+          <w:rFonts w:ascii="Daytona" w:hAnsi="Daytona"/>
+        </w:rPr>
+        <w:t>.</w:t>
+      </w:r>
+    </w:p>
+    <w:p>
+      <w:pPr>
+        <w:jc w:val="both"/>
+        <w:rPr>
+          <w:rFonts w:ascii="Daytona" w:hAnsi="Daytona"/>
+        </w:rPr>
+      </w:pPr>
+      <w:r>
+        <w:rPr>
+          <w:rFonts w:ascii="Daytona" w:hAnsi="Daytona"/>
+        </w:rPr>
+        <w:t>Por último hacemos las vistas.</w:t>
+      </w:r>
+    </w:p>
+    <w:p>
+      <w:pPr>
+        <w:jc w:val="both"/>
+        <w:rPr>
+          <w:rFonts w:ascii="Daytona" w:hAnsi="Daytona"/>
+          <w:u w:val="single"/>
+        </w:rPr>
+      </w:pPr>
+      <w:r>
+        <w:rPr>
+          <w:rFonts w:ascii="Daytona" w:hAnsi="Daytona"/>
+          <w:u w:val="single"/>
+        </w:rPr>
+        <w:t>VISTA 1</w:t>
+      </w:r>
+    </w:p>
+    <w:p>
+      <w:pPr>
+        <w:jc w:val="both"/>
+        <w:rPr>
+          <w:rFonts w:ascii="Daytona" w:hAnsi="Daytona"/>
+          <w:u w:val="single"/>
+        </w:rPr>
+      </w:pPr>
+      <w:r>
+        <w:rPr>
+          <w:rFonts w:ascii="Daytona" w:hAnsi="Daytona"/>
+          <w:noProof/>
+          <w:u w:val="single"/>
+        </w:rPr>
+        <w:drawing>
+          <wp:inline distT="0" distB="0" distL="0" distR="0" wp14:anchorId="04A1E838" wp14:editId="6988E12B">
+            <wp:extent cx="5778360" cy="1908000"/>
+            <wp:effectExtent l="0" t="0" r="0" b="0"/>
+            <wp:docPr id="40" name="Imagen 40"/>
+            <wp:cNvGraphicFramePr>
+              <a:graphicFrameLocks xmlns:a="http://schemas.openxmlformats.org/drawingml/2006/main" noChangeAspect="1"/>
+            </wp:cNvGraphicFramePr>
+            <a:graphic xmlns:a="http://schemas.openxmlformats.org/drawingml/2006/main">
+              <a:graphicData uri="http://schemas.openxmlformats.org/drawingml/2006/picture">
+                <pic:pic xmlns:pic="http://schemas.openxmlformats.org/drawingml/2006/picture">
+                  <pic:nvPicPr>
+                    <pic:cNvPr id="1" name=""/>
+                    <pic:cNvPicPr/>
+                  </pic:nvPicPr>
+                  <pic:blipFill>
+                    <a:blip r:embed="rId38"/>
+                    <a:stretch>
+                      <a:fillRect/>
+                    </a:stretch>
+                  </pic:blipFill>
+                  <pic:spPr>
+                    <a:xfrm>
+                      <a:off x="0" y="0"/>
+                      <a:ext cx="5778360" cy="1908000"/>
+                    </a:xfrm>
+                    <a:prstGeom prst="rect">
+                      <a:avLst/>
+                    </a:prstGeom>
+                  </pic:spPr>
+                </pic:pic>
+              </a:graphicData>
+            </a:graphic>
+          </wp:inline>
+        </w:drawing>
+      </w:r>
+    </w:p>
+    <w:p>
+      <w:pPr>
+        <w:jc w:val="both"/>
         <w:rPr>
           <w:rFonts w:ascii="Daytona" w:hAnsi="Daytona"/>
         </w:rPr>
@@ -7792,6 +7994,7 @@
     </w:p>
     <w:p>
       <w:pPr>
+        <w:jc w:val="both"/>
         <w:rPr>
           <w:rFonts w:ascii="Daytona" w:hAnsi="Daytona"/>
           <w:u w:val="single"/>
@@ -7839,7 +8042,7 @@
                     <pic:cNvPicPr/>
                   </pic:nvPicPr>
                   <pic:blipFill>
-                    <a:blip r:embed="rId38" cstate="print">
+                    <a:blip r:embed="rId39" cstate="print">
                       <a:extLst>
                         <a:ext uri="{28A0092B-C50C-407E-A947-70E740481C1C}">
                           <a14:useLocalDpi xmlns:a14="http://schemas.microsoft.com/office/drawing/2010/main" val="0"/>
@@ -7868,83 +8071,21 @@
     </w:p>
     <w:p>
       <w:pPr>
-        <w:rPr>
-          <w:rFonts w:ascii="Daytona" w:hAnsi="Daytona"/>
-        </w:rPr>
-      </w:pPr>
-      <w:r>
-        <w:rPr>
-          <w:rFonts w:ascii="Daytona" w:hAnsi="Daytona"/>
+        <w:jc w:val="both"/>
+        <w:rPr>
+          <w:rFonts w:ascii="Daytona" w:hAnsi="Daytona"/>
+        </w:rPr>
+      </w:pPr>
+      <w:r>
+        <w:rPr>
+          <w:rFonts w:ascii="Daytona" w:hAnsi="Daytona"/>
+          <w:noProof/>
         </w:rPr>
         <w:drawing>
-          <wp:inline distT="0" distB="0" distL="0" distR="0" wp14:anchorId="7720D2E0" wp14:editId="17847CF9">
-            <wp:extent cx="3653782" cy="1296000"/>
-            <wp:effectExtent l="0" t="0" r="4445" b="0"/>
+          <wp:inline distT="0" distB="0" distL="0" distR="0" wp14:anchorId="7720D2E0" wp14:editId="30EF4221">
+            <wp:extent cx="3856770" cy="1368000"/>
+            <wp:effectExtent l="0" t="0" r="0" b="3810"/>
             <wp:docPr id="42" name="Imagen 42"/>
-            <wp:cNvGraphicFramePr>
-              <a:graphicFrameLocks xmlns:a="http://schemas.openxmlformats.org/drawingml/2006/main" noChangeAspect="1"/>
-            </wp:cNvGraphicFramePr>
-            <a:graphic xmlns:a="http://schemas.openxmlformats.org/drawingml/2006/main">
-              <a:graphicData uri="http://schemas.openxmlformats.org/drawingml/2006/picture">
-                <pic:pic xmlns:pic="http://schemas.openxmlformats.org/drawingml/2006/picture">
-                  <pic:nvPicPr>
-                    <pic:cNvPr id="1" name=""/>
-                    <pic:cNvPicPr/>
-                  </pic:nvPicPr>
-                  <pic:blipFill>
-                    <a:blip r:embed="rId39"/>
-                    <a:stretch>
-                      <a:fillRect/>
-                    </a:stretch>
-                  </pic:blipFill>
-                  <pic:spPr>
-                    <a:xfrm>
-                      <a:off x="0" y="0"/>
-                      <a:ext cx="3653782" cy="1296000"/>
-                    </a:xfrm>
-                    <a:prstGeom prst="rect">
-                      <a:avLst/>
-                    </a:prstGeom>
-                  </pic:spPr>
-                </pic:pic>
-              </a:graphicData>
-            </a:graphic>
-          </wp:inline>
-        </w:drawing>
-      </w:r>
-    </w:p>
-    <w:p>
-      <w:pPr>
-        <w:rPr>
-          <w:rFonts w:ascii="Daytona" w:hAnsi="Daytona"/>
-          <w:u w:val="single"/>
-        </w:rPr>
-      </w:pPr>
-      <w:r>
-        <w:rPr>
-          <w:rFonts w:ascii="Daytona" w:hAnsi="Daytona"/>
-          <w:u w:val="single"/>
-        </w:rPr>
-        <w:t>VISTA 2</w:t>
-      </w:r>
-    </w:p>
-    <w:p>
-      <w:pPr>
-        <w:rPr>
-          <w:rFonts w:ascii="Daytona" w:hAnsi="Daytona"/>
-          <w:u w:val="single"/>
-        </w:rPr>
-      </w:pPr>
-      <w:r>
-        <w:rPr>
-          <w:rFonts w:ascii="Daytona" w:hAnsi="Daytona"/>
-          <w:u w:val="single"/>
-        </w:rPr>
-        <w:drawing>
-          <wp:inline distT="0" distB="0" distL="0" distR="0" wp14:anchorId="23D7D510" wp14:editId="4519DBEC">
-            <wp:extent cx="4841558" cy="1548000"/>
-            <wp:effectExtent l="0" t="0" r="0" b="0"/>
-            <wp:docPr id="43" name="Imagen 43"/>
             <wp:cNvGraphicFramePr>
               <a:graphicFrameLocks xmlns:a="http://schemas.openxmlformats.org/drawingml/2006/main" noChangeAspect="1"/>
             </wp:cNvGraphicFramePr>
@@ -7964,7 +8105,7 @@
                   <pic:spPr>
                     <a:xfrm>
                       <a:off x="0" y="0"/>
-                      <a:ext cx="4841558" cy="1548000"/>
+                      <a:ext cx="3856770" cy="1368000"/>
                     </a:xfrm>
                     <a:prstGeom prst="rect">
                       <a:avLst/>
@@ -7979,9 +8120,110 @@
     </w:p>
     <w:p>
       <w:pPr>
-        <w:ind w:left="0"/>
-        <w:rPr>
-          <w:rFonts w:ascii="Daytona" w:hAnsi="Daytona"/>
+        <w:jc w:val="both"/>
+        <w:rPr>
+          <w:rFonts w:ascii="Daytona" w:hAnsi="Daytona"/>
+        </w:rPr>
+      </w:pPr>
+    </w:p>
+    <w:p>
+      <w:pPr>
+        <w:jc w:val="both"/>
+        <w:rPr>
+          <w:rFonts w:ascii="Daytona" w:hAnsi="Daytona"/>
+        </w:rPr>
+      </w:pPr>
+    </w:p>
+    <w:p>
+      <w:pPr>
+        <w:jc w:val="both"/>
+        <w:rPr>
+          <w:rFonts w:ascii="Daytona" w:hAnsi="Daytona"/>
+        </w:rPr>
+      </w:pPr>
+    </w:p>
+    <w:p>
+      <w:pPr>
+        <w:jc w:val="both"/>
+        <w:rPr>
+          <w:rFonts w:ascii="Daytona" w:hAnsi="Daytona"/>
+        </w:rPr>
+      </w:pPr>
+    </w:p>
+    <w:p>
+      <w:pPr>
+        <w:jc w:val="both"/>
+        <w:rPr>
+          <w:rFonts w:ascii="Daytona" w:hAnsi="Daytona"/>
+          <w:u w:val="single"/>
+        </w:rPr>
+      </w:pPr>
+      <w:r>
+        <w:rPr>
+          <w:rFonts w:ascii="Daytona" w:hAnsi="Daytona"/>
+          <w:u w:val="single"/>
+        </w:rPr>
+        <w:lastRenderedPageBreak/>
+        <w:t>VISTA 2</w:t>
+      </w:r>
+    </w:p>
+    <w:p>
+      <w:pPr>
+        <w:jc w:val="both"/>
+        <w:rPr>
+          <w:rFonts w:ascii="Daytona" w:hAnsi="Daytona"/>
+          <w:u w:val="single"/>
+        </w:rPr>
+      </w:pPr>
+      <w:r>
+        <w:rPr>
+          <w:rFonts w:ascii="Daytona" w:hAnsi="Daytona"/>
+          <w:noProof/>
+          <w:u w:val="single"/>
+        </w:rPr>
+        <w:drawing>
+          <wp:inline distT="0" distB="0" distL="0" distR="0" wp14:anchorId="23D7D510" wp14:editId="16E7CAC0">
+            <wp:extent cx="4278588" cy="1368000"/>
+            <wp:effectExtent l="0" t="0" r="8255" b="3810"/>
+            <wp:docPr id="43" name="Imagen 43"/>
+            <wp:cNvGraphicFramePr>
+              <a:graphicFrameLocks xmlns:a="http://schemas.openxmlformats.org/drawingml/2006/main" noChangeAspect="1"/>
+            </wp:cNvGraphicFramePr>
+            <a:graphic xmlns:a="http://schemas.openxmlformats.org/drawingml/2006/main">
+              <a:graphicData uri="http://schemas.openxmlformats.org/drawingml/2006/picture">
+                <pic:pic xmlns:pic="http://schemas.openxmlformats.org/drawingml/2006/picture">
+                  <pic:nvPicPr>
+                    <pic:cNvPr id="1" name=""/>
+                    <pic:cNvPicPr/>
+                  </pic:nvPicPr>
+                  <pic:blipFill>
+                    <a:blip r:embed="rId41"/>
+                    <a:stretch>
+                      <a:fillRect/>
+                    </a:stretch>
+                  </pic:blipFill>
+                  <pic:spPr>
+                    <a:xfrm>
+                      <a:off x="0" y="0"/>
+                      <a:ext cx="4278588" cy="1368000"/>
+                    </a:xfrm>
+                    <a:prstGeom prst="rect">
+                      <a:avLst/>
+                    </a:prstGeom>
+                  </pic:spPr>
+                </pic:pic>
+              </a:graphicData>
+            </a:graphic>
+          </wp:inline>
+        </w:drawing>
+      </w:r>
+    </w:p>
+    <w:p>
+      <w:pPr>
+        <w:jc w:val="both"/>
+        <w:rPr>
+          <w:rFonts w:ascii="Daytona" w:hAnsi="Daytona"/>
+          <w:u w:val="single"/>
         </w:rPr>
       </w:pPr>
       <w:r>
@@ -8002,14 +8244,7 @@
         <w:rPr>
           <w:rFonts w:ascii="Daytona" w:hAnsi="Daytona"/>
         </w:rPr>
-        <w:t xml:space="preserve">. Así que mostramos todos los campos de la tabla eventos por el SELECT, necesitamos las tablas eventos y favoritos, </w:t>
-      </w:r>
-      <w:r>
-        <w:rPr>
-          <w:rFonts w:ascii="Daytona" w:hAnsi="Daytona"/>
-        </w:rPr>
-        <w:lastRenderedPageBreak/>
-        <w:t xml:space="preserve">eventos para mostrar sus campos y favoritos que contiene el </w:t>
+        <w:t xml:space="preserve">. Así que mostramos todos los campos de la tabla eventos por el SELECT, necesitamos las tablas eventos y favoritos, eventos para mostrar sus campos y favoritos que contiene el </w:t>
       </w:r>
       <w:proofErr w:type="spellStart"/>
       <w:r>
@@ -8042,23 +8277,21 @@
     </w:p>
     <w:p>
       <w:pPr>
-        <w:ind w:left="0"/>
+        <w:jc w:val="both"/>
+        <w:rPr>
+          <w:rFonts w:ascii="Daytona" w:hAnsi="Daytona"/>
+        </w:rPr>
+      </w:pPr>
+      <w:r>
         <w:rPr>
           <w:rFonts w:ascii="Daytona" w:hAnsi="Daytona"/>
           <w:u w:val="single"/>
         </w:rPr>
-      </w:pPr>
-      <w:r>
-        <w:rPr>
-          <w:rFonts w:ascii="Daytona" w:hAnsi="Daytona"/>
-          <w:u w:val="single"/>
-        </w:rPr>
         <w:t>OUTPUT:</w:t>
       </w:r>
       <w:r>
         <w:rPr>
           <w:rFonts w:ascii="Daytona" w:hAnsi="Daytona"/>
-          <w:u w:val="single"/>
         </w:rPr>
         <w:t xml:space="preserve"> </w:t>
       </w:r>
@@ -8083,7 +8316,7 @@
                     <pic:cNvPicPr/>
                   </pic:nvPicPr>
                   <pic:blipFill>
-                    <a:blip r:embed="rId38" cstate="print">
+                    <a:blip r:embed="rId39" cstate="print">
                       <a:extLst>
                         <a:ext uri="{28A0092B-C50C-407E-A947-70E740481C1C}">
                           <a14:useLocalDpi xmlns:a14="http://schemas.microsoft.com/office/drawing/2010/main" val="0"/>
@@ -8112,7 +8345,7 @@
     </w:p>
     <w:p>
       <w:pPr>
-        <w:ind w:left="0"/>
+        <w:jc w:val="both"/>
         <w:rPr>
           <w:rFonts w:ascii="Daytona" w:hAnsi="Daytona"/>
           <w:u w:val="single"/>
@@ -8121,79 +8354,13 @@
       <w:r>
         <w:rPr>
           <w:rFonts w:ascii="Daytona" w:hAnsi="Daytona"/>
-          <w:u w:val="single"/>
+          <w:noProof/>
         </w:rPr>
         <w:drawing>
           <wp:inline distT="0" distB="0" distL="0" distR="0" wp14:anchorId="7B7BBE22" wp14:editId="63024657">
             <wp:extent cx="5791202" cy="792000"/>
             <wp:effectExtent l="0" t="0" r="0" b="8255"/>
             <wp:docPr id="44" name="Imagen 44"/>
-            <wp:cNvGraphicFramePr>
-              <a:graphicFrameLocks xmlns:a="http://schemas.openxmlformats.org/drawingml/2006/main" noChangeAspect="1"/>
-            </wp:cNvGraphicFramePr>
-            <a:graphic xmlns:a="http://schemas.openxmlformats.org/drawingml/2006/main">
-              <a:graphicData uri="http://schemas.openxmlformats.org/drawingml/2006/picture">
-                <pic:pic xmlns:pic="http://schemas.openxmlformats.org/drawingml/2006/picture">
-                  <pic:nvPicPr>
-                    <pic:cNvPr id="1" name=""/>
-                    <pic:cNvPicPr/>
-                  </pic:nvPicPr>
-                  <pic:blipFill>
-                    <a:blip r:embed="rId41"/>
-                    <a:stretch>
-                      <a:fillRect/>
-                    </a:stretch>
-                  </pic:blipFill>
-                  <pic:spPr>
-                    <a:xfrm>
-                      <a:off x="0" y="0"/>
-                      <a:ext cx="5791202" cy="792000"/>
-                    </a:xfrm>
-                    <a:prstGeom prst="rect">
-                      <a:avLst/>
-                    </a:prstGeom>
-                  </pic:spPr>
-                </pic:pic>
-              </a:graphicData>
-            </a:graphic>
-          </wp:inline>
-        </w:drawing>
-      </w:r>
-    </w:p>
-    <w:p>
-      <w:pPr>
-        <w:ind w:left="0"/>
-        <w:rPr>
-          <w:rFonts w:ascii="Daytona" w:hAnsi="Daytona"/>
-          <w:u w:val="single"/>
-        </w:rPr>
-      </w:pPr>
-      <w:r>
-        <w:rPr>
-          <w:rFonts w:ascii="Daytona" w:hAnsi="Daytona"/>
-          <w:u w:val="single"/>
-        </w:rPr>
-        <w:t>VISTA 3</w:t>
-      </w:r>
-    </w:p>
-    <w:p>
-      <w:pPr>
-        <w:ind w:left="0"/>
-        <w:rPr>
-          <w:rFonts w:ascii="Daytona" w:hAnsi="Daytona"/>
-          <w:u w:val="single"/>
-        </w:rPr>
-      </w:pPr>
-      <w:r>
-        <w:rPr>
-          <w:rFonts w:ascii="Daytona" w:hAnsi="Daytona"/>
-          <w:u w:val="single"/>
-        </w:rPr>
-        <w:drawing>
-          <wp:inline distT="0" distB="0" distL="0" distR="0" wp14:anchorId="08D6F810" wp14:editId="11E76760">
-            <wp:extent cx="5400040" cy="1184910"/>
-            <wp:effectExtent l="0" t="0" r="0" b="0"/>
-            <wp:docPr id="45" name="Imagen 45"/>
             <wp:cNvGraphicFramePr>
               <a:graphicFrameLocks xmlns:a="http://schemas.openxmlformats.org/drawingml/2006/main" noChangeAspect="1"/>
             </wp:cNvGraphicFramePr>
@@ -8213,6 +8380,62 @@
                   <pic:spPr>
                     <a:xfrm>
                       <a:off x="0" y="0"/>
+                      <a:ext cx="5791202" cy="792000"/>
+                    </a:xfrm>
+                    <a:prstGeom prst="rect">
+                      <a:avLst/>
+                    </a:prstGeom>
+                  </pic:spPr>
+                </pic:pic>
+              </a:graphicData>
+            </a:graphic>
+          </wp:inline>
+        </w:drawing>
+      </w:r>
+      <w:r>
+        <w:rPr>
+          <w:rFonts w:ascii="Daytona" w:hAnsi="Daytona"/>
+          <w:u w:val="single"/>
+        </w:rPr>
+        <w:t>VISTA 3</w:t>
+      </w:r>
+    </w:p>
+    <w:p>
+      <w:pPr>
+        <w:jc w:val="both"/>
+        <w:rPr>
+          <w:rFonts w:ascii="Daytona" w:hAnsi="Daytona"/>
+        </w:rPr>
+      </w:pPr>
+      <w:r>
+        <w:rPr>
+          <w:rFonts w:ascii="Daytona" w:hAnsi="Daytona"/>
+          <w:noProof/>
+        </w:rPr>
+        <w:drawing>
+          <wp:inline distT="0" distB="0" distL="0" distR="0" wp14:anchorId="08D6F810" wp14:editId="11E76760">
+            <wp:extent cx="5400040" cy="1184910"/>
+            <wp:effectExtent l="0" t="0" r="0" b="0"/>
+            <wp:docPr id="45" name="Imagen 45"/>
+            <wp:cNvGraphicFramePr>
+              <a:graphicFrameLocks xmlns:a="http://schemas.openxmlformats.org/drawingml/2006/main" noChangeAspect="1"/>
+            </wp:cNvGraphicFramePr>
+            <a:graphic xmlns:a="http://schemas.openxmlformats.org/drawingml/2006/main">
+              <a:graphicData uri="http://schemas.openxmlformats.org/drawingml/2006/picture">
+                <pic:pic xmlns:pic="http://schemas.openxmlformats.org/drawingml/2006/picture">
+                  <pic:nvPicPr>
+                    <pic:cNvPr id="1" name=""/>
+                    <pic:cNvPicPr/>
+                  </pic:nvPicPr>
+                  <pic:blipFill>
+                    <a:blip r:embed="rId43"/>
+                    <a:stretch>
+                      <a:fillRect/>
+                    </a:stretch>
+                  </pic:blipFill>
+                  <pic:spPr>
+                    <a:xfrm>
+                      <a:off x="0" y="0"/>
                       <a:ext cx="5400040" cy="1184910"/>
                     </a:xfrm>
                     <a:prstGeom prst="rect">
@@ -8228,7 +8451,7 @@
     </w:p>
     <w:p>
       <w:pPr>
-        <w:ind w:left="0"/>
+        <w:jc w:val="both"/>
         <w:rPr>
           <w:rFonts w:ascii="Daytona" w:hAnsi="Daytona"/>
         </w:rPr>
@@ -8315,7 +8538,21 @@
         <w:rPr>
           <w:rFonts w:ascii="Daytona" w:hAnsi="Daytona"/>
         </w:rPr>
-        <w:t xml:space="preserve"> sino que esta en la tabla eventos, así que necesitaremos ambas tablas. En el WHERE igualamos el </w:t>
+        <w:t xml:space="preserve"> sino que </w:t>
+      </w:r>
+      <w:proofErr w:type="spellStart"/>
+      <w:r>
+        <w:rPr>
+          <w:rFonts w:ascii="Daytona" w:hAnsi="Daytona"/>
+        </w:rPr>
+        <w:t>esta</w:t>
+      </w:r>
+      <w:proofErr w:type="spellEnd"/>
+      <w:r>
+        <w:rPr>
+          <w:rFonts w:ascii="Daytona" w:hAnsi="Daytona"/>
+        </w:rPr>
+        <w:t xml:space="preserve"> en la tabla eventos, así que necesitaremos ambas tablas. En el WHERE igualamos el </w:t>
       </w:r>
       <w:proofErr w:type="spellStart"/>
       <w:r>
@@ -8334,7 +8571,7 @@
     </w:p>
     <w:p>
       <w:pPr>
-        <w:ind w:left="0"/>
+        <w:jc w:val="both"/>
         <w:rPr>
           <w:rFonts w:ascii="Daytona" w:hAnsi="Daytona"/>
           <w:u w:val="single"/>
@@ -8345,19 +8582,13 @@
           <w:rFonts w:ascii="Daytona" w:hAnsi="Daytona"/>
           <w:u w:val="single"/>
         </w:rPr>
-        <w:t>OUTPUT:</w:t>
-      </w:r>
-      <w:r>
-        <w:rPr>
-          <w:rFonts w:ascii="Daytona" w:hAnsi="Daytona"/>
+        <w:t xml:space="preserve">OUTPUT: </w:t>
+      </w:r>
+      <w:r>
+        <w:rPr>
+          <w:rFonts w:ascii="Daytona" w:hAnsi="Daytona"/>
+          <w:noProof/>
           <w:u w:val="single"/>
-        </w:rPr>
-        <w:t xml:space="preserve"> </w:t>
-      </w:r>
-      <w:r>
-        <w:rPr>
-          <w:rFonts w:ascii="Daytona" w:hAnsi="Daytona"/>
-          <w:noProof/>
         </w:rPr>
         <w:drawing>
           <wp:inline distT="0" distB="0" distL="0" distR="0" wp14:anchorId="5F4CA2AE" wp14:editId="1A09E8D8">
@@ -8375,7 +8606,7 @@
                     <pic:cNvPicPr/>
                   </pic:nvPicPr>
                   <pic:blipFill>
-                    <a:blip r:embed="rId38" cstate="print">
+                    <a:blip r:embed="rId39" cstate="print">
                       <a:extLst>
                         <a:ext uri="{28A0092B-C50C-407E-A947-70E740481C1C}">
                           <a14:useLocalDpi xmlns:a14="http://schemas.microsoft.com/office/drawing/2010/main" val="0"/>
@@ -8404,88 +8635,21 @@
     </w:p>
     <w:p>
       <w:pPr>
-        <w:ind w:left="0"/>
-        <w:rPr>
-          <w:rFonts w:ascii="Daytona" w:hAnsi="Daytona"/>
-          <w:u w:val="single"/>
-        </w:rPr>
-      </w:pPr>
-      <w:r>
-        <w:rPr>
-          <w:rFonts w:ascii="Daytona" w:hAnsi="Daytona"/>
-          <w:u w:val="single"/>
+        <w:jc w:val="both"/>
+        <w:rPr>
+          <w:rFonts w:ascii="Daytona" w:hAnsi="Daytona"/>
+        </w:rPr>
+      </w:pPr>
+      <w:r>
+        <w:rPr>
+          <w:rFonts w:ascii="Daytona" w:hAnsi="Daytona"/>
+          <w:noProof/>
         </w:rPr>
         <w:drawing>
-          <wp:inline distT="0" distB="0" distL="0" distR="0" wp14:anchorId="4547614A" wp14:editId="1581F12D">
-            <wp:extent cx="5400040" cy="1276350"/>
-            <wp:effectExtent l="0" t="0" r="0" b="0"/>
+          <wp:inline distT="0" distB="0" distL="0" distR="0" wp14:anchorId="4547614A" wp14:editId="13CCE7E2">
+            <wp:extent cx="4569317" cy="1080000"/>
+            <wp:effectExtent l="0" t="0" r="3175" b="6350"/>
             <wp:docPr id="46" name="Imagen 46"/>
-            <wp:cNvGraphicFramePr>
-              <a:graphicFrameLocks xmlns:a="http://schemas.openxmlformats.org/drawingml/2006/main" noChangeAspect="1"/>
-            </wp:cNvGraphicFramePr>
-            <a:graphic xmlns:a="http://schemas.openxmlformats.org/drawingml/2006/main">
-              <a:graphicData uri="http://schemas.openxmlformats.org/drawingml/2006/picture">
-                <pic:pic xmlns:pic="http://schemas.openxmlformats.org/drawingml/2006/picture">
-                  <pic:nvPicPr>
-                    <pic:cNvPr id="1" name=""/>
-                    <pic:cNvPicPr/>
-                  </pic:nvPicPr>
-                  <pic:blipFill>
-                    <a:blip r:embed="rId43"/>
-                    <a:stretch>
-                      <a:fillRect/>
-                    </a:stretch>
-                  </pic:blipFill>
-                  <pic:spPr>
-                    <a:xfrm>
-                      <a:off x="0" y="0"/>
-                      <a:ext cx="5400040" cy="1276350"/>
-                    </a:xfrm>
-                    <a:prstGeom prst="rect">
-                      <a:avLst/>
-                    </a:prstGeom>
-                  </pic:spPr>
-                </pic:pic>
-              </a:graphicData>
-            </a:graphic>
-          </wp:inline>
-        </w:drawing>
-      </w:r>
-    </w:p>
-    <w:p>
-      <w:pPr>
-        <w:ind w:left="0"/>
-        <w:rPr>
-          <w:rFonts w:ascii="Daytona" w:hAnsi="Daytona"/>
-          <w:u w:val="single"/>
-        </w:rPr>
-      </w:pPr>
-      <w:r>
-        <w:rPr>
-          <w:rFonts w:ascii="Daytona" w:hAnsi="Daytona"/>
-          <w:u w:val="single"/>
-        </w:rPr>
-        <w:t>VISTA 4</w:t>
-      </w:r>
-    </w:p>
-    <w:p>
-      <w:pPr>
-        <w:ind w:left="0"/>
-        <w:rPr>
-          <w:rFonts w:ascii="Daytona" w:hAnsi="Daytona"/>
-          <w:u w:val="single"/>
-        </w:rPr>
-      </w:pPr>
-      <w:r>
-        <w:rPr>
-          <w:rFonts w:ascii="Daytona" w:hAnsi="Daytona"/>
-          <w:u w:val="single"/>
-        </w:rPr>
-        <w:drawing>
-          <wp:inline distT="0" distB="0" distL="0" distR="0" wp14:anchorId="2CBF3FBD" wp14:editId="4C100A4D">
-            <wp:extent cx="5887384" cy="1044000"/>
-            <wp:effectExtent l="0" t="0" r="0" b="3810"/>
-            <wp:docPr id="50" name="Imagen 50"/>
             <wp:cNvGraphicFramePr>
               <a:graphicFrameLocks xmlns:a="http://schemas.openxmlformats.org/drawingml/2006/main" noChangeAspect="1"/>
             </wp:cNvGraphicFramePr>
@@ -8505,6 +8669,72 @@
                   <pic:spPr>
                     <a:xfrm>
                       <a:off x="0" y="0"/>
+                      <a:ext cx="4569317" cy="1080000"/>
+                    </a:xfrm>
+                    <a:prstGeom prst="rect">
+                      <a:avLst/>
+                    </a:prstGeom>
+                  </pic:spPr>
+                </pic:pic>
+              </a:graphicData>
+            </a:graphic>
+          </wp:inline>
+        </w:drawing>
+      </w:r>
+    </w:p>
+    <w:p>
+      <w:pPr>
+        <w:jc w:val="both"/>
+        <w:rPr>
+          <w:rFonts w:ascii="Daytona" w:hAnsi="Daytona"/>
+          <w:u w:val="single"/>
+        </w:rPr>
+      </w:pPr>
+      <w:r>
+        <w:rPr>
+          <w:rFonts w:ascii="Daytona" w:hAnsi="Daytona"/>
+          <w:u w:val="single"/>
+        </w:rPr>
+        <w:lastRenderedPageBreak/>
+        <w:t>VISTA 4</w:t>
+      </w:r>
+    </w:p>
+    <w:p>
+      <w:pPr>
+        <w:jc w:val="both"/>
+        <w:rPr>
+          <w:rFonts w:ascii="Daytona" w:hAnsi="Daytona"/>
+        </w:rPr>
+      </w:pPr>
+      <w:r>
+        <w:rPr>
+          <w:rFonts w:ascii="Daytona" w:hAnsi="Daytona"/>
+          <w:noProof/>
+        </w:rPr>
+        <w:drawing>
+          <wp:inline distT="0" distB="0" distL="0" distR="0" wp14:anchorId="2CBF3FBD" wp14:editId="4C100A4D">
+            <wp:extent cx="5887384" cy="1044000"/>
+            <wp:effectExtent l="0" t="0" r="0" b="3810"/>
+            <wp:docPr id="50" name="Imagen 50"/>
+            <wp:cNvGraphicFramePr>
+              <a:graphicFrameLocks xmlns:a="http://schemas.openxmlformats.org/drawingml/2006/main" noChangeAspect="1"/>
+            </wp:cNvGraphicFramePr>
+            <a:graphic xmlns:a="http://schemas.openxmlformats.org/drawingml/2006/main">
+              <a:graphicData uri="http://schemas.openxmlformats.org/drawingml/2006/picture">
+                <pic:pic xmlns:pic="http://schemas.openxmlformats.org/drawingml/2006/picture">
+                  <pic:nvPicPr>
+                    <pic:cNvPr id="1" name=""/>
+                    <pic:cNvPicPr/>
+                  </pic:nvPicPr>
+                  <pic:blipFill>
+                    <a:blip r:embed="rId45"/>
+                    <a:stretch>
+                      <a:fillRect/>
+                    </a:stretch>
+                  </pic:blipFill>
+                  <pic:spPr>
+                    <a:xfrm>
+                      <a:off x="0" y="0"/>
                       <a:ext cx="5887384" cy="1044000"/>
                     </a:xfrm>
                     <a:prstGeom prst="rect">
@@ -8520,16 +8750,15 @@
     </w:p>
     <w:p>
       <w:pPr>
-        <w:ind w:left="0"/>
-        <w:rPr>
-          <w:rFonts w:ascii="Daytona" w:hAnsi="Daytona"/>
-        </w:rPr>
-      </w:pPr>
-      <w:r>
-        <w:rPr>
-          <w:rFonts w:ascii="Daytona" w:hAnsi="Daytona"/>
-        </w:rPr>
-        <w:lastRenderedPageBreak/>
+        <w:jc w:val="both"/>
+        <w:rPr>
+          <w:rFonts w:ascii="Daytona" w:hAnsi="Daytona"/>
+        </w:rPr>
+      </w:pPr>
+      <w:r>
+        <w:rPr>
+          <w:rFonts w:ascii="Daytona" w:hAnsi="Daytona"/>
+        </w:rPr>
         <w:t xml:space="preserve">Esta vista tiene que devolver los eventos favoritos del usuario 2 que es Delio cuya fecha sea posterior al 20-02-2026. Creamos la vista, asignamos nombre, en el SELECT debe aparecer la tabla de eventos completa y nuevamente las tablas que necesitaremos para las 2 condiciones son la de favoritos para indicar el </w:t>
       </w:r>
       <w:proofErr w:type="spellStart"/>
@@ -8549,7 +8778,7 @@
     </w:p>
     <w:p>
       <w:pPr>
-        <w:ind w:left="0"/>
+        <w:jc w:val="both"/>
         <w:rPr>
           <w:rFonts w:ascii="Daytona" w:hAnsi="Daytona"/>
           <w:u w:val="single"/>
@@ -8560,19 +8789,13 @@
           <w:rFonts w:ascii="Daytona" w:hAnsi="Daytona"/>
           <w:u w:val="single"/>
         </w:rPr>
-        <w:t>OUTPUT</w:t>
-      </w:r>
-      <w:r>
-        <w:rPr>
-          <w:rFonts w:ascii="Daytona" w:hAnsi="Daytona"/>
+        <w:t xml:space="preserve">OUTPUT: </w:t>
+      </w:r>
+      <w:r>
+        <w:rPr>
+          <w:rFonts w:ascii="Daytona" w:hAnsi="Daytona"/>
+          <w:noProof/>
           <w:u w:val="single"/>
-        </w:rPr>
-        <w:t xml:space="preserve">: </w:t>
-      </w:r>
-      <w:r>
-        <w:rPr>
-          <w:rFonts w:ascii="Daytona" w:hAnsi="Daytona"/>
-          <w:noProof/>
         </w:rPr>
         <w:drawing>
           <wp:inline distT="0" distB="0" distL="0" distR="0" wp14:anchorId="3C0F3A67" wp14:editId="2F40472D">
@@ -8590,7 +8813,7 @@
                     <pic:cNvPicPr/>
                   </pic:nvPicPr>
                   <pic:blipFill>
-                    <a:blip r:embed="rId38" cstate="print">
+                    <a:blip r:embed="rId39" cstate="print">
                       <a:extLst>
                         <a:ext uri="{28A0092B-C50C-407E-A947-70E740481C1C}">
                           <a14:useLocalDpi xmlns:a14="http://schemas.microsoft.com/office/drawing/2010/main" val="0"/>
@@ -8619,228 +8842,21 @@
     </w:p>
     <w:p>
       <w:pPr>
-        <w:ind w:left="0"/>
-        <w:rPr>
-          <w:rFonts w:ascii="Daytona" w:hAnsi="Daytona"/>
-          <w:u w:val="single"/>
-        </w:rPr>
-      </w:pPr>
-      <w:r>
-        <w:rPr>
-          <w:rFonts w:ascii="Daytona" w:hAnsi="Daytona"/>
-          <w:u w:val="single"/>
+        <w:jc w:val="both"/>
+        <w:rPr>
+          <w:rFonts w:ascii="Daytona" w:hAnsi="Daytona"/>
+        </w:rPr>
+      </w:pPr>
+      <w:r>
+        <w:rPr>
+          <w:rFonts w:ascii="Daytona" w:hAnsi="Daytona"/>
+          <w:noProof/>
         </w:rPr>
         <w:drawing>
-          <wp:inline distT="0" distB="0" distL="0" distR="0" wp14:anchorId="30C27507" wp14:editId="2D7BE652">
-            <wp:extent cx="5400040" cy="909320"/>
-            <wp:effectExtent l="0" t="0" r="0" b="5080"/>
+          <wp:inline distT="0" distB="0" distL="0" distR="0" wp14:anchorId="30C27507" wp14:editId="66950AB5">
+            <wp:extent cx="4275753" cy="720000"/>
+            <wp:effectExtent l="0" t="0" r="0" b="4445"/>
             <wp:docPr id="52" name="Imagen 52"/>
-            <wp:cNvGraphicFramePr>
-              <a:graphicFrameLocks xmlns:a="http://schemas.openxmlformats.org/drawingml/2006/main" noChangeAspect="1"/>
-            </wp:cNvGraphicFramePr>
-            <a:graphic xmlns:a="http://schemas.openxmlformats.org/drawingml/2006/main">
-              <a:graphicData uri="http://schemas.openxmlformats.org/drawingml/2006/picture">
-                <pic:pic xmlns:pic="http://schemas.openxmlformats.org/drawingml/2006/picture">
-                  <pic:nvPicPr>
-                    <pic:cNvPr id="1" name=""/>
-                    <pic:cNvPicPr/>
-                  </pic:nvPicPr>
-                  <pic:blipFill>
-                    <a:blip r:embed="rId45"/>
-                    <a:stretch>
-                      <a:fillRect/>
-                    </a:stretch>
-                  </pic:blipFill>
-                  <pic:spPr>
-                    <a:xfrm>
-                      <a:off x="0" y="0"/>
-                      <a:ext cx="5400040" cy="909320"/>
-                    </a:xfrm>
-                    <a:prstGeom prst="rect">
-                      <a:avLst/>
-                    </a:prstGeom>
-                  </pic:spPr>
-                </pic:pic>
-              </a:graphicData>
-            </a:graphic>
-          </wp:inline>
-        </w:drawing>
-      </w:r>
-    </w:p>
-    <w:p>
-      <w:pPr>
-        <w:mirrorIndents/>
-        <w:rPr>
-          <w:rFonts w:ascii="Daytona" w:hAnsi="Daytona"/>
-        </w:rPr>
-      </w:pPr>
-      <w:r>
-        <w:rPr>
-          <w:rFonts w:ascii="Daytona" w:hAnsi="Daytona"/>
-        </w:rPr>
-        <w:t xml:space="preserve">Y con esto, estaría el script. Todo el archivo </w:t>
-      </w:r>
-      <w:r>
-        <w:rPr>
-          <w:rFonts w:ascii="Daytona" w:hAnsi="Daytona"/>
-        </w:rPr>
-        <w:t>SQL</w:t>
-      </w:r>
-      <w:r>
-        <w:rPr>
-          <w:rFonts w:ascii="Daytona" w:hAnsi="Daytona"/>
-        </w:rPr>
-        <w:t xml:space="preserve"> está comentado para facilitar su comprensión. </w:t>
-      </w:r>
-      <w:r>
-        <w:rPr>
-          <w:rFonts w:ascii="Daytona" w:hAnsi="Daytona"/>
-        </w:rPr>
-        <w:t>La estructura de la carpeta base de datos queda</w:t>
-      </w:r>
-    </w:p>
-    <w:p>
-      <w:pPr>
-        <w:mirrorIndents/>
-        <w:rPr>
-          <w:rFonts w:ascii="Daytona" w:hAnsi="Daytona"/>
-        </w:rPr>
-      </w:pPr>
-      <w:r>
-        <w:rPr>
-          <w:rFonts w:ascii="Daytona" w:hAnsi="Daytona"/>
-        </w:rPr>
-        <w:t>base-de-datos</w:t>
-      </w:r>
-    </w:p>
-    <w:p>
-      <w:pPr>
-        <w:ind w:left="368" w:firstLine="1048"/>
-        <w:mirrorIndents/>
-        <w:rPr>
-          <w:rFonts w:ascii="Daytona" w:hAnsi="Daytona" w:cs="Arial"/>
-        </w:rPr>
-      </w:pPr>
-      <w:r>
-        <w:rPr>
-          <w:rFonts w:ascii="Arial" w:hAnsi="Arial" w:cs="Arial"/>
-        </w:rPr>
-        <w:t>├──</w:t>
-      </w:r>
-      <w:proofErr w:type="spellStart"/>
-      <w:r>
-        <w:rPr>
-          <w:rFonts w:ascii="Daytona" w:hAnsi="Daytona" w:cs="Arial"/>
-        </w:rPr>
-        <w:t>happinessco.sql</w:t>
-      </w:r>
-      <w:proofErr w:type="spellEnd"/>
-    </w:p>
-    <w:p>
-      <w:pPr>
-        <w:ind w:left="0"/>
-        <w:mirrorIndents/>
-        <w:rPr>
-          <w:rFonts w:ascii="Daytona" w:hAnsi="Daytona" w:cs="Arial"/>
-        </w:rPr>
-      </w:pPr>
-      <w:r>
-        <w:rPr>
-          <w:rFonts w:ascii="Daytona" w:hAnsi="Daytona" w:cs="Arial"/>
-        </w:rPr>
-        <w:t xml:space="preserve">Paso todos los cambios a </w:t>
-      </w:r>
-      <w:proofErr w:type="spellStart"/>
-      <w:r>
-        <w:rPr>
-          <w:rFonts w:ascii="Daytona" w:hAnsi="Daytona" w:cs="Arial"/>
-        </w:rPr>
-        <w:t>staging</w:t>
-      </w:r>
-      <w:proofErr w:type="spellEnd"/>
-      <w:r>
-        <w:rPr>
-          <w:rFonts w:ascii="Daytona" w:hAnsi="Daytona" w:cs="Arial"/>
-        </w:rPr>
-        <w:t xml:space="preserve">, hago </w:t>
-      </w:r>
-      <w:proofErr w:type="spellStart"/>
-      <w:r>
-        <w:rPr>
-          <w:rFonts w:ascii="Daytona" w:hAnsi="Daytona" w:cs="Arial"/>
-        </w:rPr>
-        <w:t>committ</w:t>
-      </w:r>
-      <w:proofErr w:type="spellEnd"/>
-      <w:r>
-        <w:rPr>
-          <w:rFonts w:ascii="Daytona" w:hAnsi="Daytona" w:cs="Arial"/>
-        </w:rPr>
-        <w:t xml:space="preserve"> y </w:t>
-      </w:r>
-      <w:proofErr w:type="spellStart"/>
-      <w:r>
-        <w:rPr>
-          <w:rFonts w:ascii="Daytona" w:hAnsi="Daytona" w:cs="Arial"/>
-        </w:rPr>
-        <w:t>git</w:t>
-      </w:r>
-      <w:proofErr w:type="spellEnd"/>
-      <w:r>
-        <w:rPr>
-          <w:rFonts w:ascii="Daytona" w:hAnsi="Daytona" w:cs="Arial"/>
-        </w:rPr>
-        <w:t xml:space="preserve"> </w:t>
-      </w:r>
-      <w:proofErr w:type="spellStart"/>
-      <w:r>
-        <w:rPr>
-          <w:rFonts w:ascii="Daytona" w:hAnsi="Daytona" w:cs="Arial"/>
-        </w:rPr>
-        <w:t>push</w:t>
-      </w:r>
-      <w:proofErr w:type="spellEnd"/>
-    </w:p>
-    <w:p>
-      <w:pPr>
-        <w:ind w:left="0"/>
-        <w:mirrorIndents/>
-        <w:rPr>
-          <w:rFonts w:ascii="Daytona" w:hAnsi="Daytona" w:cs="Arial"/>
-        </w:rPr>
-      </w:pPr>
-      <w:r>
-        <w:rPr>
-          <w:rFonts w:ascii="Daytona" w:hAnsi="Daytona" w:cs="Arial"/>
-        </w:rPr>
-        <w:t xml:space="preserve">Resumen de </w:t>
-      </w:r>
-      <w:proofErr w:type="spellStart"/>
-      <w:r>
-        <w:rPr>
-          <w:rFonts w:ascii="Daytona" w:hAnsi="Daytona" w:cs="Arial"/>
-        </w:rPr>
-        <w:t>commits</w:t>
-      </w:r>
-      <w:proofErr w:type="spellEnd"/>
-    </w:p>
-    <w:p>
-      <w:pPr>
-        <w:ind w:left="0"/>
-        <w:mirrorIndents/>
-        <w:rPr>
-          <w:rFonts w:ascii="Arial" w:hAnsi="Arial" w:cs="Arial"/>
-        </w:rPr>
-      </w:pPr>
-      <w:r>
-        <w:rPr>
-          <w:rFonts w:ascii="Arial" w:hAnsi="Arial" w:cs="Arial"/>
-        </w:rPr>
-        <w:drawing>
-          <wp:inline distT="0" distB="0" distL="0" distR="0" wp14:anchorId="339095CE" wp14:editId="40B9F4F0">
-            <wp:extent cx="5400040" cy="4239260"/>
-            <wp:effectExtent l="0" t="0" r="0" b="8890"/>
-            <wp:docPr id="53" name="Imagen 53"/>
             <wp:cNvGraphicFramePr>
               <a:graphicFrameLocks xmlns:a="http://schemas.openxmlformats.org/drawingml/2006/main" noChangeAspect="1"/>
             </wp:cNvGraphicFramePr>
@@ -8860,7 +8876,7 @@
                   <pic:spPr>
                     <a:xfrm>
                       <a:off x="0" y="0"/>
-                      <a:ext cx="5400040" cy="4239260"/>
+                      <a:ext cx="4275753" cy="720000"/>
                     </a:xfrm>
                     <a:prstGeom prst="rect">
                       <a:avLst/>
@@ -8875,37 +8891,175 @@
     </w:p>
     <w:p>
       <w:pPr>
-        <w:ind w:left="0"/>
-        <w:mirrorIndents/>
-        <w:rPr>
-          <w:rFonts w:ascii="Daytona" w:hAnsi="Daytona"/>
-        </w:rPr>
-      </w:pPr>
-      <w:r>
-        <w:rPr>
-          <w:rFonts w:ascii="Daytona" w:hAnsi="Daytona"/>
-        </w:rPr>
-        <w:lastRenderedPageBreak/>
-        <w:t>Con respecto al diagrama, MYSQL autogenera un diagrama asociado a la base de datos para ello hay que seguir estos pasos</w:t>
-      </w:r>
-    </w:p>
-    <w:p>
-      <w:pPr>
-        <w:ind w:left="0"/>
-        <w:mirrorIndents/>
-        <w:rPr>
-          <w:rFonts w:ascii="Daytona" w:hAnsi="Daytona"/>
-        </w:rPr>
-      </w:pPr>
-      <w:r>
-        <w:rPr>
-          <w:rFonts w:ascii="Daytona" w:hAnsi="Daytona"/>
+        <w:jc w:val="both"/>
+        <w:rPr>
+          <w:rFonts w:ascii="Daytona" w:hAnsi="Daytona"/>
+        </w:rPr>
+      </w:pPr>
+      <w:r>
+        <w:rPr>
+          <w:rFonts w:ascii="Daytona" w:hAnsi="Daytona"/>
+        </w:rPr>
+        <w:t xml:space="preserve">Y con esto, estaría el script. Todo el archivo </w:t>
+      </w:r>
+      <w:r>
+        <w:rPr>
+          <w:rFonts w:ascii="Daytona" w:hAnsi="Daytona"/>
+        </w:rPr>
+        <w:t>SQL</w:t>
+      </w:r>
+      <w:r>
+        <w:rPr>
+          <w:rFonts w:ascii="Daytona" w:hAnsi="Daytona"/>
+        </w:rPr>
+        <w:t xml:space="preserve"> está comentado para facilitar su comprensión. </w:t>
+      </w:r>
+      <w:r>
+        <w:rPr>
+          <w:rFonts w:ascii="Daytona" w:hAnsi="Daytona"/>
+        </w:rPr>
+        <w:t>La estructura de la carpeta base de datos queda</w:t>
+      </w:r>
+    </w:p>
+    <w:p>
+      <w:pPr>
+        <w:jc w:val="both"/>
+        <w:rPr>
+          <w:rFonts w:ascii="Daytona" w:hAnsi="Daytona"/>
+        </w:rPr>
+      </w:pPr>
+      <w:r>
+        <w:rPr>
+          <w:rFonts w:ascii="Daytona" w:hAnsi="Daytona"/>
+        </w:rPr>
+        <w:t>base-de-datos</w:t>
+      </w:r>
+    </w:p>
+    <w:p>
+      <w:pPr>
+        <w:jc w:val="both"/>
+        <w:rPr>
+          <w:rFonts w:ascii="Daytona" w:hAnsi="Daytona" w:cs="Arial"/>
+        </w:rPr>
+      </w:pPr>
+      <w:r>
+        <w:rPr>
+          <w:rFonts w:ascii="Arial" w:hAnsi="Arial" w:cs="Arial"/>
+        </w:rPr>
+        <w:t>├──</w:t>
+      </w:r>
+      <w:proofErr w:type="spellStart"/>
+      <w:r>
+        <w:rPr>
+          <w:rFonts w:ascii="Daytona" w:hAnsi="Daytona" w:cs="Arial"/>
+        </w:rPr>
+        <w:t>happinessco.sql</w:t>
+      </w:r>
+      <w:proofErr w:type="spellEnd"/>
+    </w:p>
+    <w:p>
+      <w:pPr>
+        <w:jc w:val="both"/>
+        <w:rPr>
+          <w:rFonts w:ascii="Daytona" w:hAnsi="Daytona" w:cs="Arial"/>
+        </w:rPr>
+      </w:pPr>
+      <w:r>
+        <w:rPr>
+          <w:rFonts w:ascii="Daytona" w:hAnsi="Daytona" w:cs="Arial"/>
+        </w:rPr>
+        <w:t xml:space="preserve">Paso todos los cambios a </w:t>
+      </w:r>
+      <w:proofErr w:type="spellStart"/>
+      <w:r>
+        <w:rPr>
+          <w:rFonts w:ascii="Daytona" w:hAnsi="Daytona" w:cs="Arial"/>
+        </w:rPr>
+        <w:t>staging</w:t>
+      </w:r>
+      <w:proofErr w:type="spellEnd"/>
+      <w:r>
+        <w:rPr>
+          <w:rFonts w:ascii="Daytona" w:hAnsi="Daytona" w:cs="Arial"/>
+        </w:rPr>
+        <w:t xml:space="preserve">, hago </w:t>
+      </w:r>
+      <w:proofErr w:type="spellStart"/>
+      <w:r>
+        <w:rPr>
+          <w:rFonts w:ascii="Daytona" w:hAnsi="Daytona" w:cs="Arial"/>
+        </w:rPr>
+        <w:t>committ</w:t>
+      </w:r>
+      <w:proofErr w:type="spellEnd"/>
+      <w:r>
+        <w:rPr>
+          <w:rFonts w:ascii="Daytona" w:hAnsi="Daytona" w:cs="Arial"/>
+        </w:rPr>
+        <w:t xml:space="preserve"> y </w:t>
+      </w:r>
+      <w:proofErr w:type="spellStart"/>
+      <w:r>
+        <w:rPr>
+          <w:rFonts w:ascii="Daytona" w:hAnsi="Daytona" w:cs="Arial"/>
+        </w:rPr>
+        <w:t>git</w:t>
+      </w:r>
+      <w:proofErr w:type="spellEnd"/>
+      <w:r>
+        <w:rPr>
+          <w:rFonts w:ascii="Daytona" w:hAnsi="Daytona" w:cs="Arial"/>
+        </w:rPr>
+        <w:t xml:space="preserve"> </w:t>
+      </w:r>
+      <w:proofErr w:type="spellStart"/>
+      <w:r>
+        <w:rPr>
+          <w:rFonts w:ascii="Daytona" w:hAnsi="Daytona" w:cs="Arial"/>
+        </w:rPr>
+        <w:t>push</w:t>
+      </w:r>
+      <w:proofErr w:type="spellEnd"/>
+    </w:p>
+    <w:p>
+      <w:pPr>
+        <w:jc w:val="both"/>
+        <w:rPr>
+          <w:rFonts w:ascii="Daytona" w:hAnsi="Daytona" w:cs="Arial"/>
+        </w:rPr>
+      </w:pPr>
+      <w:r>
+        <w:rPr>
+          <w:rFonts w:ascii="Daytona" w:hAnsi="Daytona" w:cs="Arial"/>
+        </w:rPr>
+        <w:t xml:space="preserve">Resumen de </w:t>
+      </w:r>
+      <w:proofErr w:type="spellStart"/>
+      <w:r>
+        <w:rPr>
+          <w:rFonts w:ascii="Daytona" w:hAnsi="Daytona" w:cs="Arial"/>
+        </w:rPr>
+        <w:t>commits</w:t>
+      </w:r>
+      <w:proofErr w:type="spellEnd"/>
+    </w:p>
+    <w:p>
+      <w:pPr>
+        <w:jc w:val="both"/>
+        <w:rPr>
+          <w:rFonts w:ascii="Daytona" w:hAnsi="Daytona" w:cs="Arial"/>
+        </w:rPr>
+      </w:pPr>
+      <w:r>
+        <w:rPr>
+          <w:rFonts w:ascii="Daytona" w:hAnsi="Daytona" w:cs="Arial"/>
+          <w:noProof/>
         </w:rPr>
         <w:drawing>
-          <wp:inline distT="0" distB="0" distL="0" distR="0" wp14:anchorId="6E9FFE73" wp14:editId="1B77B1C5">
-            <wp:extent cx="2730000" cy="1872000"/>
-            <wp:effectExtent l="0" t="0" r="0" b="0"/>
-            <wp:docPr id="54" name="Imagen 54"/>
+          <wp:inline distT="0" distB="0" distL="0" distR="0" wp14:anchorId="339095CE" wp14:editId="1804F70F">
+            <wp:extent cx="3897892" cy="3060000"/>
+            <wp:effectExtent l="0" t="0" r="7620" b="7620"/>
+            <wp:docPr id="53" name="Imagen 53"/>
             <wp:cNvGraphicFramePr>
               <a:graphicFrameLocks xmlns:a="http://schemas.openxmlformats.org/drawingml/2006/main" noChangeAspect="1"/>
             </wp:cNvGraphicFramePr>
@@ -8925,6 +9079,70 @@
                   <pic:spPr>
                     <a:xfrm>
                       <a:off x="0" y="0"/>
+                      <a:ext cx="3897892" cy="3060000"/>
+                    </a:xfrm>
+                    <a:prstGeom prst="rect">
+                      <a:avLst/>
+                    </a:prstGeom>
+                  </pic:spPr>
+                </pic:pic>
+              </a:graphicData>
+            </a:graphic>
+          </wp:inline>
+        </w:drawing>
+      </w:r>
+    </w:p>
+    <w:p>
+      <w:pPr>
+        <w:jc w:val="both"/>
+        <w:rPr>
+          <w:rFonts w:ascii="Daytona" w:hAnsi="Daytona"/>
+        </w:rPr>
+      </w:pPr>
+      <w:r>
+        <w:rPr>
+          <w:rFonts w:ascii="Daytona" w:hAnsi="Daytona"/>
+        </w:rPr>
+        <w:lastRenderedPageBreak/>
+        <w:t>Con respecto al diagrama, MYSQL autogenera un diagrama asociado a la base de datos para ello hay que seguir estos pasos</w:t>
+      </w:r>
+    </w:p>
+    <w:p>
+      <w:pPr>
+        <w:jc w:val="both"/>
+        <w:rPr>
+          <w:rFonts w:ascii="Daytona" w:hAnsi="Daytona"/>
+        </w:rPr>
+      </w:pPr>
+      <w:r>
+        <w:rPr>
+          <w:rFonts w:ascii="Daytona" w:hAnsi="Daytona"/>
+          <w:noProof/>
+        </w:rPr>
+        <w:drawing>
+          <wp:inline distT="0" distB="0" distL="0" distR="0" wp14:anchorId="6E9FFE73" wp14:editId="1B77B1C5">
+            <wp:extent cx="2730000" cy="1872000"/>
+            <wp:effectExtent l="0" t="0" r="0" b="0"/>
+            <wp:docPr id="54" name="Imagen 54"/>
+            <wp:cNvGraphicFramePr>
+              <a:graphicFrameLocks xmlns:a="http://schemas.openxmlformats.org/drawingml/2006/main" noChangeAspect="1"/>
+            </wp:cNvGraphicFramePr>
+            <a:graphic xmlns:a="http://schemas.openxmlformats.org/drawingml/2006/main">
+              <a:graphicData uri="http://schemas.openxmlformats.org/drawingml/2006/picture">
+                <pic:pic xmlns:pic="http://schemas.openxmlformats.org/drawingml/2006/picture">
+                  <pic:nvPicPr>
+                    <pic:cNvPr id="1" name=""/>
+                    <pic:cNvPicPr/>
+                  </pic:nvPicPr>
+                  <pic:blipFill>
+                    <a:blip r:embed="rId48"/>
+                    <a:stretch>
+                      <a:fillRect/>
+                    </a:stretch>
+                  </pic:blipFill>
+                  <pic:spPr>
+                    <a:xfrm>
+                      <a:off x="0" y="0"/>
                       <a:ext cx="2730000" cy="1872000"/>
                     </a:xfrm>
                     <a:prstGeom prst="rect">
@@ -8940,8 +9158,7 @@
     </w:p>
     <w:p>
       <w:pPr>
-        <w:ind w:left="0"/>
-        <w:mirrorIndents/>
+        <w:jc w:val="both"/>
         <w:rPr>
           <w:rFonts w:ascii="Daytona" w:hAnsi="Daytona"/>
         </w:rPr>
@@ -8954,13 +9171,13 @@
         <mc:AlternateContent>
           <mc:Choice Requires="wps">
             <w:drawing>
-              <wp:anchor distT="0" distB="0" distL="114300" distR="114300" simplePos="0" relativeHeight="251659264" behindDoc="0" locked="0" layoutInCell="1" allowOverlap="1" wp14:anchorId="02C476A9" wp14:editId="6CCF7C98">
+              <wp:anchor distT="0" distB="0" distL="114300" distR="114300" simplePos="0" relativeHeight="251659264" behindDoc="0" locked="0" layoutInCell="1" allowOverlap="1" wp14:anchorId="02C476A9" wp14:editId="1EF1DF9D">
                 <wp:simplePos x="0" y="0"/>
                 <wp:positionH relativeFrom="column">
-                  <wp:posOffset>3088005</wp:posOffset>
+                  <wp:posOffset>2867025</wp:posOffset>
                 </wp:positionH>
                 <wp:positionV relativeFrom="paragraph">
-                  <wp:posOffset>2675890</wp:posOffset>
+                  <wp:posOffset>2691130</wp:posOffset>
                 </wp:positionV>
                 <wp:extent cx="236220" cy="198120"/>
                 <wp:effectExtent l="0" t="0" r="68580" b="49530"/>
@@ -9006,11 +9223,11 @@
           </mc:Choice>
           <mc:Fallback>
             <w:pict>
-              <v:shapetype w14:anchorId="0B3CC3A9" id="_x0000_t32" coordsize="21600,21600" o:spt="32" o:oned="t" path="m,l21600,21600e" filled="f">
+              <v:shapetype w14:anchorId="11F19AF9" id="_x0000_t32" coordsize="21600,21600" o:spt="32" o:oned="t" path="m,l21600,21600e" filled="f">
                 <v:path arrowok="t" fillok="f" o:connecttype="none"/>
                 <o:lock v:ext="edit" shapetype="t"/>
               </v:shapetype>
-              <v:shape id="Conector recto de flecha 56" o:spid="_x0000_s1026" type="#_x0000_t32" style="position:absolute;margin-left:243.15pt;margin-top:210.7pt;width:18.6pt;height:15.6pt;z-index:251659264;visibility:visible;mso-wrap-style:square;mso-wrap-distance-left:9pt;mso-wrap-distance-top:0;mso-wrap-distance-right:9pt;mso-wrap-distance-bottom:0;mso-position-horizontal:absolute;mso-position-horizontal-relative:text;mso-position-vertical:absolute;mso-position-vertical-relative:text" o:gfxdata="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" strokecolor="#4472c4 [3204]" strokeweight=".5pt">
+              <v:shape id="Conector recto de flecha 56" o:spid="_x0000_s1026" type="#_x0000_t32" style="position:absolute;margin-left:225.75pt;margin-top:211.9pt;width:18.6pt;height:15.6pt;z-index:251659264;visibility:visible;mso-wrap-style:square;mso-wrap-distance-left:9pt;mso-wrap-distance-top:0;mso-wrap-distance-right:9pt;mso-wrap-distance-bottom:0;mso-position-horizontal:absolute;mso-position-horizontal-relative:text;mso-position-vertical:absolute;mso-position-vertical-relative:text" o:gfxdata="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" strokecolor="#4472c4 [3204]" strokeweight=".5pt">
                 <v:stroke endarrow="block" joinstyle="miter"/>
               </v:shape>
             </w:pict>
@@ -9020,6 +9237,7 @@
       <w:r>
         <w:rPr>
           <w:rFonts w:ascii="Daytona" w:hAnsi="Daytona"/>
+          <w:noProof/>
         </w:rPr>
         <w:drawing>
           <wp:inline distT="0" distB="0" distL="0" distR="0" wp14:anchorId="2788B01F" wp14:editId="6CC0E48B">
@@ -9037,7 +9255,7 @@
                     <pic:cNvPicPr/>
                   </pic:nvPicPr>
                   <pic:blipFill>
-                    <a:blip r:embed="rId48"/>
+                    <a:blip r:embed="rId49"/>
                     <a:stretch>
                       <a:fillRect/>
                     </a:stretch>
@@ -9060,8 +9278,7 @@
     </w:p>
     <w:p>
       <w:pPr>
-        <w:ind w:left="0"/>
-        <w:mirrorIndents/>
+        <w:jc w:val="both"/>
         <w:rPr>
           <w:rFonts w:ascii="Daytona" w:hAnsi="Daytona"/>
         </w:rPr>
@@ -9074,10 +9291,10 @@
         <mc:AlternateContent>
           <mc:Choice Requires="wps">
             <w:drawing>
-              <wp:anchor distT="0" distB="0" distL="114300" distR="114300" simplePos="0" relativeHeight="251660288" behindDoc="0" locked="0" layoutInCell="1" allowOverlap="1" wp14:anchorId="49120D40" wp14:editId="109D4D34">
+              <wp:anchor distT="0" distB="0" distL="114300" distR="114300" simplePos="0" relativeHeight="251660288" behindDoc="0" locked="0" layoutInCell="1" allowOverlap="1" wp14:anchorId="49120D40" wp14:editId="3CEFFF36">
                 <wp:simplePos x="0" y="0"/>
                 <wp:positionH relativeFrom="column">
-                  <wp:posOffset>3133725</wp:posOffset>
+                  <wp:posOffset>2851785</wp:posOffset>
                 </wp:positionH>
                 <wp:positionV relativeFrom="paragraph">
                   <wp:posOffset>2578100</wp:posOffset>
@@ -9126,7 +9343,7 @@
           </mc:Choice>
           <mc:Fallback>
             <w:pict>
-              <v:shape w14:anchorId="2B6BD669" id="Conector recto de flecha 58" o:spid="_x0000_s1026" type="#_x0000_t32" style="position:absolute;margin-left:246.75pt;margin-top:203pt;width:19.2pt;height:24.6pt;z-index:251660288;visibility:visible;mso-wrap-style:square;mso-wrap-distance-left:9pt;mso-wrap-distance-top:0;mso-wrap-distance-right:9pt;mso-wrap-distance-bottom:0;mso-position-horizontal:absolute;mso-position-horizontal-relative:text;mso-position-vertical:absolute;mso-position-vertical-relative:text" o:gfxdata="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" strokecolor="#4472c4 [3204]" strokeweight=".5pt">
+              <v:shape w14:anchorId="45F9736B" id="Conector recto de flecha 58" o:spid="_x0000_s1026" type="#_x0000_t32" style="position:absolute;margin-left:224.55pt;margin-top:203pt;width:19.2pt;height:24.6pt;z-index:251660288;visibility:visible;mso-wrap-style:square;mso-wrap-distance-left:9pt;mso-wrap-distance-top:0;mso-wrap-distance-right:9pt;mso-wrap-distance-bottom:0;mso-position-horizontal:absolute;mso-position-horizontal-relative:text;mso-position-vertical:absolute;mso-position-vertical-relative:text" o:gfxdata="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" strokecolor="#4472c4 [3204]" strokeweight=".5pt">
                 <v:stroke endarrow="block" joinstyle="miter"/>
               </v:shape>
             </w:pict>
@@ -9136,6 +9353,7 @@
       <w:r>
         <w:rPr>
           <w:rFonts w:ascii="Daytona" w:hAnsi="Daytona"/>
+          <w:noProof/>
         </w:rPr>
         <w:drawing>
           <wp:inline distT="0" distB="0" distL="0" distR="0" wp14:anchorId="41E44E99" wp14:editId="3602EBC8">
@@ -9153,7 +9371,7 @@
                     <pic:cNvPicPr/>
                   </pic:nvPicPr>
                   <pic:blipFill>
-                    <a:blip r:embed="rId49"/>
+                    <a:blip r:embed="rId50"/>
                     <a:stretch>
                       <a:fillRect/>
                     </a:stretch>
@@ -9176,8 +9394,7 @@
     </w:p>
     <w:p>
       <w:pPr>
-        <w:ind w:left="0"/>
-        <w:mirrorIndents/>
+        <w:jc w:val="both"/>
         <w:rPr>
           <w:rFonts w:ascii="Daytona" w:hAnsi="Daytona"/>
         </w:rPr>
@@ -9191,10 +9408,10 @@
         <mc:AlternateContent>
           <mc:Choice Requires="wps">
             <w:drawing>
-              <wp:anchor distT="0" distB="0" distL="114300" distR="114300" simplePos="0" relativeHeight="251661312" behindDoc="0" locked="0" layoutInCell="1" allowOverlap="1" wp14:anchorId="09B24D47" wp14:editId="1ADF5C6D">
+              <wp:anchor distT="0" distB="0" distL="114300" distR="114300" simplePos="0" relativeHeight="251661312" behindDoc="0" locked="0" layoutInCell="1" allowOverlap="1" wp14:anchorId="09B24D47" wp14:editId="231AB904">
                 <wp:simplePos x="0" y="0"/>
                 <wp:positionH relativeFrom="column">
-                  <wp:posOffset>2988945</wp:posOffset>
+                  <wp:posOffset>2806065</wp:posOffset>
                 </wp:positionH>
                 <wp:positionV relativeFrom="paragraph">
                   <wp:posOffset>2430145</wp:posOffset>
@@ -9243,7 +9460,7 @@
           </mc:Choice>
           <mc:Fallback>
             <w:pict>
-              <v:shape w14:anchorId="1B2C4B18" id="Conector recto de flecha 60" o:spid="_x0000_s1026" type="#_x0000_t32" style="position:absolute;margin-left:235.35pt;margin-top:191.35pt;width:15.6pt;height:27pt;z-index:251661312;visibility:visible;mso-wrap-style:square;mso-wrap-distance-left:9pt;mso-wrap-distance-top:0;mso-wrap-distance-right:9pt;mso-wrap-distance-bottom:0;mso-position-horizontal:absolute;mso-position-horizontal-relative:text;mso-position-vertical:absolute;mso-position-vertical-relative:text" o:gfxdata="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" strokecolor="#4472c4 [3204]" strokeweight=".5pt">
+              <v:shape w14:anchorId="5DB6C936" id="Conector recto de flecha 60" o:spid="_x0000_s1026" type="#_x0000_t32" style="position:absolute;margin-left:220.95pt;margin-top:191.35pt;width:15.6pt;height:27pt;z-index:251661312;visibility:visible;mso-wrap-style:square;mso-wrap-distance-left:9pt;mso-wrap-distance-top:0;mso-wrap-distance-right:9pt;mso-wrap-distance-bottom:0;mso-position-horizontal:absolute;mso-position-horizontal-relative:text;mso-position-vertical:absolute;mso-position-vertical-relative:text" o:gfxdata="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" strokecolor="#4472c4 [3204]" strokeweight=".5pt">
                 <v:stroke endarrow="block" joinstyle="miter"/>
               </v:shape>
             </w:pict>
@@ -9253,6 +9470,7 @@
       <w:r>
         <w:rPr>
           <w:rFonts w:ascii="Daytona" w:hAnsi="Daytona"/>
+          <w:noProof/>
         </w:rPr>
         <w:drawing>
           <wp:inline distT="0" distB="0" distL="0" distR="0" wp14:anchorId="286A5BD5" wp14:editId="46F15718">
@@ -9270,7 +9488,7 @@
                     <pic:cNvPicPr/>
                   </pic:nvPicPr>
                   <pic:blipFill>
-                    <a:blip r:embed="rId50"/>
+                    <a:blip r:embed="rId51"/>
                     <a:stretch>
                       <a:fillRect/>
                     </a:stretch>
@@ -9293,8 +9511,7 @@
     </w:p>
     <w:p>
       <w:pPr>
-        <w:ind w:left="0"/>
-        <w:mirrorIndents/>
+        <w:jc w:val="both"/>
         <w:rPr>
           <w:rFonts w:ascii="Daytona" w:hAnsi="Daytona"/>
         </w:rPr>
@@ -9307,13 +9524,13 @@
         <mc:AlternateContent>
           <mc:Choice Requires="wps">
             <w:drawing>
-              <wp:anchor distT="0" distB="0" distL="114300" distR="114300" simplePos="0" relativeHeight="251662336" behindDoc="0" locked="0" layoutInCell="1" allowOverlap="1" wp14:anchorId="7695DE69" wp14:editId="13EFB2A7">
+              <wp:anchor distT="0" distB="0" distL="114300" distR="114300" simplePos="0" relativeHeight="251662336" behindDoc="0" locked="0" layoutInCell="1" allowOverlap="1" wp14:anchorId="7695DE69" wp14:editId="67791637">
                 <wp:simplePos x="0" y="0"/>
                 <wp:positionH relativeFrom="column">
-                  <wp:posOffset>2905125</wp:posOffset>
+                  <wp:posOffset>2676525</wp:posOffset>
                 </wp:positionH>
                 <wp:positionV relativeFrom="paragraph">
-                  <wp:posOffset>2431415</wp:posOffset>
+                  <wp:posOffset>2408555</wp:posOffset>
                 </wp:positionV>
                 <wp:extent cx="182880" cy="312420"/>
                 <wp:effectExtent l="0" t="0" r="64770" b="49530"/>
@@ -9359,7 +9576,7 @@
           </mc:Choice>
           <mc:Fallback>
             <w:pict>
-              <v:shape w14:anchorId="0708B880" id="Conector recto de flecha 62" o:spid="_x0000_s1026" type="#_x0000_t32" style="position:absolute;margin-left:228.75pt;margin-top:191.45pt;width:14.4pt;height:24.6pt;z-index:251662336;visibility:visible;mso-wrap-style:square;mso-wrap-distance-left:9pt;mso-wrap-distance-top:0;mso-wrap-distance-right:9pt;mso-wrap-distance-bottom:0;mso-position-horizontal:absolute;mso-position-horizontal-relative:text;mso-position-vertical:absolute;mso-position-vertical-relative:text" o:gfxdata="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" strokecolor="#4472c4 [3204]" strokeweight=".5pt">
+              <v:shape w14:anchorId="0DD45424" id="Conector recto de flecha 62" o:spid="_x0000_s1026" type="#_x0000_t32" style="position:absolute;margin-left:210.75pt;margin-top:189.65pt;width:14.4pt;height:24.6pt;z-index:251662336;visibility:visible;mso-wrap-style:square;mso-wrap-distance-left:9pt;mso-wrap-distance-top:0;mso-wrap-distance-right:9pt;mso-wrap-distance-bottom:0;mso-position-horizontal:absolute;mso-position-horizontal-relative:text;mso-position-vertical:absolute;mso-position-vertical-relative:text" o:gfxdata="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" strokecolor="#4472c4 [3204]" strokeweight=".5pt">
                 <v:stroke endarrow="block" joinstyle="miter"/>
               </v:shape>
             </w:pict>
@@ -9369,6 +9586,7 @@
       <w:r>
         <w:rPr>
           <w:rFonts w:ascii="Daytona" w:hAnsi="Daytona"/>
+          <w:noProof/>
         </w:rPr>
         <w:drawing>
           <wp:inline distT="0" distB="0" distL="0" distR="0" wp14:anchorId="43C45D33" wp14:editId="65E6A9FE">
@@ -9386,7 +9604,7 @@
                     <pic:cNvPicPr/>
                   </pic:nvPicPr>
                   <pic:blipFill>
-                    <a:blip r:embed="rId51"/>
+                    <a:blip r:embed="rId52"/>
                     <a:stretch>
                       <a:fillRect/>
                     </a:stretch>
@@ -9409,8 +9627,7 @@
     </w:p>
     <w:p>
       <w:pPr>
-        <w:ind w:left="0"/>
-        <w:mirrorIndents/>
+        <w:jc w:val="both"/>
         <w:rPr>
           <w:rFonts w:ascii="Daytona" w:hAnsi="Daytona"/>
         </w:rPr>
@@ -9423,13 +9640,13 @@
         <mc:AlternateContent>
           <mc:Choice Requires="wps">
             <w:drawing>
-              <wp:anchor distT="0" distB="0" distL="114300" distR="114300" simplePos="0" relativeHeight="251663360" behindDoc="0" locked="0" layoutInCell="1" allowOverlap="1" wp14:anchorId="12831CD7" wp14:editId="333FD77A">
+              <wp:anchor distT="0" distB="0" distL="114300" distR="114300" simplePos="0" relativeHeight="251663360" behindDoc="0" locked="0" layoutInCell="1" allowOverlap="1" wp14:anchorId="12831CD7" wp14:editId="05323EE4">
                 <wp:simplePos x="0" y="0"/>
                 <wp:positionH relativeFrom="column">
-                  <wp:posOffset>2760345</wp:posOffset>
+                  <wp:posOffset>2569845</wp:posOffset>
                 </wp:positionH>
                 <wp:positionV relativeFrom="paragraph">
-                  <wp:posOffset>2308225</wp:posOffset>
+                  <wp:posOffset>2262505</wp:posOffset>
                 </wp:positionV>
                 <wp:extent cx="266700" cy="381000"/>
                 <wp:effectExtent l="0" t="0" r="57150" b="57150"/>
@@ -9475,7 +9692,7 @@
           </mc:Choice>
           <mc:Fallback>
             <w:pict>
-              <v:shape w14:anchorId="24DB5E9B" id="Conector recto de flecha 64" o:spid="_x0000_s1026" type="#_x0000_t32" style="position:absolute;margin-left:217.35pt;margin-top:181.75pt;width:21pt;height:30pt;z-index:251663360;visibility:visible;mso-wrap-style:square;mso-wrap-distance-left:9pt;mso-wrap-distance-top:0;mso-wrap-distance-right:9pt;mso-wrap-distance-bottom:0;mso-position-horizontal:absolute;mso-position-horizontal-relative:text;mso-position-vertical:absolute;mso-position-vertical-relative:text" o:gfxdata="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" strokecolor="#4472c4 [3204]" strokeweight=".5pt">
+              <v:shape w14:anchorId="20F7782B" id="Conector recto de flecha 64" o:spid="_x0000_s1026" type="#_x0000_t32" style="position:absolute;margin-left:202.35pt;margin-top:178.15pt;width:21pt;height:30pt;z-index:251663360;visibility:visible;mso-wrap-style:square;mso-wrap-distance-left:9pt;mso-wrap-distance-top:0;mso-wrap-distance-right:9pt;mso-wrap-distance-bottom:0;mso-position-horizontal:absolute;mso-position-horizontal-relative:text;mso-position-vertical:absolute;mso-position-vertical-relative:text" o:gfxdata="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" strokecolor="#4472c4 [3204]" strokeweight=".5pt">
                 <v:stroke endarrow="block" joinstyle="miter"/>
               </v:shape>
             </w:pict>
@@ -9485,6 +9702,7 @@
       <w:r>
         <w:rPr>
           <w:rFonts w:ascii="Daytona" w:hAnsi="Daytona"/>
+          <w:noProof/>
         </w:rPr>
         <w:drawing>
           <wp:inline distT="0" distB="0" distL="0" distR="0" wp14:anchorId="22751FF7" wp14:editId="3F5BE4D2">
@@ -9502,7 +9720,7 @@
                     <pic:cNvPicPr/>
                   </pic:nvPicPr>
                   <pic:blipFill>
-                    <a:blip r:embed="rId52"/>
+                    <a:blip r:embed="rId53"/>
                     <a:stretch>
                       <a:fillRect/>
                     </a:stretch>
@@ -9525,8 +9743,7 @@
     </w:p>
     <w:p>
       <w:pPr>
-        <w:ind w:left="0"/>
-        <w:mirrorIndents/>
+        <w:jc w:val="both"/>
         <w:rPr>
           <w:rFonts w:ascii="Daytona" w:hAnsi="Daytona"/>
         </w:rPr>
@@ -9540,13 +9757,13 @@
         <mc:AlternateContent>
           <mc:Choice Requires="wps">
             <w:drawing>
-              <wp:anchor distT="0" distB="0" distL="114300" distR="114300" simplePos="0" relativeHeight="251664384" behindDoc="0" locked="0" layoutInCell="1" allowOverlap="1" wp14:anchorId="03B35F37" wp14:editId="4F04F67F">
+              <wp:anchor distT="0" distB="0" distL="114300" distR="114300" simplePos="0" relativeHeight="251664384" behindDoc="0" locked="0" layoutInCell="1" allowOverlap="1" wp14:anchorId="03B35F37" wp14:editId="75694EF0">
                 <wp:simplePos x="0" y="0"/>
                 <wp:positionH relativeFrom="column">
-                  <wp:posOffset>3430905</wp:posOffset>
+                  <wp:posOffset>3225165</wp:posOffset>
                 </wp:positionH>
                 <wp:positionV relativeFrom="paragraph">
-                  <wp:posOffset>2978785</wp:posOffset>
+                  <wp:posOffset>2925445</wp:posOffset>
                 </wp:positionV>
                 <wp:extent cx="297180" cy="327660"/>
                 <wp:effectExtent l="0" t="0" r="64770" b="53340"/>
@@ -9592,7 +9809,7 @@
           </mc:Choice>
           <mc:Fallback>
             <w:pict>
-              <v:shape w14:anchorId="2F34A415" id="Conector recto de flecha 66" o:spid="_x0000_s1026" type="#_x0000_t32" style="position:absolute;margin-left:270.15pt;margin-top:234.55pt;width:23.4pt;height:25.8pt;z-index:251664384;visibility:visible;mso-wrap-style:square;mso-wrap-distance-left:9pt;mso-wrap-distance-top:0;mso-wrap-distance-right:9pt;mso-wrap-distance-bottom:0;mso-position-horizontal:absolute;mso-position-horizontal-relative:text;mso-position-vertical:absolute;mso-position-vertical-relative:text" o:gfxdata="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" strokecolor="#4472c4 [3204]" strokeweight=".5pt">
+              <v:shape w14:anchorId="26E591FE" id="Conector recto de flecha 66" o:spid="_x0000_s1026" type="#_x0000_t32" style="position:absolute;margin-left:253.95pt;margin-top:230.35pt;width:23.4pt;height:25.8pt;z-index:251664384;visibility:visible;mso-wrap-style:square;mso-wrap-distance-left:9pt;mso-wrap-distance-top:0;mso-wrap-distance-right:9pt;mso-wrap-distance-bottom:0;mso-position-horizontal:absolute;mso-position-horizontal-relative:text;mso-position-vertical:absolute;mso-position-vertical-relative:text" o:gfxdata="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" strokecolor="#4472c4 [3204]" strokeweight=".5pt">
                 <v:stroke endarrow="block" joinstyle="miter"/>
               </v:shape>
             </w:pict>
@@ -9602,90 +9819,13 @@
       <w:r>
         <w:rPr>
           <w:rFonts w:ascii="Daytona" w:hAnsi="Daytona"/>
+          <w:noProof/>
         </w:rPr>
         <w:drawing>
           <wp:inline distT="0" distB="0" distL="0" distR="0" wp14:anchorId="4808258C" wp14:editId="760E9DD7">
             <wp:extent cx="4406928" cy="3456000"/>
             <wp:effectExtent l="0" t="0" r="0" b="0"/>
             <wp:docPr id="65" name="Imagen 65"/>
-            <wp:cNvGraphicFramePr>
-              <a:graphicFrameLocks xmlns:a="http://schemas.openxmlformats.org/drawingml/2006/main" noChangeAspect="1"/>
-            </wp:cNvGraphicFramePr>
-            <a:graphic xmlns:a="http://schemas.openxmlformats.org/drawingml/2006/main">
-              <a:graphicData uri="http://schemas.openxmlformats.org/drawingml/2006/picture">
-                <pic:pic xmlns:pic="http://schemas.openxmlformats.org/drawingml/2006/picture">
-                  <pic:nvPicPr>
-                    <pic:cNvPr id="1" name=""/>
-                    <pic:cNvPicPr/>
-                  </pic:nvPicPr>
-                  <pic:blipFill>
-                    <a:blip r:embed="rId53"/>
-                    <a:stretch>
-                      <a:fillRect/>
-                    </a:stretch>
-                  </pic:blipFill>
-                  <pic:spPr>
-                    <a:xfrm>
-                      <a:off x="0" y="0"/>
-                      <a:ext cx="4406928" cy="3456000"/>
-                    </a:xfrm>
-                    <a:prstGeom prst="rect">
-                      <a:avLst/>
-                    </a:prstGeom>
-                  </pic:spPr>
-                </pic:pic>
-              </a:graphicData>
-            </a:graphic>
-          </wp:inline>
-        </w:drawing>
-      </w:r>
-    </w:p>
-    <w:p>
-      <w:pPr>
-        <w:ind w:left="0"/>
-        <w:mirrorIndents/>
-        <w:rPr>
-          <w:rFonts w:ascii="Daytona" w:hAnsi="Daytona"/>
-        </w:rPr>
-      </w:pPr>
-    </w:p>
-    <w:p>
-      <w:pPr>
-        <w:ind w:left="0"/>
-        <w:mirrorIndents/>
-        <w:rPr>
-          <w:rFonts w:ascii="Daytona" w:hAnsi="Daytona"/>
-          <w:u w:val="single"/>
-          <w:lang w:val="pt-PT"/>
-        </w:rPr>
-      </w:pPr>
-      <w:r>
-        <w:rPr>
-          <w:rFonts w:ascii="Daytona" w:hAnsi="Daytona"/>
-          <w:u w:val="single"/>
-          <w:lang w:val="pt-PT"/>
-        </w:rPr>
-        <w:t>DIAGRAMA E-R</w:t>
-      </w:r>
-    </w:p>
-    <w:p>
-      <w:pPr>
-        <w:ind w:left="0"/>
-        <w:mirrorIndents/>
-        <w:rPr>
-          <w:rFonts w:ascii="Daytona" w:hAnsi="Daytona"/>
-          <w:lang w:val="pt-PT"/>
-        </w:rPr>
-      </w:pPr>
-      <w:r>
-        <w:rPr>
-          <w:rFonts w:ascii="Daytona" w:hAnsi="Daytona"/>
-        </w:rPr>
-        <w:drawing>
-          <wp:inline distT="0" distB="0" distL="0" distR="0" wp14:anchorId="15862863" wp14:editId="692BC83E">
-            <wp:extent cx="5400040" cy="3248025"/>
-            <wp:effectExtent l="0" t="0" r="0" b="9525"/>
-            <wp:docPr id="67" name="Imagen 67"/>
             <wp:cNvGraphicFramePr>
               <a:graphicFrameLocks xmlns:a="http://schemas.openxmlformats.org/drawingml/2006/main" noChangeAspect="1"/>
             </wp:cNvGraphicFramePr>
@@ -9705,6 +9845,80 @@
                   <pic:spPr>
                     <a:xfrm>
                       <a:off x="0" y="0"/>
+                      <a:ext cx="4406928" cy="3456000"/>
+                    </a:xfrm>
+                    <a:prstGeom prst="rect">
+                      <a:avLst/>
+                    </a:prstGeom>
+                  </pic:spPr>
+                </pic:pic>
+              </a:graphicData>
+            </a:graphic>
+          </wp:inline>
+        </w:drawing>
+      </w:r>
+    </w:p>
+    <w:p>
+      <w:pPr>
+        <w:jc w:val="both"/>
+        <w:rPr>
+          <w:rFonts w:ascii="Daytona" w:hAnsi="Daytona"/>
+        </w:rPr>
+      </w:pPr>
+    </w:p>
+    <w:p>
+      <w:pPr>
+        <w:jc w:val="both"/>
+        <w:rPr>
+          <w:rFonts w:ascii="Daytona" w:hAnsi="Daytona"/>
+          <w:lang w:val="pt-PT"/>
+        </w:rPr>
+      </w:pPr>
+      <w:r>
+        <w:rPr>
+          <w:rFonts w:ascii="Daytona" w:hAnsi="Daytona"/>
+          <w:lang w:val="pt-PT"/>
+        </w:rPr>
+        <w:t>DIAGRAMA E-R</w:t>
+      </w:r>
+    </w:p>
+    <w:p>
+      <w:pPr>
+        <w:jc w:val="both"/>
+        <w:rPr>
+          <w:rFonts w:ascii="Daytona" w:hAnsi="Daytona"/>
+          <w:lang w:val="pt-PT"/>
+        </w:rPr>
+      </w:pPr>
+      <w:r>
+        <w:rPr>
+          <w:rFonts w:ascii="Daytona" w:hAnsi="Daytona"/>
+          <w:noProof/>
+        </w:rPr>
+        <w:drawing>
+          <wp:inline distT="0" distB="0" distL="0" distR="0" wp14:anchorId="15862863" wp14:editId="692BC83E">
+            <wp:extent cx="5400040" cy="3248025"/>
+            <wp:effectExtent l="0" t="0" r="0" b="9525"/>
+            <wp:docPr id="67" name="Imagen 67"/>
+            <wp:cNvGraphicFramePr>
+              <a:graphicFrameLocks xmlns:a="http://schemas.openxmlformats.org/drawingml/2006/main" noChangeAspect="1"/>
+            </wp:cNvGraphicFramePr>
+            <a:graphic xmlns:a="http://schemas.openxmlformats.org/drawingml/2006/main">
+              <a:graphicData uri="http://schemas.openxmlformats.org/drawingml/2006/picture">
+                <pic:pic xmlns:pic="http://schemas.openxmlformats.org/drawingml/2006/picture">
+                  <pic:nvPicPr>
+                    <pic:cNvPr id="1" name=""/>
+                    <pic:cNvPicPr/>
+                  </pic:nvPicPr>
+                  <pic:blipFill>
+                    <a:blip r:embed="rId55"/>
+                    <a:stretch>
+                      <a:fillRect/>
+                    </a:stretch>
+                  </pic:blipFill>
+                  <pic:spPr>
+                    <a:xfrm>
+                      <a:off x="0" y="0"/>
                       <a:ext cx="5400040" cy="3248025"/>
                     </a:xfrm>
                     <a:prstGeom prst="rect">
@@ -9727,111 +9941,85 @@
     </w:p>
     <w:p>
       <w:pPr>
-        <w:ind w:left="0"/>
-        <w:mirrorIndents/>
-        <w:rPr>
-          <w:rFonts w:ascii="Daytona" w:hAnsi="Daytona"/>
+        <w:jc w:val="both"/>
+        <w:rPr>
+          <w:rFonts w:ascii="Daytona" w:hAnsi="Daytona"/>
+          <w:lang w:val="pt-PT"/>
+        </w:rPr>
+      </w:pPr>
+      <w:r>
+        <w:rPr>
+          <w:rFonts w:ascii="Daytona" w:hAnsi="Daytona"/>
+          <w:lang w:val="pt-PT"/>
+        </w:rPr>
+        <w:t>DIAGRAMA E-R (a mano)</w:t>
+      </w:r>
+    </w:p>
+    <w:p>
+      <w:pPr>
+        <w:jc w:val="both"/>
+        <w:rPr>
+          <w:rFonts w:ascii="Daytona" w:hAnsi="Daytona"/>
+          <w:lang w:val="pt-PT"/>
+        </w:rPr>
+      </w:pPr>
+    </w:p>
+    <w:p>
+      <w:pPr>
+        <w:jc w:val="both"/>
+        <w:rPr>
+          <w:rFonts w:ascii="Daytona" w:hAnsi="Daytona"/>
+          <w:lang w:val="pt-PT"/>
+        </w:rPr>
+      </w:pPr>
+    </w:p>
+    <w:p>
+      <w:pPr>
+        <w:jc w:val="both"/>
+        <w:rPr>
+          <w:rFonts w:ascii="Daytona" w:hAnsi="Daytona"/>
+          <w:lang w:val="pt-PT"/>
+        </w:rPr>
+      </w:pPr>
+    </w:p>
+    <w:p>
+      <w:pPr>
+        <w:jc w:val="both"/>
+        <w:rPr>
+          <w:rFonts w:ascii="Daytona" w:hAnsi="Daytona"/>
+        </w:rPr>
+      </w:pPr>
+      <w:r>
+        <w:rPr>
+          <w:rFonts w:ascii="Daytona" w:hAnsi="Daytona"/>
+        </w:rPr>
+        <w:lastRenderedPageBreak/>
+        <w:t>Con todo, esto la parte de Base de Datos está concluida. Vamos con...</w:t>
+      </w:r>
+    </w:p>
+    <w:p>
+      <w:pPr>
+        <w:jc w:val="both"/>
+        <w:rPr>
+          <w:rFonts w:ascii="Daytona" w:hAnsi="Daytona"/>
+          <w:b/>
+          <w:bCs/>
           <w:u w:val="single"/>
-          <w:lang w:val="pt-PT"/>
-        </w:rPr>
-      </w:pPr>
-      <w:r>
-        <w:rPr>
-          <w:rFonts w:ascii="Daytona" w:hAnsi="Daytona"/>
+        </w:rPr>
+      </w:pPr>
+      <w:r>
+        <w:rPr>
+          <w:rFonts w:ascii="Daytona" w:hAnsi="Daytona"/>
+          <w:b/>
+          <w:bCs/>
           <w:u w:val="single"/>
-          <w:lang w:val="pt-PT"/>
-        </w:rPr>
-        <w:t>DIAGRAMA E-R (a mano)</w:t>
-      </w:r>
-    </w:p>
-    <w:p>
-      <w:pPr>
-        <w:ind w:left="0"/>
-        <w:mirrorIndents/>
-        <w:rPr>
-          <w:rFonts w:ascii="Daytona" w:hAnsi="Daytona"/>
-          <w:u w:val="single"/>
-          <w:lang w:val="pt-PT"/>
-        </w:rPr>
-      </w:pPr>
-    </w:p>
-    <w:p>
-      <w:pPr>
-        <w:ind w:left="0"/>
-        <w:mirrorIndents/>
-        <w:rPr>
-          <w:rFonts w:ascii="Daytona" w:hAnsi="Daytona"/>
-          <w:u w:val="single"/>
-          <w:lang w:val="pt-PT"/>
-        </w:rPr>
-      </w:pPr>
-    </w:p>
-    <w:p>
-      <w:pPr>
-        <w:ind w:left="0"/>
-        <w:mirrorIndents/>
-        <w:rPr>
-          <w:rFonts w:ascii="Daytona" w:hAnsi="Daytona"/>
-          <w:u w:val="single"/>
-          <w:lang w:val="pt-PT"/>
-        </w:rPr>
-      </w:pPr>
-    </w:p>
-    <w:p>
-      <w:pPr>
-        <w:ind w:left="0"/>
-        <w:mirrorIndents/>
-        <w:rPr>
-          <w:rFonts w:ascii="Daytona" w:hAnsi="Daytona"/>
-        </w:rPr>
-      </w:pPr>
-      <w:r>
-        <w:rPr>
-          <w:rFonts w:ascii="Daytona" w:hAnsi="Daytona"/>
-        </w:rPr>
-        <w:lastRenderedPageBreak/>
-        <w:t>Co</w:t>
-      </w:r>
-      <w:r>
-        <w:rPr>
-          <w:rFonts w:ascii="Daytona" w:hAnsi="Daytona"/>
-        </w:rPr>
-        <w:t>n</w:t>
-      </w:r>
-      <w:r>
-        <w:rPr>
-          <w:rFonts w:ascii="Daytona" w:hAnsi="Daytona"/>
-        </w:rPr>
-        <w:t xml:space="preserve"> todo, esto la pa</w:t>
-      </w:r>
-      <w:r>
-        <w:rPr>
-          <w:rFonts w:ascii="Daytona" w:hAnsi="Daytona"/>
-        </w:rPr>
-        <w:t>rte de Base de Datos está concluida. Vamos con...</w:t>
-      </w:r>
-    </w:p>
-    <w:p>
-      <w:pPr>
-        <w:ind w:left="0"/>
-        <w:mirrorIndents/>
-        <w:rPr>
-          <w:rFonts w:ascii="Daytona" w:hAnsi="Daytona"/>
-          <w:u w:val="single"/>
-        </w:rPr>
-      </w:pPr>
-      <w:r>
-        <w:rPr>
-          <w:rFonts w:ascii="Daytona" w:hAnsi="Daytona"/>
-          <w:u w:val="single"/>
         </w:rPr>
         <w:t>PROGRAMACIÓN</w:t>
       </w:r>
     </w:p>
     <w:p>
       <w:pPr>
-        <w:ind w:left="0"/>
-        <w:mirrorIndents/>
+        <w:jc w:val="both"/>
         <w:rPr>
           <w:rFonts w:ascii="Daytona" w:hAnsi="Daytona"/>
         </w:rPr>
@@ -9842,17 +10030,380 @@
         </w:rPr>
         <w:t xml:space="preserve">Para esta parte, </w:t>
       </w:r>
-    </w:p>
-    <w:p>
-      <w:pPr>
-        <w:mirrorIndents/>
+      <w:r>
+        <w:rPr>
+          <w:rFonts w:ascii="Daytona" w:hAnsi="Daytona"/>
+        </w:rPr>
+        <w:t xml:space="preserve">he decidió usar el IDE de Eclipse que es el más útil para mí. Las clases nos vienen dadas, así que eso facilita el trabajo. No hemos visto </w:t>
+      </w:r>
+      <w:proofErr w:type="spellStart"/>
+      <w:r>
+        <w:rPr>
+          <w:rFonts w:ascii="Daytona" w:hAnsi="Daytona"/>
+        </w:rPr>
+        <w:t>HashMaps</w:t>
+      </w:r>
+      <w:proofErr w:type="spellEnd"/>
+      <w:r>
+        <w:rPr>
+          <w:rFonts w:ascii="Daytona" w:hAnsi="Daytona"/>
+        </w:rPr>
+        <w:t xml:space="preserve"> ni </w:t>
+      </w:r>
+      <w:proofErr w:type="spellStart"/>
+      <w:r>
+        <w:rPr>
+          <w:rFonts w:ascii="Daytona" w:hAnsi="Daytona"/>
+        </w:rPr>
+        <w:t>ArrayList</w:t>
+      </w:r>
+      <w:proofErr w:type="spellEnd"/>
+      <w:r>
+        <w:rPr>
+          <w:rFonts w:ascii="Daytona" w:hAnsi="Daytona"/>
+        </w:rPr>
+        <w:t xml:space="preserve">, esta parte será un poco más compleja. La idea es crear las clases y desde el </w:t>
+      </w:r>
+      <w:proofErr w:type="spellStart"/>
+      <w:r>
+        <w:rPr>
+          <w:rFonts w:ascii="Daytona" w:hAnsi="Daytona"/>
+        </w:rPr>
+        <w:t>main</w:t>
+      </w:r>
+      <w:proofErr w:type="spellEnd"/>
+      <w:r>
+        <w:rPr>
+          <w:rFonts w:ascii="Daytona" w:hAnsi="Daytona"/>
+        </w:rPr>
+        <w:t xml:space="preserve">, llamarlas a través de un menú de opciones. </w:t>
+      </w:r>
+    </w:p>
+    <w:p>
+      <w:pPr>
+        <w:jc w:val="both"/>
+        <w:rPr>
+          <w:rFonts w:ascii="Daytona" w:hAnsi="Daytona"/>
+        </w:rPr>
+      </w:pPr>
+      <w:r>
+        <w:rPr>
+          <w:rFonts w:ascii="Daytona" w:hAnsi="Daytona"/>
+        </w:rPr>
+        <w:t>Primero definamos la estructura de carpetas dentro de Java</w:t>
+      </w:r>
+      <w:r>
+        <w:rPr>
+          <w:rFonts w:ascii="Daytona" w:hAnsi="Daytona"/>
+          <w:noProof/>
+        </w:rPr>
+        <w:drawing>
+          <wp:inline distT="0" distB="0" distL="0" distR="0" wp14:anchorId="45403EBE" wp14:editId="40CCEEB3">
+            <wp:extent cx="3148595" cy="1692000"/>
+            <wp:effectExtent l="0" t="0" r="0" b="3810"/>
+            <wp:docPr id="8" name="Imagen 8" descr="Interfaz de usuario gráfica, Texto, Aplicación&#10;&#10;El contenido generado por IA puede ser incorrecto."/>
+            <wp:cNvGraphicFramePr>
+              <a:graphicFrameLocks xmlns:a="http://schemas.openxmlformats.org/drawingml/2006/main" noChangeAspect="1"/>
+            </wp:cNvGraphicFramePr>
+            <a:graphic xmlns:a="http://schemas.openxmlformats.org/drawingml/2006/main">
+              <a:graphicData uri="http://schemas.openxmlformats.org/drawingml/2006/picture">
+                <pic:pic xmlns:pic="http://schemas.openxmlformats.org/drawingml/2006/picture">
+                  <pic:nvPicPr>
+                    <pic:cNvPr id="8" name="Imagen 8" descr="Interfaz de usuario gráfica, Texto, Aplicación&#10;&#10;El contenido generado por IA puede ser incorrecto."/>
+                    <pic:cNvPicPr/>
+                  </pic:nvPicPr>
+                  <pic:blipFill>
+                    <a:blip r:embed="rId56">
+                      <a:extLst>
+                        <a:ext uri="{28A0092B-C50C-407E-A947-70E740481C1C}">
+                          <a14:useLocalDpi xmlns:a14="http://schemas.microsoft.com/office/drawing/2010/main" val="0"/>
+                        </a:ext>
+                      </a:extLst>
+                    </a:blip>
+                    <a:stretch>
+                      <a:fillRect/>
+                    </a:stretch>
+                  </pic:blipFill>
+                  <pic:spPr>
+                    <a:xfrm>
+                      <a:off x="0" y="0"/>
+                      <a:ext cx="3148595" cy="1692000"/>
+                    </a:xfrm>
+                    <a:prstGeom prst="rect">
+                      <a:avLst/>
+                    </a:prstGeom>
+                  </pic:spPr>
+                </pic:pic>
+              </a:graphicData>
+            </a:graphic>
+          </wp:inline>
+        </w:drawing>
+      </w:r>
+    </w:p>
+    <w:p>
+      <w:pPr>
+        <w:jc w:val="both"/>
+        <w:rPr>
+          <w:rFonts w:ascii="Daytona" w:hAnsi="Daytona"/>
+        </w:rPr>
+      </w:pPr>
+      <w:r>
+        <w:rPr>
+          <w:rFonts w:ascii="Daytona" w:hAnsi="Daytona"/>
+        </w:rPr>
+        <w:t>Una vez establecido esto, con los archivos vacíos, primero haré las clases que corresponden con las tablas de la base de datos y por último la clase principal (</w:t>
+      </w:r>
+      <w:proofErr w:type="spellStart"/>
+      <w:r>
+        <w:rPr>
+          <w:rFonts w:ascii="Daytona" w:hAnsi="Daytona"/>
+        </w:rPr>
+        <w:t>main</w:t>
+      </w:r>
+      <w:proofErr w:type="spellEnd"/>
+      <w:r>
+        <w:rPr>
+          <w:rFonts w:ascii="Daytona" w:hAnsi="Daytona"/>
+        </w:rPr>
+        <w:t>).</w:t>
+      </w:r>
+    </w:p>
+    <w:p>
+      <w:pPr>
+        <w:jc w:val="both"/>
+        <w:rPr>
+          <w:rFonts w:ascii="Daytona" w:hAnsi="Daytona"/>
+        </w:rPr>
+      </w:pPr>
+      <w:r>
+        <w:rPr>
+          <w:rFonts w:ascii="Daytona" w:hAnsi="Daytona"/>
+        </w:rPr>
+        <w:t xml:space="preserve">Cada clase requiere de </w:t>
+      </w:r>
+      <w:r>
+        <w:rPr>
+          <w:rFonts w:ascii="Daytona" w:hAnsi="Daytona"/>
+          <w:b/>
+          <w:bCs/>
+        </w:rPr>
+        <w:t>método constructor</w:t>
+      </w:r>
+      <w:r>
+        <w:rPr>
+          <w:rFonts w:ascii="Daytona" w:hAnsi="Daytona"/>
+        </w:rPr>
+        <w:t xml:space="preserve">, </w:t>
+      </w:r>
+      <w:proofErr w:type="spellStart"/>
+      <w:r>
+        <w:rPr>
+          <w:rFonts w:ascii="Daytona" w:hAnsi="Daytona"/>
+          <w:b/>
+          <w:bCs/>
+        </w:rPr>
+        <w:t>getters</w:t>
+      </w:r>
+      <w:proofErr w:type="spellEnd"/>
+      <w:r>
+        <w:rPr>
+          <w:rFonts w:ascii="Daytona" w:hAnsi="Daytona"/>
+          <w:b/>
+          <w:bCs/>
+        </w:rPr>
+        <w:t xml:space="preserve"> </w:t>
+      </w:r>
+      <w:r>
+        <w:rPr>
+          <w:rFonts w:ascii="Daytona" w:hAnsi="Daytona"/>
+        </w:rPr>
+        <w:t xml:space="preserve">y </w:t>
+      </w:r>
+      <w:proofErr w:type="spellStart"/>
+      <w:r>
+        <w:rPr>
+          <w:rFonts w:ascii="Daytona" w:hAnsi="Daytona"/>
+          <w:b/>
+          <w:bCs/>
+        </w:rPr>
+        <w:t>setters</w:t>
+      </w:r>
+      <w:proofErr w:type="spellEnd"/>
+      <w:r>
+        <w:rPr>
+          <w:rFonts w:ascii="Daytona" w:hAnsi="Daytona"/>
+        </w:rPr>
+        <w:t xml:space="preserve"> y un </w:t>
+      </w:r>
+      <w:r>
+        <w:rPr>
+          <w:rFonts w:ascii="Daytona" w:hAnsi="Daytona"/>
+          <w:b/>
+          <w:bCs/>
+        </w:rPr>
+        <w:t xml:space="preserve">método </w:t>
+      </w:r>
+      <w:proofErr w:type="spellStart"/>
+      <w:r>
+        <w:rPr>
+          <w:rFonts w:ascii="Daytona" w:hAnsi="Daytona"/>
+          <w:b/>
+          <w:bCs/>
+        </w:rPr>
+        <w:t>toString</w:t>
+      </w:r>
+      <w:proofErr w:type="spellEnd"/>
+      <w:r>
+        <w:rPr>
+          <w:rFonts w:ascii="Daytona" w:hAnsi="Daytona"/>
+        </w:rPr>
+        <w:t xml:space="preserve"> de los atributos. Este último método es nuevo también para mí. La idea es que </w:t>
+      </w:r>
+      <w:r>
+        <w:rPr>
+          <w:rFonts w:ascii="Daytona" w:hAnsi="Daytona"/>
+        </w:rPr>
+        <w:t xml:space="preserve">convierte un objeto en texto. En Java todos los objetos heredan un </w:t>
+      </w:r>
+      <w:proofErr w:type="spellStart"/>
+      <w:r>
+        <w:rPr>
+          <w:rFonts w:ascii="Daytona" w:hAnsi="Daytona"/>
+        </w:rPr>
+        <w:t>toString</w:t>
+      </w:r>
+      <w:proofErr w:type="spellEnd"/>
+      <w:r>
+        <w:rPr>
+          <w:rFonts w:ascii="Daytona" w:hAnsi="Daytona"/>
+        </w:rPr>
+        <w:t xml:space="preserve"> por defecto de la clase </w:t>
+      </w:r>
+      <w:proofErr w:type="spellStart"/>
+      <w:r>
+        <w:rPr>
+          <w:rFonts w:ascii="Daytona" w:hAnsi="Daytona"/>
+        </w:rPr>
+        <w:t>Object</w:t>
+      </w:r>
+      <w:proofErr w:type="spellEnd"/>
+      <w:r>
+        <w:rPr>
+          <w:rFonts w:ascii="Daytona" w:hAnsi="Daytona"/>
+        </w:rPr>
+        <w:t>, pero ese por defecto devuelve algo inútil</w:t>
+      </w:r>
+      <w:r>
+        <w:rPr>
+          <w:rFonts w:ascii="Daytona" w:hAnsi="Daytona"/>
+        </w:rPr>
+        <w:t xml:space="preserve">, </w:t>
+      </w:r>
+      <w:r>
+        <w:rPr>
+          <w:rFonts w:ascii="Daytona" w:hAnsi="Daytona"/>
+        </w:rPr>
+        <w:t>el nombre de la clase más la dirección de memoria.</w:t>
+      </w:r>
+      <w:r>
+        <w:rPr>
+          <w:rFonts w:ascii="Daytona" w:hAnsi="Daytona"/>
+        </w:rPr>
+        <w:t xml:space="preserve"> </w:t>
+      </w:r>
+      <w:r>
+        <w:rPr>
+          <w:rFonts w:ascii="Daytona" w:hAnsi="Daytona"/>
+        </w:rPr>
+        <w:t xml:space="preserve">Al </w:t>
+      </w:r>
+      <w:proofErr w:type="spellStart"/>
+      <w:r>
+        <w:rPr>
+          <w:rFonts w:ascii="Daytona" w:hAnsi="Daytona"/>
+        </w:rPr>
+        <w:t>sobreescribirlo</w:t>
+      </w:r>
+      <w:proofErr w:type="spellEnd"/>
+      <w:r>
+        <w:rPr>
+          <w:rFonts w:ascii="Daytona" w:hAnsi="Daytona"/>
+        </w:rPr>
+        <w:t xml:space="preserve"> en </w:t>
+      </w:r>
+      <w:r>
+        <w:rPr>
+          <w:rFonts w:ascii="Daytona" w:hAnsi="Daytona"/>
+        </w:rPr>
+        <w:t xml:space="preserve">mi </w:t>
+      </w:r>
+      <w:r>
+        <w:rPr>
+          <w:rFonts w:ascii="Daytona" w:hAnsi="Daytona"/>
+        </w:rPr>
+        <w:t>clase defin</w:t>
+      </w:r>
+      <w:r>
+        <w:rPr>
+          <w:rFonts w:ascii="Daytona" w:hAnsi="Daytona"/>
+        </w:rPr>
+        <w:t>o yo</w:t>
+      </w:r>
+      <w:r>
+        <w:rPr>
+          <w:rFonts w:ascii="Daytona" w:hAnsi="Daytona"/>
+        </w:rPr>
+        <w:t xml:space="preserve"> mism</w:t>
+      </w:r>
+      <w:r>
+        <w:rPr>
+          <w:rFonts w:ascii="Daytona" w:hAnsi="Daytona"/>
+        </w:rPr>
+        <w:t xml:space="preserve">a </w:t>
+      </w:r>
+      <w:r>
+        <w:rPr>
+          <w:rFonts w:ascii="Daytona" w:hAnsi="Daytona"/>
+        </w:rPr>
+        <w:t>cómo se representa ese objeto como texto.</w:t>
+      </w:r>
+      <w:r>
+        <w:rPr>
+          <w:rFonts w:ascii="Daytona" w:hAnsi="Daytona"/>
+        </w:rPr>
+        <w:t xml:space="preserve"> Esto permite entre otras cosas mostrar objetos por pantalla</w:t>
+      </w:r>
+      <w:r>
+        <w:rPr>
+          <w:rFonts w:ascii="Daytona" w:hAnsi="Daytona"/>
+        </w:rPr>
+        <w:t xml:space="preserve"> a través de </w:t>
+      </w:r>
+      <w:proofErr w:type="spellStart"/>
+      <w:r>
+        <w:rPr>
+          <w:rFonts w:ascii="Daytona" w:hAnsi="Daytona"/>
+        </w:rPr>
+        <w:t>System.out.println</w:t>
+      </w:r>
+      <w:proofErr w:type="spellEnd"/>
+      <w:r>
+        <w:rPr>
+          <w:rFonts w:ascii="Daytona" w:hAnsi="Daytona"/>
+        </w:rPr>
+        <w:t>().</w:t>
+      </w:r>
+    </w:p>
+    <w:p>
+      <w:pPr>
+        <w:jc w:val="both"/>
         <w:rPr>
           <w:rFonts w:ascii="Daytona" w:hAnsi="Daytona"/>
         </w:rPr>
       </w:pPr>
     </w:p>
     <w:sectPr>
-      <w:footerReference w:type="default" r:id="rId55"/>
+      <w:footerReference w:type="default" r:id="rId57"/>
       <w:pgSz w:w="11906" w:h="16838"/>
       <w:pgMar w:top="1417" w:right="1701" w:bottom="1417" w:left="1701" w:header="737" w:footer="170" w:gutter="0"/>
       <w:cols w:space="708"/>
@@ -9897,6 +10448,7 @@
         <w:docPartUnique/>
       </w:docPartObj>
     </w:sdtPr>
+    <w:sdtEndPr/>
     <w:sdtContent>
       <w:p>
         <w:pPr>
@@ -10710,6 +11262,7 @@
   <w:style w:type="character" w:default="1" w:styleId="Fuentedeprrafopredeter">
     <w:name w:val="Default Paragraph Font"/>
     <w:uiPriority w:val="1"/>
+    <w:semiHidden/>
     <w:unhideWhenUsed/>
   </w:style>
   <w:style w:type="table" w:default="1" w:styleId="Tablanormal">

</xml_diff>